<commit_message>
Add all screenshots to technical report appendix
</commit_message>
<xml_diff>
--- a/HospitalGUI_Technical_Report.docx
+++ b/HospitalGUI_Technical_Report.docx
@@ -242,7 +242,7 @@
       <w:r>
         <w:fldChar w:fldCharType="separate"/>
       </w:r>
-      <w:hyperlink w:anchor="_Toc234309225" w:history="1">
+      <w:hyperlink w:anchor="_Toc234320805" w:history="1">
         <w:r>
           <w:rPr>
             <w:rStyle w:val="Hyperlink"/>
@@ -266,7 +266,7 @@
           <w:rPr>
             <w:noProof/>
           </w:rPr>
-          <w:instrText xml:space="preserve"> PAGEREF _Toc234309225 \h </w:instrText>
+          <w:instrText xml:space="preserve"> PAGEREF _Toc234320805 \h </w:instrText>
         </w:r>
         <w:r>
           <w:rPr>
@@ -305,7 +305,7 @@
           <w:sz w:val="24"/>
         </w:rPr>
       </w:pPr>
-      <w:hyperlink w:anchor="_Toc234309226" w:history="1">
+      <w:hyperlink w:anchor="_Toc234320806" w:history="1">
         <w:r>
           <w:rPr>
             <w:rStyle w:val="Hyperlink"/>
@@ -329,7 +329,7 @@
           <w:rPr>
             <w:noProof/>
           </w:rPr>
-          <w:instrText xml:space="preserve"> PAGEREF _Toc234309226 \h </w:instrText>
+          <w:instrText xml:space="preserve"> PAGEREF _Toc234320806 \h </w:instrText>
         </w:r>
         <w:r>
           <w:rPr>
@@ -368,7 +368,7 @@
           <w:sz w:val="24"/>
         </w:rPr>
       </w:pPr>
-      <w:hyperlink w:anchor="_Toc234309227" w:history="1">
+      <w:hyperlink w:anchor="_Toc234320807" w:history="1">
         <w:r>
           <w:rPr>
             <w:rStyle w:val="Hyperlink"/>
@@ -392,7 +392,7 @@
           <w:rPr>
             <w:noProof/>
           </w:rPr>
-          <w:instrText xml:space="preserve"> PAGEREF _Toc234309227 \h </w:instrText>
+          <w:instrText xml:space="preserve"> PAGEREF _Toc234320807 \h </w:instrText>
         </w:r>
         <w:r>
           <w:rPr>
@@ -431,7 +431,7 @@
           <w:sz w:val="24"/>
         </w:rPr>
       </w:pPr>
-      <w:hyperlink w:anchor="_Toc234309228" w:history="1">
+      <w:hyperlink w:anchor="_Toc234320808" w:history="1">
         <w:r>
           <w:rPr>
             <w:rStyle w:val="Hyperlink"/>
@@ -455,7 +455,7 @@
           <w:rPr>
             <w:noProof/>
           </w:rPr>
-          <w:instrText xml:space="preserve"> PAGEREF _Toc234309228 \h </w:instrText>
+          <w:instrText xml:space="preserve"> PAGEREF _Toc234320808 \h </w:instrText>
         </w:r>
         <w:r>
           <w:rPr>
@@ -494,7 +494,7 @@
           <w:sz w:val="24"/>
         </w:rPr>
       </w:pPr>
-      <w:hyperlink w:anchor="_Toc234309229" w:history="1">
+      <w:hyperlink w:anchor="_Toc234320809" w:history="1">
         <w:r>
           <w:rPr>
             <w:rStyle w:val="Hyperlink"/>
@@ -518,7 +518,7 @@
           <w:rPr>
             <w:noProof/>
           </w:rPr>
-          <w:instrText xml:space="preserve"> PAGEREF _Toc234309229 \h </w:instrText>
+          <w:instrText xml:space="preserve"> PAGEREF _Toc234320809 \h </w:instrText>
         </w:r>
         <w:r>
           <w:rPr>
@@ -557,7 +557,7 @@
           <w:sz w:val="24"/>
         </w:rPr>
       </w:pPr>
-      <w:hyperlink w:anchor="_Toc234309230" w:history="1">
+      <w:hyperlink w:anchor="_Toc234320810" w:history="1">
         <w:r>
           <w:rPr>
             <w:rStyle w:val="Hyperlink"/>
@@ -581,7 +581,7 @@
           <w:rPr>
             <w:noProof/>
           </w:rPr>
-          <w:instrText xml:space="preserve"> PAGEREF _Toc234309230 \h </w:instrText>
+          <w:instrText xml:space="preserve"> PAGEREF _Toc234320810 \h </w:instrText>
         </w:r>
         <w:r>
           <w:rPr>
@@ -620,7 +620,7 @@
           <w:sz w:val="24"/>
         </w:rPr>
       </w:pPr>
-      <w:hyperlink w:anchor="_Toc234309231" w:history="1">
+      <w:hyperlink w:anchor="_Toc234320811" w:history="1">
         <w:r>
           <w:rPr>
             <w:rStyle w:val="Hyperlink"/>
@@ -644,7 +644,7 @@
           <w:rPr>
             <w:noProof/>
           </w:rPr>
-          <w:instrText xml:space="preserve"> PAGEREF _Toc234309231 \h </w:instrText>
+          <w:instrText xml:space="preserve"> PAGEREF _Toc234320811 \h </w:instrText>
         </w:r>
         <w:r>
           <w:rPr>
@@ -683,7 +683,7 @@
           <w:sz w:val="24"/>
         </w:rPr>
       </w:pPr>
-      <w:hyperlink w:anchor="_Toc234309232" w:history="1">
+      <w:hyperlink w:anchor="_Toc234320812" w:history="1">
         <w:r>
           <w:rPr>
             <w:rStyle w:val="Hyperlink"/>
@@ -707,7 +707,7 @@
           <w:rPr>
             <w:noProof/>
           </w:rPr>
-          <w:instrText xml:space="preserve"> PAGEREF _Toc234309232 \h </w:instrText>
+          <w:instrText xml:space="preserve"> PAGEREF _Toc234320812 \h </w:instrText>
         </w:r>
         <w:r>
           <w:rPr>
@@ -746,7 +746,7 @@
           <w:sz w:val="24"/>
         </w:rPr>
       </w:pPr>
-      <w:hyperlink w:anchor="_Toc234309233" w:history="1">
+      <w:hyperlink w:anchor="_Toc234320813" w:history="1">
         <w:r>
           <w:rPr>
             <w:rStyle w:val="Hyperlink"/>
@@ -770,7 +770,7 @@
           <w:rPr>
             <w:noProof/>
           </w:rPr>
-          <w:instrText xml:space="preserve"> PAGEREF _Toc234309233 \h </w:instrText>
+          <w:instrText xml:space="preserve"> PAGEREF _Toc234320813 \h </w:instrText>
         </w:r>
         <w:r>
           <w:rPr>
@@ -809,7 +809,7 @@
           <w:sz w:val="24"/>
         </w:rPr>
       </w:pPr>
-      <w:hyperlink w:anchor="_Toc234309234" w:history="1">
+      <w:hyperlink w:anchor="_Toc234320814" w:history="1">
         <w:r>
           <w:rPr>
             <w:rStyle w:val="Hyperlink"/>
@@ -833,7 +833,7 @@
           <w:rPr>
             <w:noProof/>
           </w:rPr>
-          <w:instrText xml:space="preserve"> PAGEREF _Toc234309234 \h </w:instrText>
+          <w:instrText xml:space="preserve"> PAGEREF _Toc234320814 \h </w:instrText>
         </w:r>
         <w:r>
           <w:rPr>
@@ -872,7 +872,7 @@
           <w:sz w:val="24"/>
         </w:rPr>
       </w:pPr>
-      <w:hyperlink w:anchor="_Toc234309235" w:history="1">
+      <w:hyperlink w:anchor="_Toc234320815" w:history="1">
         <w:r>
           <w:rPr>
             <w:rStyle w:val="Hyperlink"/>
@@ -896,7 +896,7 @@
           <w:rPr>
             <w:noProof/>
           </w:rPr>
-          <w:instrText xml:space="preserve"> PAGEREF _Toc234309235 \h </w:instrText>
+          <w:instrText xml:space="preserve"> PAGEREF _Toc234320815 \h </w:instrText>
         </w:r>
         <w:r>
           <w:rPr>
@@ -935,7 +935,7 @@
           <w:sz w:val="24"/>
         </w:rPr>
       </w:pPr>
-      <w:hyperlink w:anchor="_Toc234309236" w:history="1">
+      <w:hyperlink w:anchor="_Toc234320816" w:history="1">
         <w:r>
           <w:rPr>
             <w:rStyle w:val="Hyperlink"/>
@@ -959,7 +959,7 @@
           <w:rPr>
             <w:noProof/>
           </w:rPr>
-          <w:instrText xml:space="preserve"> PAGEREF _Toc234309236 \h </w:instrText>
+          <w:instrText xml:space="preserve"> PAGEREF _Toc234320816 \h </w:instrText>
         </w:r>
         <w:r>
           <w:rPr>
@@ -998,7 +998,7 @@
           <w:sz w:val="24"/>
         </w:rPr>
       </w:pPr>
-      <w:hyperlink w:anchor="_Toc234309237" w:history="1">
+      <w:hyperlink w:anchor="_Toc234320817" w:history="1">
         <w:r>
           <w:rPr>
             <w:rStyle w:val="Hyperlink"/>
@@ -1022,7 +1022,7 @@
           <w:rPr>
             <w:noProof/>
           </w:rPr>
-          <w:instrText xml:space="preserve"> PAGEREF _Toc234309237 \h </w:instrText>
+          <w:instrText xml:space="preserve"> PAGEREF _Toc234320817 \h </w:instrText>
         </w:r>
         <w:r>
           <w:rPr>
@@ -1061,7 +1061,7 @@
           <w:sz w:val="24"/>
         </w:rPr>
       </w:pPr>
-      <w:hyperlink w:anchor="_Toc234309238" w:history="1">
+      <w:hyperlink w:anchor="_Toc234320818" w:history="1">
         <w:r>
           <w:rPr>
             <w:rStyle w:val="Hyperlink"/>
@@ -1085,7 +1085,7 @@
           <w:rPr>
             <w:noProof/>
           </w:rPr>
-          <w:instrText xml:space="preserve"> PAGEREF _Toc234309238 \h </w:instrText>
+          <w:instrText xml:space="preserve"> PAGEREF _Toc234320818 \h </w:instrText>
         </w:r>
         <w:r>
           <w:rPr>
@@ -1124,7 +1124,7 @@
           <w:sz w:val="24"/>
         </w:rPr>
       </w:pPr>
-      <w:hyperlink w:anchor="_Toc234309239" w:history="1">
+      <w:hyperlink w:anchor="_Toc234320819" w:history="1">
         <w:r>
           <w:rPr>
             <w:rStyle w:val="Hyperlink"/>
@@ -1148,7 +1148,7 @@
           <w:rPr>
             <w:noProof/>
           </w:rPr>
-          <w:instrText xml:space="preserve"> PAGEREF _Toc234309239 \h </w:instrText>
+          <w:instrText xml:space="preserve"> PAGEREF _Toc234320819 \h </w:instrText>
         </w:r>
         <w:r>
           <w:rPr>
@@ -1187,7 +1187,7 @@
           <w:sz w:val="24"/>
         </w:rPr>
       </w:pPr>
-      <w:hyperlink w:anchor="_Toc234309240" w:history="1">
+      <w:hyperlink w:anchor="_Toc234320820" w:history="1">
         <w:r>
           <w:rPr>
             <w:rStyle w:val="Hyperlink"/>
@@ -1211,7 +1211,7 @@
           <w:rPr>
             <w:noProof/>
           </w:rPr>
-          <w:instrText xml:space="preserve"> PAGEREF _Toc234309240 \h </w:instrText>
+          <w:instrText xml:space="preserve"> PAGEREF _Toc234320820 \h </w:instrText>
         </w:r>
         <w:r>
           <w:rPr>
@@ -1250,7 +1250,7 @@
           <w:sz w:val="24"/>
         </w:rPr>
       </w:pPr>
-      <w:hyperlink w:anchor="_Toc234309241" w:history="1">
+      <w:hyperlink w:anchor="_Toc234320821" w:history="1">
         <w:r>
           <w:rPr>
             <w:rStyle w:val="Hyperlink"/>
@@ -1274,7 +1274,7 @@
           <w:rPr>
             <w:noProof/>
           </w:rPr>
-          <w:instrText xml:space="preserve"> PAGEREF _Toc234309241 \h </w:instrText>
+          <w:instrText xml:space="preserve"> PAGEREF _Toc234320821 \h </w:instrText>
         </w:r>
         <w:r>
           <w:rPr>
@@ -1313,7 +1313,7 @@
           <w:sz w:val="24"/>
         </w:rPr>
       </w:pPr>
-      <w:hyperlink w:anchor="_Toc234309242" w:history="1">
+      <w:hyperlink w:anchor="_Toc234320822" w:history="1">
         <w:r>
           <w:rPr>
             <w:rStyle w:val="Hyperlink"/>
@@ -1337,7 +1337,7 @@
           <w:rPr>
             <w:noProof/>
           </w:rPr>
-          <w:instrText xml:space="preserve"> PAGEREF _Toc234309242 \h </w:instrText>
+          <w:instrText xml:space="preserve"> PAGEREF _Toc234320822 \h </w:instrText>
         </w:r>
         <w:r>
           <w:rPr>
@@ -1376,7 +1376,7 @@
           <w:sz w:val="24"/>
         </w:rPr>
       </w:pPr>
-      <w:hyperlink w:anchor="_Toc234309243" w:history="1">
+      <w:hyperlink w:anchor="_Toc234320823" w:history="1">
         <w:r>
           <w:rPr>
             <w:rStyle w:val="Hyperlink"/>
@@ -1400,7 +1400,7 @@
           <w:rPr>
             <w:noProof/>
           </w:rPr>
-          <w:instrText xml:space="preserve"> PAGEREF _Toc234309243 \h </w:instrText>
+          <w:instrText xml:space="preserve"> PAGEREF _Toc234320823 \h </w:instrText>
         </w:r>
         <w:r>
           <w:rPr>
@@ -1439,7 +1439,7 @@
           <w:sz w:val="24"/>
         </w:rPr>
       </w:pPr>
-      <w:hyperlink w:anchor="_Toc234309244" w:history="1">
+      <w:hyperlink w:anchor="_Toc234320824" w:history="1">
         <w:r>
           <w:rPr>
             <w:rStyle w:val="Hyperlink"/>
@@ -1463,7 +1463,7 @@
           <w:rPr>
             <w:noProof/>
           </w:rPr>
-          <w:instrText xml:space="preserve"> PAGEREF _Toc234309244 \h </w:instrText>
+          <w:instrText xml:space="preserve"> PAGEREF _Toc234320824 \h </w:instrText>
         </w:r>
         <w:r>
           <w:rPr>
@@ -1502,7 +1502,7 @@
           <w:sz w:val="24"/>
         </w:rPr>
       </w:pPr>
-      <w:hyperlink w:anchor="_Toc234309245" w:history="1">
+      <w:hyperlink w:anchor="_Toc234320825" w:history="1">
         <w:r>
           <w:rPr>
             <w:rStyle w:val="Hyperlink"/>
@@ -1526,7 +1526,7 @@
           <w:rPr>
             <w:noProof/>
           </w:rPr>
-          <w:instrText xml:space="preserve"> PAGEREF _Toc234309245 \h </w:instrText>
+          <w:instrText xml:space="preserve"> PAGEREF _Toc234320825 \h </w:instrText>
         </w:r>
         <w:r>
           <w:rPr>
@@ -1565,7 +1565,7 @@
           <w:sz w:val="24"/>
         </w:rPr>
       </w:pPr>
-      <w:hyperlink w:anchor="_Toc234309246" w:history="1">
+      <w:hyperlink w:anchor="_Toc234320826" w:history="1">
         <w:r>
           <w:rPr>
             <w:rStyle w:val="Hyperlink"/>
@@ -1589,7 +1589,7 @@
           <w:rPr>
             <w:noProof/>
           </w:rPr>
-          <w:instrText xml:space="preserve"> PAGEREF _Toc234309246 \h </w:instrText>
+          <w:instrText xml:space="preserve"> PAGEREF _Toc234320826 \h </w:instrText>
         </w:r>
         <w:r>
           <w:rPr>
@@ -1628,7 +1628,7 @@
           <w:sz w:val="24"/>
         </w:rPr>
       </w:pPr>
-      <w:hyperlink w:anchor="_Toc234309247" w:history="1">
+      <w:hyperlink w:anchor="_Toc234320827" w:history="1">
         <w:r>
           <w:rPr>
             <w:rStyle w:val="Hyperlink"/>
@@ -1652,7 +1652,7 @@
           <w:rPr>
             <w:noProof/>
           </w:rPr>
-          <w:instrText xml:space="preserve"> PAGEREF _Toc234309247 \h </w:instrText>
+          <w:instrText xml:space="preserve"> PAGEREF _Toc234320827 \h </w:instrText>
         </w:r>
         <w:r>
           <w:rPr>
@@ -1691,7 +1691,7 @@
           <w:sz w:val="24"/>
         </w:rPr>
       </w:pPr>
-      <w:hyperlink w:anchor="_Toc234309248" w:history="1">
+      <w:hyperlink w:anchor="_Toc234320828" w:history="1">
         <w:r>
           <w:rPr>
             <w:rStyle w:val="Hyperlink"/>
@@ -1723,7 +1723,7 @@
           <w:rPr>
             <w:noProof/>
           </w:rPr>
-          <w:instrText xml:space="preserve"> PAGEREF _Toc234309248 \h </w:instrText>
+          <w:instrText xml:space="preserve"> PAGEREF _Toc234320828 \h </w:instrText>
         </w:r>
         <w:r>
           <w:rPr>
@@ -1762,7 +1762,7 @@
           <w:sz w:val="24"/>
         </w:rPr>
       </w:pPr>
-      <w:hyperlink w:anchor="_Toc234309249" w:history="1">
+      <w:hyperlink w:anchor="_Toc234320829" w:history="1">
         <w:r>
           <w:rPr>
             <w:rStyle w:val="Hyperlink"/>
@@ -1786,7 +1786,7 @@
           <w:rPr>
             <w:noProof/>
           </w:rPr>
-          <w:instrText xml:space="preserve"> PAGEREF _Toc234309249 \h </w:instrText>
+          <w:instrText xml:space="preserve"> PAGEREF _Toc234320829 \h </w:instrText>
         </w:r>
         <w:r>
           <w:rPr>
@@ -1825,7 +1825,7 @@
           <w:sz w:val="24"/>
         </w:rPr>
       </w:pPr>
-      <w:hyperlink w:anchor="_Toc234309250" w:history="1">
+      <w:hyperlink w:anchor="_Toc234320830" w:history="1">
         <w:r>
           <w:rPr>
             <w:rStyle w:val="Hyperlink"/>
@@ -1849,7 +1849,7 @@
           <w:rPr>
             <w:noProof/>
           </w:rPr>
-          <w:instrText xml:space="preserve"> PAGEREF _Toc234309250 \h </w:instrText>
+          <w:instrText xml:space="preserve"> PAGEREF _Toc234320830 \h </w:instrText>
         </w:r>
         <w:r>
           <w:rPr>
@@ -1888,7 +1888,7 @@
           <w:sz w:val="24"/>
         </w:rPr>
       </w:pPr>
-      <w:hyperlink w:anchor="_Toc234309251" w:history="1">
+      <w:hyperlink w:anchor="_Toc234320831" w:history="1">
         <w:r>
           <w:rPr>
             <w:rStyle w:val="Hyperlink"/>
@@ -1912,7 +1912,7 @@
           <w:rPr>
             <w:noProof/>
           </w:rPr>
-          <w:instrText xml:space="preserve"> PAGEREF _Toc234309251 \h </w:instrText>
+          <w:instrText xml:space="preserve"> PAGEREF _Toc234320831 \h </w:instrText>
         </w:r>
         <w:r>
           <w:rPr>
@@ -1951,7 +1951,7 @@
           <w:sz w:val="24"/>
         </w:rPr>
       </w:pPr>
-      <w:hyperlink w:anchor="_Toc234309252" w:history="1">
+      <w:hyperlink w:anchor="_Toc234320832" w:history="1">
         <w:r>
           <w:rPr>
             <w:rStyle w:val="Hyperlink"/>
@@ -1975,7 +1975,7 @@
           <w:rPr>
             <w:noProof/>
           </w:rPr>
-          <w:instrText xml:space="preserve"> PAGEREF _Toc234309252 \h </w:instrText>
+          <w:instrText xml:space="preserve"> PAGEREF _Toc234320832 \h </w:instrText>
         </w:r>
         <w:r>
           <w:rPr>
@@ -2014,7 +2014,7 @@
           <w:sz w:val="24"/>
         </w:rPr>
       </w:pPr>
-      <w:hyperlink w:anchor="_Toc234309253" w:history="1">
+      <w:hyperlink w:anchor="_Toc234320833" w:history="1">
         <w:r>
           <w:rPr>
             <w:rStyle w:val="Hyperlink"/>
@@ -2038,7 +2038,7 @@
           <w:rPr>
             <w:noProof/>
           </w:rPr>
-          <w:instrText xml:space="preserve"> PAGEREF _Toc234309253 \h </w:instrText>
+          <w:instrText xml:space="preserve"> PAGEREF _Toc234320833 \h </w:instrText>
         </w:r>
         <w:r>
           <w:rPr>
@@ -2077,7 +2077,7 @@
           <w:sz w:val="24"/>
         </w:rPr>
       </w:pPr>
-      <w:hyperlink w:anchor="_Toc234309254" w:history="1">
+      <w:hyperlink w:anchor="_Toc234320834" w:history="1">
         <w:r>
           <w:rPr>
             <w:rStyle w:val="Hyperlink"/>
@@ -2101,7 +2101,7 @@
           <w:rPr>
             <w:noProof/>
           </w:rPr>
-          <w:instrText xml:space="preserve"> PAGEREF _Toc234309254 \h </w:instrText>
+          <w:instrText xml:space="preserve"> PAGEREF _Toc234320834 \h </w:instrText>
         </w:r>
         <w:r>
           <w:rPr>
@@ -2140,7 +2140,7 @@
           <w:sz w:val="24"/>
         </w:rPr>
       </w:pPr>
-      <w:hyperlink w:anchor="_Toc234309255" w:history="1">
+      <w:hyperlink w:anchor="_Toc234320835" w:history="1">
         <w:r>
           <w:rPr>
             <w:rStyle w:val="Hyperlink"/>
@@ -2164,7 +2164,7 @@
           <w:rPr>
             <w:noProof/>
           </w:rPr>
-          <w:instrText xml:space="preserve"> PAGEREF _Toc234309255 \h </w:instrText>
+          <w:instrText xml:space="preserve"> PAGEREF _Toc234320835 \h </w:instrText>
         </w:r>
         <w:r>
           <w:rPr>
@@ -2203,7 +2203,7 @@
           <w:sz w:val="24"/>
         </w:rPr>
       </w:pPr>
-      <w:hyperlink w:anchor="_Toc234309256" w:history="1">
+      <w:hyperlink w:anchor="_Toc234320836" w:history="1">
         <w:r>
           <w:rPr>
             <w:rStyle w:val="Hyperlink"/>
@@ -2227,7 +2227,7 @@
           <w:rPr>
             <w:noProof/>
           </w:rPr>
-          <w:instrText xml:space="preserve"> PAGEREF _Toc234309256 \h </w:instrText>
+          <w:instrText xml:space="preserve"> PAGEREF _Toc234320836 \h </w:instrText>
         </w:r>
         <w:r>
           <w:rPr>
@@ -2266,7 +2266,7 @@
           <w:sz w:val="24"/>
         </w:rPr>
       </w:pPr>
-      <w:hyperlink w:anchor="_Toc234309257" w:history="1">
+      <w:hyperlink w:anchor="_Toc234320837" w:history="1">
         <w:r>
           <w:rPr>
             <w:rStyle w:val="Hyperlink"/>
@@ -2290,7 +2290,7 @@
           <w:rPr>
             <w:noProof/>
           </w:rPr>
-          <w:instrText xml:space="preserve"> PAGEREF _Toc234309257 \h </w:instrText>
+          <w:instrText xml:space="preserve"> PAGEREF _Toc234320837 \h </w:instrText>
         </w:r>
         <w:r>
           <w:rPr>
@@ -2329,7 +2329,7 @@
           <w:sz w:val="24"/>
         </w:rPr>
       </w:pPr>
-      <w:hyperlink w:anchor="_Toc234309258" w:history="1">
+      <w:hyperlink w:anchor="_Toc234320838" w:history="1">
         <w:r>
           <w:rPr>
             <w:rStyle w:val="Hyperlink"/>
@@ -2353,7 +2353,7 @@
           <w:rPr>
             <w:noProof/>
           </w:rPr>
-          <w:instrText xml:space="preserve"> PAGEREF _Toc234309258 \h </w:instrText>
+          <w:instrText xml:space="preserve"> PAGEREF _Toc234320838 \h </w:instrText>
         </w:r>
         <w:r>
           <w:rPr>
@@ -2392,7 +2392,7 @@
           <w:sz w:val="24"/>
         </w:rPr>
       </w:pPr>
-      <w:hyperlink w:anchor="_Toc234309259" w:history="1">
+      <w:hyperlink w:anchor="_Toc234320839" w:history="1">
         <w:r>
           <w:rPr>
             <w:rStyle w:val="Hyperlink"/>
@@ -2416,7 +2416,7 @@
           <w:rPr>
             <w:noProof/>
           </w:rPr>
-          <w:instrText xml:space="preserve"> PAGEREF _Toc234309259 \h </w:instrText>
+          <w:instrText xml:space="preserve"> PAGEREF _Toc234320839 \h </w:instrText>
         </w:r>
         <w:r>
           <w:rPr>
@@ -2455,7 +2455,7 @@
           <w:sz w:val="24"/>
         </w:rPr>
       </w:pPr>
-      <w:hyperlink w:anchor="_Toc234309260" w:history="1">
+      <w:hyperlink w:anchor="_Toc234320840" w:history="1">
         <w:r>
           <w:rPr>
             <w:rStyle w:val="Hyperlink"/>
@@ -2479,7 +2479,7 @@
           <w:rPr>
             <w:noProof/>
           </w:rPr>
-          <w:instrText xml:space="preserve"> PAGEREF _Toc234309260 \h </w:instrText>
+          <w:instrText xml:space="preserve"> PAGEREF _Toc234320840 \h </w:instrText>
         </w:r>
         <w:r>
           <w:rPr>
@@ -2518,7 +2518,7 @@
           <w:sz w:val="24"/>
         </w:rPr>
       </w:pPr>
-      <w:hyperlink w:anchor="_Toc234309261" w:history="1">
+      <w:hyperlink w:anchor="_Toc234320841" w:history="1">
         <w:r>
           <w:rPr>
             <w:rStyle w:val="Hyperlink"/>
@@ -2542,7 +2542,7 @@
           <w:rPr>
             <w:noProof/>
           </w:rPr>
-          <w:instrText xml:space="preserve"> PAGEREF _Toc234309261 \h </w:instrText>
+          <w:instrText xml:space="preserve"> PAGEREF _Toc234320841 \h </w:instrText>
         </w:r>
         <w:r>
           <w:rPr>
@@ -2581,7 +2581,7 @@
           <w:sz w:val="24"/>
         </w:rPr>
       </w:pPr>
-      <w:hyperlink w:anchor="_Toc234309262" w:history="1">
+      <w:hyperlink w:anchor="_Toc234320842" w:history="1">
         <w:r>
           <w:rPr>
             <w:rStyle w:val="Hyperlink"/>
@@ -2605,7 +2605,7 @@
           <w:rPr>
             <w:noProof/>
           </w:rPr>
-          <w:instrText xml:space="preserve"> PAGEREF _Toc234309262 \h </w:instrText>
+          <w:instrText xml:space="preserve"> PAGEREF _Toc234320842 \h </w:instrText>
         </w:r>
         <w:r>
           <w:rPr>
@@ -2633,6 +2633,69 @@
       </w:hyperlink>
     </w:p>
     <w:p>
+      <w:pPr>
+        <w:pStyle w:val="TOC1"/>
+        <w:tabs>
+          <w:tab w:val="right" w:leader="dot" w:pos="8990"/>
+        </w:tabs>
+        <w:rPr>
+          <w:rFonts w:asciiTheme="minorHAnsi" w:eastAsiaTheme="minorEastAsia" w:hAnsiTheme="minorHAnsi" w:cstheme="minorBidi"/>
+          <w:noProof/>
+          <w:sz w:val="24"/>
+        </w:rPr>
+      </w:pPr>
+      <w:hyperlink w:anchor="_Toc234320843" w:history="1">
+        <w:r>
+          <w:rPr>
+            <w:rStyle w:val="Hyperlink"/>
+            <w:noProof/>
+          </w:rPr>
+          <w:t>APPENDIX: ADDITIONAL SCREENSHOTS</w:t>
+        </w:r>
+        <w:r>
+          <w:rPr>
+            <w:noProof/>
+          </w:rPr>
+          <w:tab/>
+        </w:r>
+        <w:r>
+          <w:rPr>
+            <w:noProof/>
+          </w:rPr>
+          <w:fldChar w:fldCharType="begin"/>
+        </w:r>
+        <w:r>
+          <w:rPr>
+            <w:noProof/>
+          </w:rPr>
+          <w:instrText xml:space="preserve"> PAGEREF _Toc234320843 \h </w:instrText>
+        </w:r>
+        <w:r>
+          <w:rPr>
+            <w:noProof/>
+          </w:rPr>
+        </w:r>
+        <w:r>
+          <w:rPr>
+            <w:noProof/>
+          </w:rPr>
+          <w:fldChar w:fldCharType="separate"/>
+        </w:r>
+        <w:r>
+          <w:rPr>
+            <w:noProof/>
+          </w:rPr>
+          <w:t>34</w:t>
+        </w:r>
+        <w:r>
+          <w:rPr>
+            <w:noProof/>
+          </w:rPr>
+          <w:fldChar w:fldCharType="end"/>
+        </w:r>
+      </w:hyperlink>
+    </w:p>
+    <w:p>
       <w:r>
         <w:fldChar w:fldCharType="end"/>
       </w:r>
@@ -2641,7 +2704,7 @@
       <w:pPr>
         <w:pStyle w:val="Heading1"/>
       </w:pPr>
-      <w:bookmarkStart w:id="0" w:name="_Toc234309225"/>
+      <w:bookmarkStart w:id="0" w:name="_Toc234320805"/>
       <w:r>
         <w:lastRenderedPageBreak/>
         <w:t>1. INTRODUCTION</w:t>
@@ -2676,7 +2739,7 @@
       <w:pPr>
         <w:pStyle w:val="Heading1"/>
       </w:pPr>
-      <w:bookmarkStart w:id="1" w:name="_Toc234309226"/>
+      <w:bookmarkStart w:id="1" w:name="_Toc234320806"/>
       <w:r>
         <w:lastRenderedPageBreak/>
         <w:t>2. PROBLEM STATEMENT</w:t>
@@ -2763,7 +2826,7 @@
       <w:pPr>
         <w:pStyle w:val="Heading1"/>
       </w:pPr>
-      <w:bookmarkStart w:id="2" w:name="_Toc234309227"/>
+      <w:bookmarkStart w:id="2" w:name="_Toc234320807"/>
       <w:r>
         <w:lastRenderedPageBreak/>
         <w:t>3. OBJECTIVES OF THE SYSTEM</w:t>
@@ -2866,7 +2929,7 @@
       <w:pPr>
         <w:pStyle w:val="Heading1"/>
       </w:pPr>
-      <w:bookmarkStart w:id="3" w:name="_Toc234309228"/>
+      <w:bookmarkStart w:id="3" w:name="_Toc234320808"/>
       <w:r>
         <w:lastRenderedPageBreak/>
         <w:t>4. SCOPE OF THE SYSTEM</w:t>
@@ -2877,7 +2940,7 @@
       <w:pPr>
         <w:pStyle w:val="Heading2"/>
       </w:pPr>
-      <w:bookmarkStart w:id="4" w:name="_Toc234309229"/>
+      <w:bookmarkStart w:id="4" w:name="_Toc234320809"/>
       <w:r>
         <w:t>4.1 In Scope</w:t>
       </w:r>
@@ -3019,7 +3082,7 @@
       <w:pPr>
         <w:pStyle w:val="Heading2"/>
       </w:pPr>
-      <w:bookmarkStart w:id="5" w:name="_Toc234309230"/>
+      <w:bookmarkStart w:id="5" w:name="_Toc234320810"/>
       <w:r>
         <w:t>4.2 Out of Scope</w:t>
       </w:r>
@@ -3089,7 +3152,7 @@
       <w:pPr>
         <w:pStyle w:val="Heading1"/>
       </w:pPr>
-      <w:bookmarkStart w:id="6" w:name="_Toc234309231"/>
+      <w:bookmarkStart w:id="6" w:name="_Toc234320811"/>
       <w:r>
         <w:lastRenderedPageBreak/>
         <w:t>5. METHODOLOGY</w:t>
@@ -3108,7 +3171,7 @@
       <w:pPr>
         <w:pStyle w:val="Heading2"/>
       </w:pPr>
-      <w:bookmarkStart w:id="7" w:name="_Toc234309232"/>
+      <w:bookmarkStart w:id="7" w:name="_Toc234320812"/>
       <w:r>
         <w:t>5.1 Development Environment and Tools</w:t>
       </w:r>
@@ -3166,7 +3229,7 @@
       <w:pPr>
         <w:pStyle w:val="Heading2"/>
       </w:pPr>
-      <w:bookmarkStart w:id="8" w:name="_Toc234309233"/>
+      <w:bookmarkStart w:id="8" w:name="_Toc234320813"/>
       <w:r>
         <w:t>5.2 Design Approach</w:t>
       </w:r>
@@ -3184,7 +3247,7 @@
       <w:pPr>
         <w:pStyle w:val="Heading2"/>
       </w:pPr>
-      <w:bookmarkStart w:id="9" w:name="_Toc234309234"/>
+      <w:bookmarkStart w:id="9" w:name="_Toc234320814"/>
       <w:r>
         <w:lastRenderedPageBreak/>
         <w:t>5.3 Verification Approach</w:t>
@@ -3203,7 +3266,7 @@
       <w:pPr>
         <w:pStyle w:val="Heading1"/>
       </w:pPr>
-      <w:bookmarkStart w:id="10" w:name="_Toc234309235"/>
+      <w:bookmarkStart w:id="10" w:name="_Toc234320815"/>
       <w:r>
         <w:lastRenderedPageBreak/>
         <w:t>6. SYSTEM DESIGN</w:t>
@@ -3670,7 +3733,7 @@
       <w:pPr>
         <w:pStyle w:val="Heading2"/>
       </w:pPr>
-      <w:bookmarkStart w:id="11" w:name="_Toc234309236"/>
+      <w:bookmarkStart w:id="11" w:name="_Toc234320816"/>
       <w:r>
         <w:t>6.1 Navigation Architecture</w:t>
       </w:r>
@@ -3688,7 +3751,7 @@
       <w:pPr>
         <w:pStyle w:val="Heading2"/>
       </w:pPr>
-      <w:bookmarkStart w:id="12" w:name="_Toc234309237"/>
+      <w:bookmarkStart w:id="12" w:name="_Toc234320817"/>
       <w:r>
         <w:t>6.2 Cross-Module Data Flow</w:t>
       </w:r>
@@ -3706,7 +3769,7 @@
       <w:pPr>
         <w:pStyle w:val="Heading2"/>
       </w:pPr>
-      <w:bookmarkStart w:id="13" w:name="_Toc234309238"/>
+      <w:bookmarkStart w:id="13" w:name="_Toc234320818"/>
       <w:r>
         <w:t>6.3 Persistence Model</w:t>
       </w:r>
@@ -3728,7 +3791,7 @@
       <w:pPr>
         <w:pStyle w:val="Heading1"/>
       </w:pPr>
-      <w:bookmarkStart w:id="14" w:name="_Toc234309239"/>
+      <w:bookmarkStart w:id="14" w:name="_Toc234320819"/>
       <w:r>
         <w:lastRenderedPageBreak/>
         <w:t>7. DESCRIPTION OF CLASSES AND METHODS</w:t>
@@ -3739,7 +3802,7 @@
       <w:pPr>
         <w:pStyle w:val="Heading2"/>
       </w:pPr>
-      <w:bookmarkStart w:id="15" w:name="_Toc234309240"/>
+      <w:bookmarkStart w:id="15" w:name="_Toc234320820"/>
       <w:r>
         <w:t>7.1 base.Entity (abstract class)</w:t>
       </w:r>
@@ -3817,7 +3880,7 @@
       <w:pPr>
         <w:pStyle w:val="Heading2"/>
       </w:pPr>
-      <w:bookmarkStart w:id="16" w:name="_Toc234309241"/>
+      <w:bookmarkStart w:id="16" w:name="_Toc234320821"/>
       <w:r>
         <w:t>7.2 base.Manager&lt;T extends Entity&gt; (generic abstract class)</w:t>
       </w:r>
@@ -3907,7 +3970,7 @@
       <w:pPr>
         <w:pStyle w:val="Heading2"/>
       </w:pPr>
-      <w:bookmarkStart w:id="17" w:name="_Toc234309242"/>
+      <w:bookmarkStart w:id="17" w:name="_Toc234320822"/>
       <w:r>
         <w:lastRenderedPageBreak/>
         <w:t>7.3 base.Displayable (interface)</w:t>
@@ -3926,7 +3989,7 @@
       <w:pPr>
         <w:pStyle w:val="Heading2"/>
       </w:pPr>
-      <w:bookmarkStart w:id="18" w:name="_Toc234309243"/>
+      <w:bookmarkStart w:id="18" w:name="_Toc234320823"/>
       <w:r>
         <w:t>7.4 ui.BasePanel (abstract class extending JPanel)</w:t>
       </w:r>
@@ -4004,7 +4067,7 @@
       <w:pPr>
         <w:pStyle w:val="Heading2"/>
       </w:pPr>
-      <w:bookmarkStart w:id="19" w:name="_Toc234309244"/>
+      <w:bookmarkStart w:id="19" w:name="_Toc234320824"/>
       <w:r>
         <w:t>7.5 ui.MainWindow (extends JFrame) and ui.FormDialog (extends JDialog)</w:t>
       </w:r>
@@ -4022,7 +4085,7 @@
       <w:pPr>
         <w:pStyle w:val="Heading2"/>
       </w:pPr>
-      <w:bookmarkStart w:id="20" w:name="_Toc234309245"/>
+      <w:bookmarkStart w:id="20" w:name="_Toc234320825"/>
       <w:r>
         <w:lastRenderedPageBreak/>
         <w:t>7.6 util.AppTheme, util.Validator, util.FileUtil</w:t>
@@ -4069,7 +4132,7 @@
       <w:pPr>
         <w:pStyle w:val="Heading2"/>
       </w:pPr>
-      <w:bookmarkStart w:id="21" w:name="_Toc234309246"/>
+      <w:bookmarkStart w:id="21" w:name="_Toc234320826"/>
       <w:r>
         <w:t>7.7 Manager Classes (manager package)</w:t>
       </w:r>
@@ -4159,7 +4222,7 @@
       <w:pPr>
         <w:pStyle w:val="Heading2"/>
       </w:pPr>
-      <w:bookmarkStart w:id="22" w:name="_Toc234309247"/>
+      <w:bookmarkStart w:id="22" w:name="_Toc234320827"/>
       <w:r>
         <w:lastRenderedPageBreak/>
         <w:t>7.8 Model and Panel Classes</w:t>
@@ -4178,7 +4241,7 @@
       <w:pPr>
         <w:pStyle w:val="Heading1"/>
       </w:pPr>
-      <w:bookmarkStart w:id="23" w:name="_Toc234309248"/>
+      <w:bookmarkStart w:id="23" w:name="_Toc234320828"/>
       <w:r>
         <w:lastRenderedPageBreak/>
         <w:t>8. GUI DESIGN EXPLANATION</w:t>
@@ -4257,7 +4320,7 @@
       <w:pPr>
         <w:pStyle w:val="Heading1"/>
       </w:pPr>
-      <w:bookmarkStart w:id="24" w:name="_Toc234309249"/>
+      <w:bookmarkStart w:id="24" w:name="_Toc234320829"/>
       <w:r>
         <w:lastRenderedPageBreak/>
         <w:t>9. OOP CONCEPTS IMPLEMENTED</w:t>
@@ -4268,7 +4331,7 @@
       <w:pPr>
         <w:pStyle w:val="Heading2"/>
       </w:pPr>
-      <w:bookmarkStart w:id="25" w:name="_Toc234309250"/>
+      <w:bookmarkStart w:id="25" w:name="_Toc234320830"/>
       <w:r>
         <w:t>9.1 Encapsulation</w:t>
       </w:r>
@@ -4286,7 +4349,7 @@
       <w:pPr>
         <w:pStyle w:val="Heading2"/>
       </w:pPr>
-      <w:bookmarkStart w:id="26" w:name="_Toc234309251"/>
+      <w:bookmarkStart w:id="26" w:name="_Toc234320831"/>
       <w:r>
         <w:t>9.2 Abstraction</w:t>
       </w:r>
@@ -4304,7 +4367,7 @@
       <w:pPr>
         <w:pStyle w:val="Heading2"/>
       </w:pPr>
-      <w:bookmarkStart w:id="27" w:name="_Toc234309252"/>
+      <w:bookmarkStart w:id="27" w:name="_Toc234320832"/>
       <w:r>
         <w:t>9.3 Inheritance</w:t>
       </w:r>
@@ -4322,7 +4385,7 @@
       <w:pPr>
         <w:pStyle w:val="Heading2"/>
       </w:pPr>
-      <w:bookmarkStart w:id="28" w:name="_Toc234309253"/>
+      <w:bookmarkStart w:id="28" w:name="_Toc234320833"/>
       <w:r>
         <w:t>9.4 Composition (contrasted with Inheritance)</w:t>
       </w:r>
@@ -4340,7 +4403,7 @@
       <w:pPr>
         <w:pStyle w:val="Heading2"/>
       </w:pPr>
-      <w:bookmarkStart w:id="29" w:name="_Toc234309254"/>
+      <w:bookmarkStart w:id="29" w:name="_Toc234320834"/>
       <w:r>
         <w:lastRenderedPageBreak/>
         <w:t>9.5 Polymorphism</w:t>
@@ -4359,7 +4422,7 @@
       <w:pPr>
         <w:pStyle w:val="Heading2"/>
       </w:pPr>
-      <w:bookmarkStart w:id="30" w:name="_Toc234309255"/>
+      <w:bookmarkStart w:id="30" w:name="_Toc234320835"/>
       <w:r>
         <w:t>9.6 Generics</w:t>
       </w:r>
@@ -4377,7 +4440,7 @@
       <w:pPr>
         <w:pStyle w:val="Heading2"/>
       </w:pPr>
-      <w:bookmarkStart w:id="31" w:name="_Toc234309256"/>
+      <w:bookmarkStart w:id="31" w:name="_Toc234320836"/>
       <w:r>
         <w:t>9.7 Design Patterns Observed</w:t>
       </w:r>
@@ -4423,7 +4486,7 @@
       <w:pPr>
         <w:pStyle w:val="Heading1"/>
       </w:pPr>
-      <w:bookmarkStart w:id="32" w:name="_Toc234309257"/>
+      <w:bookmarkStart w:id="32" w:name="_Toc234320837"/>
       <w:r>
         <w:lastRenderedPageBreak/>
         <w:t>10. SCREENSHOTS AND OUTPUTS</w:t>
@@ -4452,7 +4515,7 @@
           <w:color w:val="808080"/>
         </w:rPr>
         <w:drawing>
-          <wp:inline distT="0" distB="0" distL="0" distR="0" wp14:anchorId="2E5D20A4" wp14:editId="3DF3C128">
+          <wp:inline distT="0" distB="0" distL="0" distR="0" wp14:anchorId="2E5D20A4" wp14:editId="0F3B4208">
             <wp:extent cx="5334000" cy="2859024"/>
             <wp:effectExtent l="0" t="0" r="0" b="0"/>
             <wp:docPr id="714042723" name="Picture 1"/>
@@ -4529,7 +4592,7 @@
           <w:color w:val="808080"/>
         </w:rPr>
         <w:drawing>
-          <wp:inline distT="0" distB="0" distL="0" distR="0" wp14:anchorId="4CF482EC" wp14:editId="2DAF6CF5">
+          <wp:inline distT="0" distB="0" distL="0" distR="0" wp14:anchorId="4CF482EC" wp14:editId="7FBCF621">
             <wp:extent cx="5334000" cy="2857839"/>
             <wp:effectExtent l="0" t="0" r="0" b="0"/>
             <wp:docPr id="475526867" name="Picture 2"/>
@@ -4606,7 +4669,7 @@
           <w:color w:val="808080"/>
         </w:rPr>
         <w:drawing>
-          <wp:inline distT="0" distB="0" distL="0" distR="0" wp14:anchorId="49F4804B" wp14:editId="7AEE93F7">
+          <wp:inline distT="0" distB="0" distL="0" distR="0" wp14:anchorId="49F4804B" wp14:editId="16C78819">
             <wp:extent cx="5334000" cy="2864951"/>
             <wp:effectExtent l="0" t="0" r="0" b="0"/>
             <wp:docPr id="1035878586" name="Picture 3"/>
@@ -4683,7 +4746,7 @@
           <w:color w:val="808080"/>
         </w:rPr>
         <w:drawing>
-          <wp:inline distT="0" distB="0" distL="0" distR="0" wp14:anchorId="01DB7F1B" wp14:editId="18FE9D8B">
+          <wp:inline distT="0" distB="0" distL="0" distR="0" wp14:anchorId="01DB7F1B" wp14:editId="515DCE7E">
             <wp:extent cx="5334000" cy="2848949"/>
             <wp:effectExtent l="0" t="0" r="0" b="8890"/>
             <wp:docPr id="1001767665" name="Picture 1"/>
@@ -4761,7 +4824,7 @@
         </w:rPr>
         <w:lastRenderedPageBreak/>
         <w:drawing>
-          <wp:inline distT="0" distB="0" distL="0" distR="0" wp14:anchorId="662AC6E3" wp14:editId="78BA2A88">
+          <wp:inline distT="0" distB="0" distL="0" distR="0" wp14:anchorId="662AC6E3" wp14:editId="11825E06">
             <wp:extent cx="5334000" cy="2851912"/>
             <wp:effectExtent l="0" t="0" r="0" b="5715"/>
             <wp:docPr id="1466899551" name="Picture 2"/>
@@ -4838,7 +4901,7 @@
           <w:color w:val="808080"/>
         </w:rPr>
         <w:drawing>
-          <wp:inline distT="0" distB="0" distL="0" distR="0" wp14:anchorId="2A5D32E5" wp14:editId="40903E7D">
+          <wp:inline distT="0" distB="0" distL="0" distR="0" wp14:anchorId="2A5D32E5" wp14:editId="134D249D">
             <wp:extent cx="5334000" cy="2867914"/>
             <wp:effectExtent l="0" t="0" r="0" b="8890"/>
             <wp:docPr id="1482432158" name="Picture 3"/>
@@ -4916,7 +4979,7 @@
         </w:rPr>
         <w:lastRenderedPageBreak/>
         <w:drawing>
-          <wp:inline distT="0" distB="0" distL="0" distR="0" wp14:anchorId="7B4227F2" wp14:editId="77A6441F">
+          <wp:inline distT="0" distB="0" distL="0" distR="0" wp14:anchorId="7B4227F2" wp14:editId="13FE0687">
             <wp:extent cx="5334000" cy="2850727"/>
             <wp:effectExtent l="0" t="0" r="0" b="6985"/>
             <wp:docPr id="675627804" name="Picture 4"/>
@@ -4993,7 +5056,7 @@
           <w:color w:val="808080"/>
         </w:rPr>
         <w:drawing>
-          <wp:inline distT="0" distB="0" distL="0" distR="0" wp14:anchorId="581A2707" wp14:editId="2A9D828E">
+          <wp:inline distT="0" distB="0" distL="0" distR="0" wp14:anchorId="581A2707" wp14:editId="63216A75">
             <wp:extent cx="5334000" cy="2851319"/>
             <wp:effectExtent l="0" t="0" r="0" b="6350"/>
             <wp:docPr id="1229476174" name="Picture 5"/>
@@ -5071,7 +5134,7 @@
         </w:rPr>
         <w:lastRenderedPageBreak/>
         <w:drawing>
-          <wp:inline distT="0" distB="0" distL="0" distR="0" wp14:anchorId="3320E619" wp14:editId="25D65592">
+          <wp:inline distT="0" distB="0" distL="0" distR="0" wp14:anchorId="3320E619" wp14:editId="038D69D3">
             <wp:extent cx="5334000" cy="2856653"/>
             <wp:effectExtent l="0" t="0" r="0" b="1270"/>
             <wp:docPr id="270369643" name="Picture 6"/>
@@ -5148,7 +5211,7 @@
           <w:color w:val="808080"/>
         </w:rPr>
         <w:drawing>
-          <wp:inline distT="0" distB="0" distL="0" distR="0" wp14:anchorId="17182EA3" wp14:editId="2E7A5331">
+          <wp:inline distT="0" distB="0" distL="0" distR="0" wp14:anchorId="17182EA3" wp14:editId="02D0139F">
             <wp:extent cx="5334000" cy="2848949"/>
             <wp:effectExtent l="0" t="0" r="0" b="8890"/>
             <wp:docPr id="1640305537" name="Picture 7"/>
@@ -5226,7 +5289,7 @@
         </w:rPr>
         <w:lastRenderedPageBreak/>
         <w:drawing>
-          <wp:inline distT="0" distB="0" distL="0" distR="0" wp14:anchorId="1CFE849D" wp14:editId="46C5D49D">
+          <wp:inline distT="0" distB="0" distL="0" distR="0" wp14:anchorId="1CFE849D" wp14:editId="01CF2521">
             <wp:extent cx="5334000" cy="2843615"/>
             <wp:effectExtent l="0" t="0" r="0" b="0"/>
             <wp:docPr id="1015366820" name="Picture 8"/>
@@ -5303,7 +5366,7 @@
           <w:color w:val="808080"/>
         </w:rPr>
         <w:drawing>
-          <wp:inline distT="0" distB="0" distL="0" distR="0" wp14:anchorId="73CC8328" wp14:editId="30BC66F0">
+          <wp:inline distT="0" distB="0" distL="0" distR="0" wp14:anchorId="73CC8328" wp14:editId="29BAE425">
             <wp:extent cx="5334000" cy="2846578"/>
             <wp:effectExtent l="0" t="0" r="0" b="0"/>
             <wp:docPr id="79470811" name="Picture 9"/>
@@ -5381,7 +5444,7 @@
         </w:rPr>
         <w:lastRenderedPageBreak/>
         <w:drawing>
-          <wp:inline distT="0" distB="0" distL="0" distR="0" wp14:anchorId="7B1ABBE9" wp14:editId="4CDF61EC">
+          <wp:inline distT="0" distB="0" distL="0" distR="0" wp14:anchorId="7B1ABBE9" wp14:editId="29CC9D4A">
             <wp:extent cx="5334000" cy="2862580"/>
             <wp:effectExtent l="0" t="0" r="0" b="0"/>
             <wp:docPr id="282877113" name="Picture 10"/>
@@ -5458,7 +5521,7 @@
           <w:color w:val="808080"/>
         </w:rPr>
         <w:drawing>
-          <wp:inline distT="0" distB="0" distL="0" distR="0" wp14:anchorId="034E2001" wp14:editId="5075A8F3">
+          <wp:inline distT="0" distB="0" distL="0" distR="0" wp14:anchorId="034E2001" wp14:editId="23FFDCF6">
             <wp:extent cx="5334000" cy="2851912"/>
             <wp:effectExtent l="0" t="0" r="0" b="5715"/>
             <wp:docPr id="426359504" name="Picture 4"/>
@@ -5536,7 +5599,7 @@
         </w:rPr>
         <w:lastRenderedPageBreak/>
         <w:drawing>
-          <wp:inline distT="0" distB="0" distL="0" distR="0" wp14:anchorId="62F32EFC" wp14:editId="253DD734">
+          <wp:inline distT="0" distB="0" distL="0" distR="0" wp14:anchorId="62F32EFC" wp14:editId="446CFBAC">
             <wp:extent cx="5334000" cy="2864951"/>
             <wp:effectExtent l="0" t="0" r="0" b="0"/>
             <wp:docPr id="370561034" name="Picture 5"/>
@@ -5603,7 +5666,7 @@
       <w:pPr>
         <w:pStyle w:val="Heading1"/>
       </w:pPr>
-      <w:bookmarkStart w:id="33" w:name="_Toc234309258"/>
+      <w:bookmarkStart w:id="33" w:name="_Toc234320838"/>
       <w:r>
         <w:lastRenderedPageBreak/>
         <w:t>11. GITHUB REPOSITORY LINK</w:t>
@@ -5633,7 +5696,7 @@
       <w:pPr>
         <w:pStyle w:val="Heading1"/>
       </w:pPr>
-      <w:bookmarkStart w:id="34" w:name="_Toc234309259"/>
+      <w:bookmarkStart w:id="34" w:name="_Toc234320839"/>
       <w:r>
         <w:lastRenderedPageBreak/>
         <w:t>12. CHALLENGES ENCOUNTERED</w:t>
@@ -5704,7 +5767,7 @@
       <w:pPr>
         <w:pStyle w:val="Heading1"/>
       </w:pPr>
-      <w:bookmarkStart w:id="35" w:name="_Toc234309260"/>
+      <w:bookmarkStart w:id="35" w:name="_Toc234320840"/>
       <w:r>
         <w:lastRenderedPageBreak/>
         <w:t>13. CONCLUSION</w:t>
@@ -5723,7 +5786,7 @@
       <w:pPr>
         <w:pStyle w:val="Heading1"/>
       </w:pPr>
-      <w:bookmarkStart w:id="36" w:name="_Toc234309261"/>
+      <w:bookmarkStart w:id="36" w:name="_Toc234320841"/>
       <w:r>
         <w:lastRenderedPageBreak/>
         <w:t>14. RECOMMENDATIONS</w:t>
@@ -5806,7 +5869,7 @@
       <w:pPr>
         <w:pStyle w:val="Heading1"/>
       </w:pPr>
-      <w:bookmarkStart w:id="37" w:name="_Toc234309262"/>
+      <w:bookmarkStart w:id="37" w:name="_Toc234320842"/>
       <w:r>
         <w:lastRenderedPageBreak/>
         <w:t>15. REFERENCES</w:t>
@@ -5855,9 +5918,1058 @@
     </w:p>
     <w:p>
       <w:pPr>
-        <w:jc w:val="both"/>
-      </w:pPr>
-    </w:p>
+        <w:pStyle w:val="Heading1"/>
+      </w:pPr>
+      <w:bookmarkStart w:id="38" w:name="_Toc234320843"/>
+      <w:r>
+        <w:lastRenderedPageBreak/>
+        <w:t>APPENDIX: ADDITIONAL SCREENSHOTS</w:t>
+      </w:r>
+      <w:bookmarkEnd w:id="38"/>
+    </w:p>
+    <w:p>
+      <w:r>
+        <w:t>The figures below are the remaining captures from the screenshots folder, supplementing the figures referenced in Section 10.</w:t>
+      </w:r>
+    </w:p>
+    <w:p/>
+    <w:p>
+      <w:r>
+        <w:t>Figure A1: Doctors - doctor detail view</w:t>
+      </w:r>
+    </w:p>
+    <w:p>
+      <w:r>
+        <w:t>Figure A2: Queue Management - patient detail view</w:t>
+      </w:r>
+    </w:p>
+    <w:p>
+      <w:r>
+        <w:t>Figure A3: Queue Management - triage entry</w:t>
+      </w:r>
+    </w:p>
+    <w:p>
+      <w:r>
+        <w:t>Figure A4: Medical Records - record detail view</w:t>
+      </w:r>
+    </w:p>
+    <w:p>
+      <w:r>
+        <w:t>Figure A5: Medical Records - edit record</w:t>
+      </w:r>
+    </w:p>
+    <w:p>
+      <w:r>
+        <w:t>Figure A6: Medical Records - select patient for history</w:t>
+      </w:r>
+    </w:p>
+    <w:p>
+      <w:r>
+        <w:t>Figure A7: Medical Records - patient history (records and lab results)</w:t>
+      </w:r>
+    </w:p>
+    <w:p>
+      <w:r>
+        <w:t>Figure A8: Pharmacy - low stock alert report</w:t>
+      </w:r>
+    </w:p>
+    <w:p>
+      <w:r>
+        <w:t>Figure A9: Pharmacy - sales revenue report</w:t>
+      </w:r>
+    </w:p>
+    <w:p>
+      <w:r>
+        <w:t>Figure A10: Appointments - booking list</w:t>
+      </w:r>
+    </w:p>
+    <w:p>
+      <w:r>
+        <w:t>Figure A11: Appointments - list view</w:t>
+      </w:r>
+    </w:p>
+    <w:p>
+      <w:r>
+        <w:t>Figure A12: Blood Donation - blood bank stock report</w:t>
+      </w:r>
+    </w:p>
+    <w:p>
+      <w:r>
+        <w:t>Figure A13: Vaccination - vaccine catalogue</w:t>
+      </w:r>
+    </w:p>
+    <w:p>
+      <w:r>
+        <w:t>Figure A14: Ambulance Dispatch - vehicle registry</w:t>
+      </w:r>
+    </w:p>
+    <w:p>
+      <w:r>
+        <w:t>Figure A15: Laboratory - test results</w:t>
+      </w:r>
+    </w:p>
+    <w:p>
+      <w:r>
+        <w:t>Figure A16: Laboratory - test catalogue</w:t>
+      </w:r>
+    </w:p>
+    <w:p>
+      <w:r>
+        <w:t>Figure A17: Laboratory - test constituents and reference ranges</w:t>
+      </w:r>
+    </w:p>
+    <w:p>
+      <w:r>
+        <w:t>Figure A18: Billing and Payment - bill list</w:t>
+      </w:r>
+    </w:p>
+    <w:p>
+      <w:r>
+        <w:t>Figure A19: Billing and Payment - revenue report</w:t>
+      </w:r>
+    </w:p>
+    <w:p>
+      <w:r>
+        <w:rPr>
+          <w:noProof/>
+        </w:rPr>
+        <w:lastRenderedPageBreak/>
+        <w:drawing>
+          <wp:inline distT="0" distB="0" distL="0" distR="0" wp14:anchorId="20C21B47" wp14:editId="5A17217F">
+            <wp:extent cx="5334000" cy="2863173"/>
+            <wp:effectExtent l="0" t="0" r="0" b="0"/>
+            <wp:docPr id="1421574492" name="Picture 19"/>
+            <wp:cNvGraphicFramePr>
+              <a:graphicFrameLocks xmlns:a="http://schemas.openxmlformats.org/drawingml/2006/main" noChangeAspect="1"/>
+            </wp:cNvGraphicFramePr>
+            <a:graphic xmlns:a="http://schemas.openxmlformats.org/drawingml/2006/main">
+              <a:graphicData uri="http://schemas.openxmlformats.org/drawingml/2006/picture">
+                <pic:pic xmlns:pic="http://schemas.openxmlformats.org/drawingml/2006/picture">
+                  <pic:nvPicPr>
+                    <pic:cNvPr id="1421574492" name=""/>
+                    <pic:cNvPicPr/>
+                  </pic:nvPicPr>
+                  <pic:blipFill>
+                    <a:blip r:embed="rId20" cstate="print">
+                      <a:extLst>
+                        <a:ext uri="{28A0092B-C50C-407E-A947-70E740481C1C}">
+                          <a14:useLocalDpi xmlns:a14="http://schemas.microsoft.com/office/drawing/2010/main" val="0"/>
+                        </a:ext>
+                      </a:extLst>
+                    </a:blip>
+                    <a:stretch>
+                      <a:fillRect/>
+                    </a:stretch>
+                  </pic:blipFill>
+                  <pic:spPr>
+                    <a:xfrm>
+                      <a:off x="0" y="0"/>
+                      <a:ext cx="5334000" cy="2863173"/>
+                    </a:xfrm>
+                    <a:prstGeom prst="rect">
+                      <a:avLst/>
+                    </a:prstGeom>
+                  </pic:spPr>
+                </pic:pic>
+              </a:graphicData>
+            </a:graphic>
+          </wp:inline>
+        </w:drawing>
+      </w:r>
+    </w:p>
+    <w:p/>
+    <w:p>
+      <w:r>
+        <w:rPr>
+          <w:noProof/>
+        </w:rPr>
+        <w:drawing>
+          <wp:inline distT="0" distB="0" distL="0" distR="0" wp14:anchorId="4CD90A38" wp14:editId="3BF5A712">
+            <wp:extent cx="5334000" cy="2857839"/>
+            <wp:effectExtent l="0" t="0" r="0" b="0"/>
+            <wp:docPr id="1726641900" name="Picture 18"/>
+            <wp:cNvGraphicFramePr>
+              <a:graphicFrameLocks xmlns:a="http://schemas.openxmlformats.org/drawingml/2006/main" noChangeAspect="1"/>
+            </wp:cNvGraphicFramePr>
+            <a:graphic xmlns:a="http://schemas.openxmlformats.org/drawingml/2006/main">
+              <a:graphicData uri="http://schemas.openxmlformats.org/drawingml/2006/picture">
+                <pic:pic xmlns:pic="http://schemas.openxmlformats.org/drawingml/2006/picture">
+                  <pic:nvPicPr>
+                    <pic:cNvPr id="1726641900" name=""/>
+                    <pic:cNvPicPr/>
+                  </pic:nvPicPr>
+                  <pic:blipFill>
+                    <a:blip r:embed="rId21" cstate="print">
+                      <a:extLst>
+                        <a:ext uri="{28A0092B-C50C-407E-A947-70E740481C1C}">
+                          <a14:useLocalDpi xmlns:a14="http://schemas.microsoft.com/office/drawing/2010/main" val="0"/>
+                        </a:ext>
+                      </a:extLst>
+                    </a:blip>
+                    <a:stretch>
+                      <a:fillRect/>
+                    </a:stretch>
+                  </pic:blipFill>
+                  <pic:spPr>
+                    <a:xfrm>
+                      <a:off x="0" y="0"/>
+                      <a:ext cx="5334000" cy="2857839"/>
+                    </a:xfrm>
+                    <a:prstGeom prst="rect">
+                      <a:avLst/>
+                    </a:prstGeom>
+                  </pic:spPr>
+                </pic:pic>
+              </a:graphicData>
+            </a:graphic>
+          </wp:inline>
+        </w:drawing>
+      </w:r>
+    </w:p>
+    <w:p/>
+    <w:p>
+      <w:r>
+        <w:rPr>
+          <w:noProof/>
+        </w:rPr>
+        <w:lastRenderedPageBreak/>
+        <w:drawing>
+          <wp:inline distT="0" distB="0" distL="0" distR="0" wp14:anchorId="3B7FA71C" wp14:editId="56D81DA2">
+            <wp:extent cx="5334000" cy="2869099"/>
+            <wp:effectExtent l="0" t="0" r="0" b="7620"/>
+            <wp:docPr id="815747" name="Picture 17"/>
+            <wp:cNvGraphicFramePr>
+              <a:graphicFrameLocks xmlns:a="http://schemas.openxmlformats.org/drawingml/2006/main" noChangeAspect="1"/>
+            </wp:cNvGraphicFramePr>
+            <a:graphic xmlns:a="http://schemas.openxmlformats.org/drawingml/2006/main">
+              <a:graphicData uri="http://schemas.openxmlformats.org/drawingml/2006/picture">
+                <pic:pic xmlns:pic="http://schemas.openxmlformats.org/drawingml/2006/picture">
+                  <pic:nvPicPr>
+                    <pic:cNvPr id="815747" name=""/>
+                    <pic:cNvPicPr/>
+                  </pic:nvPicPr>
+                  <pic:blipFill>
+                    <a:blip r:embed="rId22" cstate="print">
+                      <a:extLst>
+                        <a:ext uri="{28A0092B-C50C-407E-A947-70E740481C1C}">
+                          <a14:useLocalDpi xmlns:a14="http://schemas.microsoft.com/office/drawing/2010/main" val="0"/>
+                        </a:ext>
+                      </a:extLst>
+                    </a:blip>
+                    <a:stretch>
+                      <a:fillRect/>
+                    </a:stretch>
+                  </pic:blipFill>
+                  <pic:spPr>
+                    <a:xfrm>
+                      <a:off x="0" y="0"/>
+                      <a:ext cx="5334000" cy="2869099"/>
+                    </a:xfrm>
+                    <a:prstGeom prst="rect">
+                      <a:avLst/>
+                    </a:prstGeom>
+                  </pic:spPr>
+                </pic:pic>
+              </a:graphicData>
+            </a:graphic>
+          </wp:inline>
+        </w:drawing>
+      </w:r>
+    </w:p>
+    <w:p/>
+    <w:p>
+      <w:r>
+        <w:rPr>
+          <w:noProof/>
+        </w:rPr>
+        <w:drawing>
+          <wp:inline distT="0" distB="0" distL="0" distR="0" wp14:anchorId="17D0CB7A" wp14:editId="4398C55B">
+            <wp:extent cx="5334000" cy="2864951"/>
+            <wp:effectExtent l="0" t="0" r="0" b="0"/>
+            <wp:docPr id="1213715378" name="Picture 16"/>
+            <wp:cNvGraphicFramePr>
+              <a:graphicFrameLocks xmlns:a="http://schemas.openxmlformats.org/drawingml/2006/main" noChangeAspect="1"/>
+            </wp:cNvGraphicFramePr>
+            <a:graphic xmlns:a="http://schemas.openxmlformats.org/drawingml/2006/main">
+              <a:graphicData uri="http://schemas.openxmlformats.org/drawingml/2006/picture">
+                <pic:pic xmlns:pic="http://schemas.openxmlformats.org/drawingml/2006/picture">
+                  <pic:nvPicPr>
+                    <pic:cNvPr id="1213715378" name=""/>
+                    <pic:cNvPicPr/>
+                  </pic:nvPicPr>
+                  <pic:blipFill>
+                    <a:blip r:embed="rId23" cstate="print">
+                      <a:extLst>
+                        <a:ext uri="{28A0092B-C50C-407E-A947-70E740481C1C}">
+                          <a14:useLocalDpi xmlns:a14="http://schemas.microsoft.com/office/drawing/2010/main" val="0"/>
+                        </a:ext>
+                      </a:extLst>
+                    </a:blip>
+                    <a:stretch>
+                      <a:fillRect/>
+                    </a:stretch>
+                  </pic:blipFill>
+                  <pic:spPr>
+                    <a:xfrm>
+                      <a:off x="0" y="0"/>
+                      <a:ext cx="5334000" cy="2864951"/>
+                    </a:xfrm>
+                    <a:prstGeom prst="rect">
+                      <a:avLst/>
+                    </a:prstGeom>
+                  </pic:spPr>
+                </pic:pic>
+              </a:graphicData>
+            </a:graphic>
+          </wp:inline>
+        </w:drawing>
+      </w:r>
+    </w:p>
+    <w:p/>
+    <w:p>
+      <w:r>
+        <w:rPr>
+          <w:noProof/>
+        </w:rPr>
+        <w:lastRenderedPageBreak/>
+        <w:drawing>
+          <wp:inline distT="0" distB="0" distL="0" distR="0" wp14:anchorId="27634D9D" wp14:editId="3480931E">
+            <wp:extent cx="5334000" cy="2861987"/>
+            <wp:effectExtent l="0" t="0" r="0" b="0"/>
+            <wp:docPr id="400585266" name="Picture 15"/>
+            <wp:cNvGraphicFramePr>
+              <a:graphicFrameLocks xmlns:a="http://schemas.openxmlformats.org/drawingml/2006/main" noChangeAspect="1"/>
+            </wp:cNvGraphicFramePr>
+            <a:graphic xmlns:a="http://schemas.openxmlformats.org/drawingml/2006/main">
+              <a:graphicData uri="http://schemas.openxmlformats.org/drawingml/2006/picture">
+                <pic:pic xmlns:pic="http://schemas.openxmlformats.org/drawingml/2006/picture">
+                  <pic:nvPicPr>
+                    <pic:cNvPr id="400585266" name=""/>
+                    <pic:cNvPicPr/>
+                  </pic:nvPicPr>
+                  <pic:blipFill>
+                    <a:blip r:embed="rId24" cstate="print">
+                      <a:extLst>
+                        <a:ext uri="{28A0092B-C50C-407E-A947-70E740481C1C}">
+                          <a14:useLocalDpi xmlns:a14="http://schemas.microsoft.com/office/drawing/2010/main" val="0"/>
+                        </a:ext>
+                      </a:extLst>
+                    </a:blip>
+                    <a:stretch>
+                      <a:fillRect/>
+                    </a:stretch>
+                  </pic:blipFill>
+                  <pic:spPr>
+                    <a:xfrm>
+                      <a:off x="0" y="0"/>
+                      <a:ext cx="5334000" cy="2861987"/>
+                    </a:xfrm>
+                    <a:prstGeom prst="rect">
+                      <a:avLst/>
+                    </a:prstGeom>
+                  </pic:spPr>
+                </pic:pic>
+              </a:graphicData>
+            </a:graphic>
+          </wp:inline>
+        </w:drawing>
+      </w:r>
+    </w:p>
+    <w:p/>
+    <w:p>
+      <w:r>
+        <w:rPr>
+          <w:noProof/>
+        </w:rPr>
+        <w:drawing>
+          <wp:inline distT="0" distB="0" distL="0" distR="0" wp14:anchorId="5C8141D3" wp14:editId="53A9CF3F">
+            <wp:extent cx="5334000" cy="2834132"/>
+            <wp:effectExtent l="0" t="0" r="0" b="4445"/>
+            <wp:docPr id="2984802" name="Picture 14"/>
+            <wp:cNvGraphicFramePr>
+              <a:graphicFrameLocks xmlns:a="http://schemas.openxmlformats.org/drawingml/2006/main" noChangeAspect="1"/>
+            </wp:cNvGraphicFramePr>
+            <a:graphic xmlns:a="http://schemas.openxmlformats.org/drawingml/2006/main">
+              <a:graphicData uri="http://schemas.openxmlformats.org/drawingml/2006/picture">
+                <pic:pic xmlns:pic="http://schemas.openxmlformats.org/drawingml/2006/picture">
+                  <pic:nvPicPr>
+                    <pic:cNvPr id="2984802" name=""/>
+                    <pic:cNvPicPr/>
+                  </pic:nvPicPr>
+                  <pic:blipFill>
+                    <a:blip r:embed="rId25" cstate="print">
+                      <a:extLst>
+                        <a:ext uri="{28A0092B-C50C-407E-A947-70E740481C1C}">
+                          <a14:useLocalDpi xmlns:a14="http://schemas.microsoft.com/office/drawing/2010/main" val="0"/>
+                        </a:ext>
+                      </a:extLst>
+                    </a:blip>
+                    <a:stretch>
+                      <a:fillRect/>
+                    </a:stretch>
+                  </pic:blipFill>
+                  <pic:spPr>
+                    <a:xfrm>
+                      <a:off x="0" y="0"/>
+                      <a:ext cx="5334000" cy="2834132"/>
+                    </a:xfrm>
+                    <a:prstGeom prst="rect">
+                      <a:avLst/>
+                    </a:prstGeom>
+                  </pic:spPr>
+                </pic:pic>
+              </a:graphicData>
+            </a:graphic>
+          </wp:inline>
+        </w:drawing>
+      </w:r>
+    </w:p>
+    <w:p/>
+    <w:p>
+      <w:r>
+        <w:rPr>
+          <w:noProof/>
+        </w:rPr>
+        <w:lastRenderedPageBreak/>
+        <w:drawing>
+          <wp:inline distT="0" distB="0" distL="0" distR="0" wp14:anchorId="1EFA47C3" wp14:editId="30F57582">
+            <wp:extent cx="5334000" cy="2859024"/>
+            <wp:effectExtent l="0" t="0" r="0" b="0"/>
+            <wp:docPr id="186290466" name="Picture 13"/>
+            <wp:cNvGraphicFramePr>
+              <a:graphicFrameLocks xmlns:a="http://schemas.openxmlformats.org/drawingml/2006/main" noChangeAspect="1"/>
+            </wp:cNvGraphicFramePr>
+            <a:graphic xmlns:a="http://schemas.openxmlformats.org/drawingml/2006/main">
+              <a:graphicData uri="http://schemas.openxmlformats.org/drawingml/2006/picture">
+                <pic:pic xmlns:pic="http://schemas.openxmlformats.org/drawingml/2006/picture">
+                  <pic:nvPicPr>
+                    <pic:cNvPr id="186290466" name=""/>
+                    <pic:cNvPicPr/>
+                  </pic:nvPicPr>
+                  <pic:blipFill>
+                    <a:blip r:embed="rId26" cstate="print">
+                      <a:extLst>
+                        <a:ext uri="{28A0092B-C50C-407E-A947-70E740481C1C}">
+                          <a14:useLocalDpi xmlns:a14="http://schemas.microsoft.com/office/drawing/2010/main" val="0"/>
+                        </a:ext>
+                      </a:extLst>
+                    </a:blip>
+                    <a:stretch>
+                      <a:fillRect/>
+                    </a:stretch>
+                  </pic:blipFill>
+                  <pic:spPr>
+                    <a:xfrm>
+                      <a:off x="0" y="0"/>
+                      <a:ext cx="5334000" cy="2859024"/>
+                    </a:xfrm>
+                    <a:prstGeom prst="rect">
+                      <a:avLst/>
+                    </a:prstGeom>
+                  </pic:spPr>
+                </pic:pic>
+              </a:graphicData>
+            </a:graphic>
+          </wp:inline>
+        </w:drawing>
+      </w:r>
+    </w:p>
+    <w:p/>
+    <w:p>
+      <w:r>
+        <w:rPr>
+          <w:noProof/>
+        </w:rPr>
+        <w:drawing>
+          <wp:inline distT="0" distB="0" distL="0" distR="0" wp14:anchorId="4D8A47FE" wp14:editId="013D8A76">
+            <wp:extent cx="5334000" cy="2850727"/>
+            <wp:effectExtent l="0" t="0" r="0" b="6985"/>
+            <wp:docPr id="1472171324" name="Picture 12"/>
+            <wp:cNvGraphicFramePr>
+              <a:graphicFrameLocks xmlns:a="http://schemas.openxmlformats.org/drawingml/2006/main" noChangeAspect="1"/>
+            </wp:cNvGraphicFramePr>
+            <a:graphic xmlns:a="http://schemas.openxmlformats.org/drawingml/2006/main">
+              <a:graphicData uri="http://schemas.openxmlformats.org/drawingml/2006/picture">
+                <pic:pic xmlns:pic="http://schemas.openxmlformats.org/drawingml/2006/picture">
+                  <pic:nvPicPr>
+                    <pic:cNvPr id="1472171324" name=""/>
+                    <pic:cNvPicPr/>
+                  </pic:nvPicPr>
+                  <pic:blipFill>
+                    <a:blip r:embed="rId27" cstate="print">
+                      <a:extLst>
+                        <a:ext uri="{28A0092B-C50C-407E-A947-70E740481C1C}">
+                          <a14:useLocalDpi xmlns:a14="http://schemas.microsoft.com/office/drawing/2010/main" val="0"/>
+                        </a:ext>
+                      </a:extLst>
+                    </a:blip>
+                    <a:stretch>
+                      <a:fillRect/>
+                    </a:stretch>
+                  </pic:blipFill>
+                  <pic:spPr>
+                    <a:xfrm>
+                      <a:off x="0" y="0"/>
+                      <a:ext cx="5334000" cy="2850727"/>
+                    </a:xfrm>
+                    <a:prstGeom prst="rect">
+                      <a:avLst/>
+                    </a:prstGeom>
+                  </pic:spPr>
+                </pic:pic>
+              </a:graphicData>
+            </a:graphic>
+          </wp:inline>
+        </w:drawing>
+      </w:r>
+    </w:p>
+    <w:p/>
+    <w:p>
+      <w:r>
+        <w:rPr>
+          <w:noProof/>
+        </w:rPr>
+        <w:lastRenderedPageBreak/>
+        <w:drawing>
+          <wp:inline distT="0" distB="0" distL="0" distR="0" wp14:anchorId="3B9F7E2E" wp14:editId="6D30B931">
+            <wp:extent cx="5334000" cy="2850727"/>
+            <wp:effectExtent l="0" t="0" r="0" b="6985"/>
+            <wp:docPr id="775680071" name="Picture 11"/>
+            <wp:cNvGraphicFramePr>
+              <a:graphicFrameLocks xmlns:a="http://schemas.openxmlformats.org/drawingml/2006/main" noChangeAspect="1"/>
+            </wp:cNvGraphicFramePr>
+            <a:graphic xmlns:a="http://schemas.openxmlformats.org/drawingml/2006/main">
+              <a:graphicData uri="http://schemas.openxmlformats.org/drawingml/2006/picture">
+                <pic:pic xmlns:pic="http://schemas.openxmlformats.org/drawingml/2006/picture">
+                  <pic:nvPicPr>
+                    <pic:cNvPr id="775680071" name=""/>
+                    <pic:cNvPicPr/>
+                  </pic:nvPicPr>
+                  <pic:blipFill>
+                    <a:blip r:embed="rId28" cstate="print">
+                      <a:extLst>
+                        <a:ext uri="{28A0092B-C50C-407E-A947-70E740481C1C}">
+                          <a14:useLocalDpi xmlns:a14="http://schemas.microsoft.com/office/drawing/2010/main" val="0"/>
+                        </a:ext>
+                      </a:extLst>
+                    </a:blip>
+                    <a:stretch>
+                      <a:fillRect/>
+                    </a:stretch>
+                  </pic:blipFill>
+                  <pic:spPr>
+                    <a:xfrm>
+                      <a:off x="0" y="0"/>
+                      <a:ext cx="5334000" cy="2850727"/>
+                    </a:xfrm>
+                    <a:prstGeom prst="rect">
+                      <a:avLst/>
+                    </a:prstGeom>
+                  </pic:spPr>
+                </pic:pic>
+              </a:graphicData>
+            </a:graphic>
+          </wp:inline>
+        </w:drawing>
+      </w:r>
+    </w:p>
+    <w:p/>
+    <w:p>
+      <w:r>
+        <w:rPr>
+          <w:noProof/>
+        </w:rPr>
+        <w:drawing>
+          <wp:inline distT="0" distB="0" distL="0" distR="0" wp14:anchorId="73CA01E4" wp14:editId="316AE71B">
+            <wp:extent cx="5334000" cy="2873841"/>
+            <wp:effectExtent l="0" t="0" r="0" b="3175"/>
+            <wp:docPr id="1137513282" name="Picture 10"/>
+            <wp:cNvGraphicFramePr>
+              <a:graphicFrameLocks xmlns:a="http://schemas.openxmlformats.org/drawingml/2006/main" noChangeAspect="1"/>
+            </wp:cNvGraphicFramePr>
+            <a:graphic xmlns:a="http://schemas.openxmlformats.org/drawingml/2006/main">
+              <a:graphicData uri="http://schemas.openxmlformats.org/drawingml/2006/picture">
+                <pic:pic xmlns:pic="http://schemas.openxmlformats.org/drawingml/2006/picture">
+                  <pic:nvPicPr>
+                    <pic:cNvPr id="1137513282" name=""/>
+                    <pic:cNvPicPr/>
+                  </pic:nvPicPr>
+                  <pic:blipFill>
+                    <a:blip r:embed="rId29" cstate="print">
+                      <a:extLst>
+                        <a:ext uri="{28A0092B-C50C-407E-A947-70E740481C1C}">
+                          <a14:useLocalDpi xmlns:a14="http://schemas.microsoft.com/office/drawing/2010/main" val="0"/>
+                        </a:ext>
+                      </a:extLst>
+                    </a:blip>
+                    <a:stretch>
+                      <a:fillRect/>
+                    </a:stretch>
+                  </pic:blipFill>
+                  <pic:spPr>
+                    <a:xfrm>
+                      <a:off x="0" y="0"/>
+                      <a:ext cx="5334000" cy="2873841"/>
+                    </a:xfrm>
+                    <a:prstGeom prst="rect">
+                      <a:avLst/>
+                    </a:prstGeom>
+                  </pic:spPr>
+                </pic:pic>
+              </a:graphicData>
+            </a:graphic>
+          </wp:inline>
+        </w:drawing>
+      </w:r>
+    </w:p>
+    <w:p/>
+    <w:p>
+      <w:r>
+        <w:rPr>
+          <w:noProof/>
+        </w:rPr>
+        <w:lastRenderedPageBreak/>
+        <w:drawing>
+          <wp:inline distT="0" distB="0" distL="0" distR="0" wp14:anchorId="701D6845" wp14:editId="48CE67A4">
+            <wp:extent cx="5334000" cy="2856061"/>
+            <wp:effectExtent l="0" t="0" r="0" b="1905"/>
+            <wp:docPr id="392809353" name="Picture 9"/>
+            <wp:cNvGraphicFramePr>
+              <a:graphicFrameLocks xmlns:a="http://schemas.openxmlformats.org/drawingml/2006/main" noChangeAspect="1"/>
+            </wp:cNvGraphicFramePr>
+            <a:graphic xmlns:a="http://schemas.openxmlformats.org/drawingml/2006/main">
+              <a:graphicData uri="http://schemas.openxmlformats.org/drawingml/2006/picture">
+                <pic:pic xmlns:pic="http://schemas.openxmlformats.org/drawingml/2006/picture">
+                  <pic:nvPicPr>
+                    <pic:cNvPr id="392809353" name=""/>
+                    <pic:cNvPicPr/>
+                  </pic:nvPicPr>
+                  <pic:blipFill>
+                    <a:blip r:embed="rId30" cstate="print">
+                      <a:extLst>
+                        <a:ext uri="{28A0092B-C50C-407E-A947-70E740481C1C}">
+                          <a14:useLocalDpi xmlns:a14="http://schemas.microsoft.com/office/drawing/2010/main" val="0"/>
+                        </a:ext>
+                      </a:extLst>
+                    </a:blip>
+                    <a:stretch>
+                      <a:fillRect/>
+                    </a:stretch>
+                  </pic:blipFill>
+                  <pic:spPr>
+                    <a:xfrm>
+                      <a:off x="0" y="0"/>
+                      <a:ext cx="5334000" cy="2856061"/>
+                    </a:xfrm>
+                    <a:prstGeom prst="rect">
+                      <a:avLst/>
+                    </a:prstGeom>
+                  </pic:spPr>
+                </pic:pic>
+              </a:graphicData>
+            </a:graphic>
+          </wp:inline>
+        </w:drawing>
+      </w:r>
+    </w:p>
+    <w:p/>
+    <w:p>
+      <w:r>
+        <w:rPr>
+          <w:noProof/>
+        </w:rPr>
+        <w:drawing>
+          <wp:inline distT="0" distB="0" distL="0" distR="0" wp14:anchorId="14C9B7A5" wp14:editId="5ECBBAE9">
+            <wp:extent cx="5334000" cy="2853690"/>
+            <wp:effectExtent l="0" t="0" r="0" b="3810"/>
+            <wp:docPr id="231558410" name="Picture 8"/>
+            <wp:cNvGraphicFramePr>
+              <a:graphicFrameLocks xmlns:a="http://schemas.openxmlformats.org/drawingml/2006/main" noChangeAspect="1"/>
+            </wp:cNvGraphicFramePr>
+            <a:graphic xmlns:a="http://schemas.openxmlformats.org/drawingml/2006/main">
+              <a:graphicData uri="http://schemas.openxmlformats.org/drawingml/2006/picture">
+                <pic:pic xmlns:pic="http://schemas.openxmlformats.org/drawingml/2006/picture">
+                  <pic:nvPicPr>
+                    <pic:cNvPr id="231558410" name=""/>
+                    <pic:cNvPicPr/>
+                  </pic:nvPicPr>
+                  <pic:blipFill>
+                    <a:blip r:embed="rId31" cstate="print">
+                      <a:extLst>
+                        <a:ext uri="{28A0092B-C50C-407E-A947-70E740481C1C}">
+                          <a14:useLocalDpi xmlns:a14="http://schemas.microsoft.com/office/drawing/2010/main" val="0"/>
+                        </a:ext>
+                      </a:extLst>
+                    </a:blip>
+                    <a:stretch>
+                      <a:fillRect/>
+                    </a:stretch>
+                  </pic:blipFill>
+                  <pic:spPr>
+                    <a:xfrm>
+                      <a:off x="0" y="0"/>
+                      <a:ext cx="5334000" cy="2853690"/>
+                    </a:xfrm>
+                    <a:prstGeom prst="rect">
+                      <a:avLst/>
+                    </a:prstGeom>
+                  </pic:spPr>
+                </pic:pic>
+              </a:graphicData>
+            </a:graphic>
+          </wp:inline>
+        </w:drawing>
+      </w:r>
+    </w:p>
+    <w:p/>
+    <w:p>
+      <w:r>
+        <w:rPr>
+          <w:noProof/>
+        </w:rPr>
+        <w:lastRenderedPageBreak/>
+        <w:drawing>
+          <wp:inline distT="0" distB="0" distL="0" distR="0" wp14:anchorId="6F961963" wp14:editId="322C0BC1">
+            <wp:extent cx="5334000" cy="2866136"/>
+            <wp:effectExtent l="0" t="0" r="0" b="0"/>
+            <wp:docPr id="2037957742" name="Picture 7"/>
+            <wp:cNvGraphicFramePr>
+              <a:graphicFrameLocks xmlns:a="http://schemas.openxmlformats.org/drawingml/2006/main" noChangeAspect="1"/>
+            </wp:cNvGraphicFramePr>
+            <a:graphic xmlns:a="http://schemas.openxmlformats.org/drawingml/2006/main">
+              <a:graphicData uri="http://schemas.openxmlformats.org/drawingml/2006/picture">
+                <pic:pic xmlns:pic="http://schemas.openxmlformats.org/drawingml/2006/picture">
+                  <pic:nvPicPr>
+                    <pic:cNvPr id="2037957742" name=""/>
+                    <pic:cNvPicPr/>
+                  </pic:nvPicPr>
+                  <pic:blipFill>
+                    <a:blip r:embed="rId32" cstate="print">
+                      <a:extLst>
+                        <a:ext uri="{28A0092B-C50C-407E-A947-70E740481C1C}">
+                          <a14:useLocalDpi xmlns:a14="http://schemas.microsoft.com/office/drawing/2010/main" val="0"/>
+                        </a:ext>
+                      </a:extLst>
+                    </a:blip>
+                    <a:stretch>
+                      <a:fillRect/>
+                    </a:stretch>
+                  </pic:blipFill>
+                  <pic:spPr>
+                    <a:xfrm>
+                      <a:off x="0" y="0"/>
+                      <a:ext cx="5334000" cy="2866136"/>
+                    </a:xfrm>
+                    <a:prstGeom prst="rect">
+                      <a:avLst/>
+                    </a:prstGeom>
+                  </pic:spPr>
+                </pic:pic>
+              </a:graphicData>
+            </a:graphic>
+          </wp:inline>
+        </w:drawing>
+      </w:r>
+    </w:p>
+    <w:p/>
+    <w:p>
+      <w:r>
+        <w:rPr>
+          <w:noProof/>
+        </w:rPr>
+        <w:drawing>
+          <wp:inline distT="0" distB="0" distL="0" distR="0" wp14:anchorId="14E91590" wp14:editId="5C833F9B">
+            <wp:extent cx="5334000" cy="2866136"/>
+            <wp:effectExtent l="0" t="0" r="0" b="0"/>
+            <wp:docPr id="1797213203" name="Picture 6"/>
+            <wp:cNvGraphicFramePr>
+              <a:graphicFrameLocks xmlns:a="http://schemas.openxmlformats.org/drawingml/2006/main" noChangeAspect="1"/>
+            </wp:cNvGraphicFramePr>
+            <a:graphic xmlns:a="http://schemas.openxmlformats.org/drawingml/2006/main">
+              <a:graphicData uri="http://schemas.openxmlformats.org/drawingml/2006/picture">
+                <pic:pic xmlns:pic="http://schemas.openxmlformats.org/drawingml/2006/picture">
+                  <pic:nvPicPr>
+                    <pic:cNvPr id="1797213203" name=""/>
+                    <pic:cNvPicPr/>
+                  </pic:nvPicPr>
+                  <pic:blipFill>
+                    <a:blip r:embed="rId33" cstate="print">
+                      <a:extLst>
+                        <a:ext uri="{28A0092B-C50C-407E-A947-70E740481C1C}">
+                          <a14:useLocalDpi xmlns:a14="http://schemas.microsoft.com/office/drawing/2010/main" val="0"/>
+                        </a:ext>
+                      </a:extLst>
+                    </a:blip>
+                    <a:stretch>
+                      <a:fillRect/>
+                    </a:stretch>
+                  </pic:blipFill>
+                  <pic:spPr>
+                    <a:xfrm>
+                      <a:off x="0" y="0"/>
+                      <a:ext cx="5334000" cy="2866136"/>
+                    </a:xfrm>
+                    <a:prstGeom prst="rect">
+                      <a:avLst/>
+                    </a:prstGeom>
+                  </pic:spPr>
+                </pic:pic>
+              </a:graphicData>
+            </a:graphic>
+          </wp:inline>
+        </w:drawing>
+      </w:r>
+    </w:p>
+    <w:p/>
+    <w:p>
+      <w:r>
+        <w:rPr>
+          <w:noProof/>
+        </w:rPr>
+        <w:lastRenderedPageBreak/>
+        <w:drawing>
+          <wp:inline distT="0" distB="0" distL="0" distR="0" wp14:anchorId="0C064CE7" wp14:editId="1856FF0C">
+            <wp:extent cx="5334000" cy="2856061"/>
+            <wp:effectExtent l="0" t="0" r="0" b="1905"/>
+            <wp:docPr id="1158350721" name="Picture 5"/>
+            <wp:cNvGraphicFramePr>
+              <a:graphicFrameLocks xmlns:a="http://schemas.openxmlformats.org/drawingml/2006/main" noChangeAspect="1"/>
+            </wp:cNvGraphicFramePr>
+            <a:graphic xmlns:a="http://schemas.openxmlformats.org/drawingml/2006/main">
+              <a:graphicData uri="http://schemas.openxmlformats.org/drawingml/2006/picture">
+                <pic:pic xmlns:pic="http://schemas.openxmlformats.org/drawingml/2006/picture">
+                  <pic:nvPicPr>
+                    <pic:cNvPr id="1158350721" name=""/>
+                    <pic:cNvPicPr/>
+                  </pic:nvPicPr>
+                  <pic:blipFill>
+                    <a:blip r:embed="rId34" cstate="print">
+                      <a:extLst>
+                        <a:ext uri="{28A0092B-C50C-407E-A947-70E740481C1C}">
+                          <a14:useLocalDpi xmlns:a14="http://schemas.microsoft.com/office/drawing/2010/main" val="0"/>
+                        </a:ext>
+                      </a:extLst>
+                    </a:blip>
+                    <a:stretch>
+                      <a:fillRect/>
+                    </a:stretch>
+                  </pic:blipFill>
+                  <pic:spPr>
+                    <a:xfrm>
+                      <a:off x="0" y="0"/>
+                      <a:ext cx="5334000" cy="2856061"/>
+                    </a:xfrm>
+                    <a:prstGeom prst="rect">
+                      <a:avLst/>
+                    </a:prstGeom>
+                  </pic:spPr>
+                </pic:pic>
+              </a:graphicData>
+            </a:graphic>
+          </wp:inline>
+        </w:drawing>
+      </w:r>
+    </w:p>
+    <w:p/>
+    <w:p>
+      <w:r>
+        <w:rPr>
+          <w:noProof/>
+        </w:rPr>
+        <w:drawing>
+          <wp:inline distT="0" distB="0" distL="0" distR="0" wp14:anchorId="4515E4C2" wp14:editId="308C7AFD">
+            <wp:extent cx="5334000" cy="2856653"/>
+            <wp:effectExtent l="0" t="0" r="0" b="1270"/>
+            <wp:docPr id="1504313374" name="Picture 4"/>
+            <wp:cNvGraphicFramePr>
+              <a:graphicFrameLocks xmlns:a="http://schemas.openxmlformats.org/drawingml/2006/main" noChangeAspect="1"/>
+            </wp:cNvGraphicFramePr>
+            <a:graphic xmlns:a="http://schemas.openxmlformats.org/drawingml/2006/main">
+              <a:graphicData uri="http://schemas.openxmlformats.org/drawingml/2006/picture">
+                <pic:pic xmlns:pic="http://schemas.openxmlformats.org/drawingml/2006/picture">
+                  <pic:nvPicPr>
+                    <pic:cNvPr id="1504313374" name=""/>
+                    <pic:cNvPicPr/>
+                  </pic:nvPicPr>
+                  <pic:blipFill>
+                    <a:blip r:embed="rId35" cstate="print">
+                      <a:extLst>
+                        <a:ext uri="{28A0092B-C50C-407E-A947-70E740481C1C}">
+                          <a14:useLocalDpi xmlns:a14="http://schemas.microsoft.com/office/drawing/2010/main" val="0"/>
+                        </a:ext>
+                      </a:extLst>
+                    </a:blip>
+                    <a:stretch>
+                      <a:fillRect/>
+                    </a:stretch>
+                  </pic:blipFill>
+                  <pic:spPr>
+                    <a:xfrm>
+                      <a:off x="0" y="0"/>
+                      <a:ext cx="5334000" cy="2856653"/>
+                    </a:xfrm>
+                    <a:prstGeom prst="rect">
+                      <a:avLst/>
+                    </a:prstGeom>
+                  </pic:spPr>
+                </pic:pic>
+              </a:graphicData>
+            </a:graphic>
+          </wp:inline>
+        </w:drawing>
+      </w:r>
+    </w:p>
+    <w:p/>
+    <w:p>
+      <w:r>
+        <w:rPr>
+          <w:noProof/>
+        </w:rPr>
+        <w:lastRenderedPageBreak/>
+        <w:drawing>
+          <wp:inline distT="0" distB="0" distL="0" distR="0" wp14:anchorId="285AAC3D" wp14:editId="0FE07245">
+            <wp:extent cx="5334000" cy="2860209"/>
+            <wp:effectExtent l="0" t="0" r="0" b="0"/>
+            <wp:docPr id="244583896" name="Picture 3"/>
+            <wp:cNvGraphicFramePr>
+              <a:graphicFrameLocks xmlns:a="http://schemas.openxmlformats.org/drawingml/2006/main" noChangeAspect="1"/>
+            </wp:cNvGraphicFramePr>
+            <a:graphic xmlns:a="http://schemas.openxmlformats.org/drawingml/2006/main">
+              <a:graphicData uri="http://schemas.openxmlformats.org/drawingml/2006/picture">
+                <pic:pic xmlns:pic="http://schemas.openxmlformats.org/drawingml/2006/picture">
+                  <pic:nvPicPr>
+                    <pic:cNvPr id="244583896" name=""/>
+                    <pic:cNvPicPr/>
+                  </pic:nvPicPr>
+                  <pic:blipFill>
+                    <a:blip r:embed="rId36" cstate="print">
+                      <a:extLst>
+                        <a:ext uri="{28A0092B-C50C-407E-A947-70E740481C1C}">
+                          <a14:useLocalDpi xmlns:a14="http://schemas.microsoft.com/office/drawing/2010/main" val="0"/>
+                        </a:ext>
+                      </a:extLst>
+                    </a:blip>
+                    <a:stretch>
+                      <a:fillRect/>
+                    </a:stretch>
+                  </pic:blipFill>
+                  <pic:spPr>
+                    <a:xfrm>
+                      <a:off x="0" y="0"/>
+                      <a:ext cx="5334000" cy="2860209"/>
+                    </a:xfrm>
+                    <a:prstGeom prst="rect">
+                      <a:avLst/>
+                    </a:prstGeom>
+                  </pic:spPr>
+                </pic:pic>
+              </a:graphicData>
+            </a:graphic>
+          </wp:inline>
+        </w:drawing>
+      </w:r>
+    </w:p>
+    <w:p/>
+    <w:p>
+      <w:r>
+        <w:rPr>
+          <w:noProof/>
+        </w:rPr>
+        <w:drawing>
+          <wp:inline distT="0" distB="0" distL="0" distR="0" wp14:anchorId="35C84DAB" wp14:editId="6DAC8E6A">
+            <wp:extent cx="5334000" cy="2868507"/>
+            <wp:effectExtent l="0" t="0" r="0" b="8255"/>
+            <wp:docPr id="1429167751" name="Picture 2"/>
+            <wp:cNvGraphicFramePr>
+              <a:graphicFrameLocks xmlns:a="http://schemas.openxmlformats.org/drawingml/2006/main" noChangeAspect="1"/>
+            </wp:cNvGraphicFramePr>
+            <a:graphic xmlns:a="http://schemas.openxmlformats.org/drawingml/2006/main">
+              <a:graphicData uri="http://schemas.openxmlformats.org/drawingml/2006/picture">
+                <pic:pic xmlns:pic="http://schemas.openxmlformats.org/drawingml/2006/picture">
+                  <pic:nvPicPr>
+                    <pic:cNvPr id="1429167751" name=""/>
+                    <pic:cNvPicPr/>
+                  </pic:nvPicPr>
+                  <pic:blipFill>
+                    <a:blip r:embed="rId37" cstate="print">
+                      <a:extLst>
+                        <a:ext uri="{28A0092B-C50C-407E-A947-70E740481C1C}">
+                          <a14:useLocalDpi xmlns:a14="http://schemas.microsoft.com/office/drawing/2010/main" val="0"/>
+                        </a:ext>
+                      </a:extLst>
+                    </a:blip>
+                    <a:stretch>
+                      <a:fillRect/>
+                    </a:stretch>
+                  </pic:blipFill>
+                  <pic:spPr>
+                    <a:xfrm>
+                      <a:off x="0" y="0"/>
+                      <a:ext cx="5334000" cy="2868507"/>
+                    </a:xfrm>
+                    <a:prstGeom prst="rect">
+                      <a:avLst/>
+                    </a:prstGeom>
+                  </pic:spPr>
+                </pic:pic>
+              </a:graphicData>
+            </a:graphic>
+          </wp:inline>
+        </w:drawing>
+      </w:r>
+    </w:p>
+    <w:p/>
+    <w:p>
+      <w:r>
+        <w:rPr>
+          <w:noProof/>
+        </w:rPr>
+        <w:lastRenderedPageBreak/>
+        <w:drawing>
+          <wp:inline distT="0" distB="0" distL="0" distR="0" wp14:anchorId="22191274" wp14:editId="4C943B1C">
+            <wp:extent cx="5334000" cy="2864358"/>
+            <wp:effectExtent l="0" t="0" r="0" b="0"/>
+            <wp:docPr id="47709248" name="Picture 1"/>
+            <wp:cNvGraphicFramePr>
+              <a:graphicFrameLocks xmlns:a="http://schemas.openxmlformats.org/drawingml/2006/main" noChangeAspect="1"/>
+            </wp:cNvGraphicFramePr>
+            <a:graphic xmlns:a="http://schemas.openxmlformats.org/drawingml/2006/main">
+              <a:graphicData uri="http://schemas.openxmlformats.org/drawingml/2006/picture">
+                <pic:pic xmlns:pic="http://schemas.openxmlformats.org/drawingml/2006/picture">
+                  <pic:nvPicPr>
+                    <pic:cNvPr id="47709248" name=""/>
+                    <pic:cNvPicPr/>
+                  </pic:nvPicPr>
+                  <pic:blipFill>
+                    <a:blip r:embed="rId38" cstate="print">
+                      <a:extLst>
+                        <a:ext uri="{28A0092B-C50C-407E-A947-70E740481C1C}">
+                          <a14:useLocalDpi xmlns:a14="http://schemas.microsoft.com/office/drawing/2010/main" val="0"/>
+                        </a:ext>
+                      </a:extLst>
+                    </a:blip>
+                    <a:stretch>
+                      <a:fillRect/>
+                    </a:stretch>
+                  </pic:blipFill>
+                  <pic:spPr>
+                    <a:xfrm>
+                      <a:off x="0" y="0"/>
+                      <a:ext cx="5334000" cy="2864358"/>
+                    </a:xfrm>
+                    <a:prstGeom prst="rect">
+                      <a:avLst/>
+                    </a:prstGeom>
+                  </pic:spPr>
+                </pic:pic>
+              </a:graphicData>
+            </a:graphic>
+          </wp:inline>
+        </w:drawing>
+      </w:r>
+    </w:p>
+    <w:p/>
+    <w:p/>
     <w:sectPr>
       <w:pgSz w:w="12240" w:h="15840"/>
       <w:pgMar w:top="1440" w:right="1440" w:bottom="1440" w:left="1800" w:header="720" w:footer="720" w:gutter="0"/>

</xml_diff>

<commit_message>
Document login/authentication and user management in technical report
Adds Section 6.4, 7.9/7.10 class descriptions, GUI/OOP/challenges/
conclusion/recommendations updates, and a login-screen screenshot.
</commit_message>
<xml_diff>
--- a/HospitalGUI_Technical_Report.docx
+++ b/HospitalGUI_Technical_Report.docx
@@ -242,7 +242,7 @@
       <w:r>
         <w:fldChar w:fldCharType="separate"/>
       </w:r>
-      <w:hyperlink w:anchor="_Toc234320805" w:history="1">
+      <w:hyperlink w:anchor="_Toc234343931" w:history="1">
         <w:r>
           <w:rPr>
             <w:rStyle w:val="Hyperlink"/>
@@ -266,7 +266,7 @@
           <w:rPr>
             <w:noProof/>
           </w:rPr>
-          <w:instrText xml:space="preserve"> PAGEREF _Toc234320805 \h </w:instrText>
+          <w:instrText xml:space="preserve"> PAGEREF _Toc234343931 \h </w:instrText>
         </w:r>
         <w:r>
           <w:rPr>
@@ -305,7 +305,7 @@
           <w:sz w:val="24"/>
         </w:rPr>
       </w:pPr>
-      <w:hyperlink w:anchor="_Toc234320806" w:history="1">
+      <w:hyperlink w:anchor="_Toc234343932" w:history="1">
         <w:r>
           <w:rPr>
             <w:rStyle w:val="Hyperlink"/>
@@ -329,7 +329,7 @@
           <w:rPr>
             <w:noProof/>
           </w:rPr>
-          <w:instrText xml:space="preserve"> PAGEREF _Toc234320806 \h </w:instrText>
+          <w:instrText xml:space="preserve"> PAGEREF _Toc234343932 \h </w:instrText>
         </w:r>
         <w:r>
           <w:rPr>
@@ -368,7 +368,7 @@
           <w:sz w:val="24"/>
         </w:rPr>
       </w:pPr>
-      <w:hyperlink w:anchor="_Toc234320807" w:history="1">
+      <w:hyperlink w:anchor="_Toc234343933" w:history="1">
         <w:r>
           <w:rPr>
             <w:rStyle w:val="Hyperlink"/>
@@ -392,7 +392,7 @@
           <w:rPr>
             <w:noProof/>
           </w:rPr>
-          <w:instrText xml:space="preserve"> PAGEREF _Toc234320807 \h </w:instrText>
+          <w:instrText xml:space="preserve"> PAGEREF _Toc234343933 \h </w:instrText>
         </w:r>
         <w:r>
           <w:rPr>
@@ -431,7 +431,7 @@
           <w:sz w:val="24"/>
         </w:rPr>
       </w:pPr>
-      <w:hyperlink w:anchor="_Toc234320808" w:history="1">
+      <w:hyperlink w:anchor="_Toc234343934" w:history="1">
         <w:r>
           <w:rPr>
             <w:rStyle w:val="Hyperlink"/>
@@ -455,7 +455,7 @@
           <w:rPr>
             <w:noProof/>
           </w:rPr>
-          <w:instrText xml:space="preserve"> PAGEREF _Toc234320808 \h </w:instrText>
+          <w:instrText xml:space="preserve"> PAGEREF _Toc234343934 \h </w:instrText>
         </w:r>
         <w:r>
           <w:rPr>
@@ -494,7 +494,7 @@
           <w:sz w:val="24"/>
         </w:rPr>
       </w:pPr>
-      <w:hyperlink w:anchor="_Toc234320809" w:history="1">
+      <w:hyperlink w:anchor="_Toc234343935" w:history="1">
         <w:r>
           <w:rPr>
             <w:rStyle w:val="Hyperlink"/>
@@ -518,7 +518,7 @@
           <w:rPr>
             <w:noProof/>
           </w:rPr>
-          <w:instrText xml:space="preserve"> PAGEREF _Toc234320809 \h </w:instrText>
+          <w:instrText xml:space="preserve"> PAGEREF _Toc234343935 \h </w:instrText>
         </w:r>
         <w:r>
           <w:rPr>
@@ -557,7 +557,7 @@
           <w:sz w:val="24"/>
         </w:rPr>
       </w:pPr>
-      <w:hyperlink w:anchor="_Toc234320810" w:history="1">
+      <w:hyperlink w:anchor="_Toc234343936" w:history="1">
         <w:r>
           <w:rPr>
             <w:rStyle w:val="Hyperlink"/>
@@ -581,7 +581,7 @@
           <w:rPr>
             <w:noProof/>
           </w:rPr>
-          <w:instrText xml:space="preserve"> PAGEREF _Toc234320810 \h </w:instrText>
+          <w:instrText xml:space="preserve"> PAGEREF _Toc234343936 \h </w:instrText>
         </w:r>
         <w:r>
           <w:rPr>
@@ -620,7 +620,7 @@
           <w:sz w:val="24"/>
         </w:rPr>
       </w:pPr>
-      <w:hyperlink w:anchor="_Toc234320811" w:history="1">
+      <w:hyperlink w:anchor="_Toc234343937" w:history="1">
         <w:r>
           <w:rPr>
             <w:rStyle w:val="Hyperlink"/>
@@ -644,7 +644,7 @@
           <w:rPr>
             <w:noProof/>
           </w:rPr>
-          <w:instrText xml:space="preserve"> PAGEREF _Toc234320811 \h </w:instrText>
+          <w:instrText xml:space="preserve"> PAGEREF _Toc234343937 \h </w:instrText>
         </w:r>
         <w:r>
           <w:rPr>
@@ -683,7 +683,7 @@
           <w:sz w:val="24"/>
         </w:rPr>
       </w:pPr>
-      <w:hyperlink w:anchor="_Toc234320812" w:history="1">
+      <w:hyperlink w:anchor="_Toc234343938" w:history="1">
         <w:r>
           <w:rPr>
             <w:rStyle w:val="Hyperlink"/>
@@ -707,7 +707,7 @@
           <w:rPr>
             <w:noProof/>
           </w:rPr>
-          <w:instrText xml:space="preserve"> PAGEREF _Toc234320812 \h </w:instrText>
+          <w:instrText xml:space="preserve"> PAGEREF _Toc234343938 \h </w:instrText>
         </w:r>
         <w:r>
           <w:rPr>
@@ -746,7 +746,7 @@
           <w:sz w:val="24"/>
         </w:rPr>
       </w:pPr>
-      <w:hyperlink w:anchor="_Toc234320813" w:history="1">
+      <w:hyperlink w:anchor="_Toc234343939" w:history="1">
         <w:r>
           <w:rPr>
             <w:rStyle w:val="Hyperlink"/>
@@ -770,7 +770,7 @@
           <w:rPr>
             <w:noProof/>
           </w:rPr>
-          <w:instrText xml:space="preserve"> PAGEREF _Toc234320813 \h </w:instrText>
+          <w:instrText xml:space="preserve"> PAGEREF _Toc234343939 \h </w:instrText>
         </w:r>
         <w:r>
           <w:rPr>
@@ -809,7 +809,7 @@
           <w:sz w:val="24"/>
         </w:rPr>
       </w:pPr>
-      <w:hyperlink w:anchor="_Toc234320814" w:history="1">
+      <w:hyperlink w:anchor="_Toc234343940" w:history="1">
         <w:r>
           <w:rPr>
             <w:rStyle w:val="Hyperlink"/>
@@ -833,7 +833,7 @@
           <w:rPr>
             <w:noProof/>
           </w:rPr>
-          <w:instrText xml:space="preserve"> PAGEREF _Toc234320814 \h </w:instrText>
+          <w:instrText xml:space="preserve"> PAGEREF _Toc234343940 \h </w:instrText>
         </w:r>
         <w:r>
           <w:rPr>
@@ -872,7 +872,7 @@
           <w:sz w:val="24"/>
         </w:rPr>
       </w:pPr>
-      <w:hyperlink w:anchor="_Toc234320815" w:history="1">
+      <w:hyperlink w:anchor="_Toc234343941" w:history="1">
         <w:r>
           <w:rPr>
             <w:rStyle w:val="Hyperlink"/>
@@ -896,7 +896,7 @@
           <w:rPr>
             <w:noProof/>
           </w:rPr>
-          <w:instrText xml:space="preserve"> PAGEREF _Toc234320815 \h </w:instrText>
+          <w:instrText xml:space="preserve"> PAGEREF _Toc234343941 \h </w:instrText>
         </w:r>
         <w:r>
           <w:rPr>
@@ -935,7 +935,7 @@
           <w:sz w:val="24"/>
         </w:rPr>
       </w:pPr>
-      <w:hyperlink w:anchor="_Toc234320816" w:history="1">
+      <w:hyperlink w:anchor="_Toc234343942" w:history="1">
         <w:r>
           <w:rPr>
             <w:rStyle w:val="Hyperlink"/>
@@ -959,7 +959,7 @@
           <w:rPr>
             <w:noProof/>
           </w:rPr>
-          <w:instrText xml:space="preserve"> PAGEREF _Toc234320816 \h </w:instrText>
+          <w:instrText xml:space="preserve"> PAGEREF _Toc234343942 \h </w:instrText>
         </w:r>
         <w:r>
           <w:rPr>
@@ -998,7 +998,7 @@
           <w:sz w:val="24"/>
         </w:rPr>
       </w:pPr>
-      <w:hyperlink w:anchor="_Toc234320817" w:history="1">
+      <w:hyperlink w:anchor="_Toc234343943" w:history="1">
         <w:r>
           <w:rPr>
             <w:rStyle w:val="Hyperlink"/>
@@ -1022,7 +1022,7 @@
           <w:rPr>
             <w:noProof/>
           </w:rPr>
-          <w:instrText xml:space="preserve"> PAGEREF _Toc234320817 \h </w:instrText>
+          <w:instrText xml:space="preserve"> PAGEREF _Toc234343943 \h </w:instrText>
         </w:r>
         <w:r>
           <w:rPr>
@@ -1061,7 +1061,7 @@
           <w:sz w:val="24"/>
         </w:rPr>
       </w:pPr>
-      <w:hyperlink w:anchor="_Toc234320818" w:history="1">
+      <w:hyperlink w:anchor="_Toc234343944" w:history="1">
         <w:r>
           <w:rPr>
             <w:rStyle w:val="Hyperlink"/>
@@ -1085,7 +1085,7 @@
           <w:rPr>
             <w:noProof/>
           </w:rPr>
-          <w:instrText xml:space="preserve"> PAGEREF _Toc234320818 \h </w:instrText>
+          <w:instrText xml:space="preserve"> PAGEREF _Toc234343944 \h </w:instrText>
         </w:r>
         <w:r>
           <w:rPr>
@@ -1103,6 +1103,69 @@
             <w:noProof/>
           </w:rPr>
           <w:t>12</w:t>
+        </w:r>
+        <w:r>
+          <w:rPr>
+            <w:noProof/>
+          </w:rPr>
+          <w:fldChar w:fldCharType="end"/>
+        </w:r>
+      </w:hyperlink>
+    </w:p>
+    <w:p>
+      <w:pPr>
+        <w:pStyle w:val="TOC2"/>
+        <w:tabs>
+          <w:tab w:val="right" w:leader="dot" w:pos="8990"/>
+        </w:tabs>
+        <w:rPr>
+          <w:rFonts w:asciiTheme="minorHAnsi" w:eastAsiaTheme="minorEastAsia" w:hAnsiTheme="minorHAnsi" w:cstheme="minorBidi"/>
+          <w:noProof/>
+          <w:sz w:val="24"/>
+        </w:rPr>
+      </w:pPr>
+      <w:hyperlink w:anchor="_Toc234343945" w:history="1">
+        <w:r>
+          <w:rPr>
+            <w:rStyle w:val="Hyperlink"/>
+            <w:noProof/>
+          </w:rPr>
+          <w:t>6.4 Authentication and Access Control</w:t>
+        </w:r>
+        <w:r>
+          <w:rPr>
+            <w:noProof/>
+          </w:rPr>
+          <w:tab/>
+        </w:r>
+        <w:r>
+          <w:rPr>
+            <w:noProof/>
+          </w:rPr>
+          <w:fldChar w:fldCharType="begin"/>
+        </w:r>
+        <w:r>
+          <w:rPr>
+            <w:noProof/>
+          </w:rPr>
+          <w:instrText xml:space="preserve"> PAGEREF _Toc234343945 \h </w:instrText>
+        </w:r>
+        <w:r>
+          <w:rPr>
+            <w:noProof/>
+          </w:rPr>
+        </w:r>
+        <w:r>
+          <w:rPr>
+            <w:noProof/>
+          </w:rPr>
+          <w:fldChar w:fldCharType="separate"/>
+        </w:r>
+        <w:r>
+          <w:rPr>
+            <w:noProof/>
+          </w:rPr>
+          <w:t>13</w:t>
         </w:r>
         <w:r>
           <w:rPr>
@@ -1124,7 +1187,7 @@
           <w:sz w:val="24"/>
         </w:rPr>
       </w:pPr>
-      <w:hyperlink w:anchor="_Toc234320819" w:history="1">
+      <w:hyperlink w:anchor="_Toc234343946" w:history="1">
         <w:r>
           <w:rPr>
             <w:rStyle w:val="Hyperlink"/>
@@ -1148,7 +1211,7 @@
           <w:rPr>
             <w:noProof/>
           </w:rPr>
-          <w:instrText xml:space="preserve"> PAGEREF _Toc234320819 \h </w:instrText>
+          <w:instrText xml:space="preserve"> PAGEREF _Toc234343946 \h </w:instrText>
         </w:r>
         <w:r>
           <w:rPr>
@@ -1187,7 +1250,7 @@
           <w:sz w:val="24"/>
         </w:rPr>
       </w:pPr>
-      <w:hyperlink w:anchor="_Toc234320820" w:history="1">
+      <w:hyperlink w:anchor="_Toc234343947" w:history="1">
         <w:r>
           <w:rPr>
             <w:rStyle w:val="Hyperlink"/>
@@ -1211,7 +1274,7 @@
           <w:rPr>
             <w:noProof/>
           </w:rPr>
-          <w:instrText xml:space="preserve"> PAGEREF _Toc234320820 \h </w:instrText>
+          <w:instrText xml:space="preserve"> PAGEREF _Toc234343947 \h </w:instrText>
         </w:r>
         <w:r>
           <w:rPr>
@@ -1250,7 +1313,7 @@
           <w:sz w:val="24"/>
         </w:rPr>
       </w:pPr>
-      <w:hyperlink w:anchor="_Toc234320821" w:history="1">
+      <w:hyperlink w:anchor="_Toc234343948" w:history="1">
         <w:r>
           <w:rPr>
             <w:rStyle w:val="Hyperlink"/>
@@ -1274,7 +1337,7 @@
           <w:rPr>
             <w:noProof/>
           </w:rPr>
-          <w:instrText xml:space="preserve"> PAGEREF _Toc234320821 \h </w:instrText>
+          <w:instrText xml:space="preserve"> PAGEREF _Toc234343948 \h </w:instrText>
         </w:r>
         <w:r>
           <w:rPr>
@@ -1313,7 +1376,7 @@
           <w:sz w:val="24"/>
         </w:rPr>
       </w:pPr>
-      <w:hyperlink w:anchor="_Toc234320822" w:history="1">
+      <w:hyperlink w:anchor="_Toc234343949" w:history="1">
         <w:r>
           <w:rPr>
             <w:rStyle w:val="Hyperlink"/>
@@ -1337,7 +1400,7 @@
           <w:rPr>
             <w:noProof/>
           </w:rPr>
-          <w:instrText xml:space="preserve"> PAGEREF _Toc234320822 \h </w:instrText>
+          <w:instrText xml:space="preserve"> PAGEREF _Toc234343949 \h </w:instrText>
         </w:r>
         <w:r>
           <w:rPr>
@@ -1376,7 +1439,7 @@
           <w:sz w:val="24"/>
         </w:rPr>
       </w:pPr>
-      <w:hyperlink w:anchor="_Toc234320823" w:history="1">
+      <w:hyperlink w:anchor="_Toc234343950" w:history="1">
         <w:r>
           <w:rPr>
             <w:rStyle w:val="Hyperlink"/>
@@ -1400,7 +1463,7 @@
           <w:rPr>
             <w:noProof/>
           </w:rPr>
-          <w:instrText xml:space="preserve"> PAGEREF _Toc234320823 \h </w:instrText>
+          <w:instrText xml:space="preserve"> PAGEREF _Toc234343950 \h </w:instrText>
         </w:r>
         <w:r>
           <w:rPr>
@@ -1439,7 +1502,7 @@
           <w:sz w:val="24"/>
         </w:rPr>
       </w:pPr>
-      <w:hyperlink w:anchor="_Toc234320824" w:history="1">
+      <w:hyperlink w:anchor="_Toc234343951" w:history="1">
         <w:r>
           <w:rPr>
             <w:rStyle w:val="Hyperlink"/>
@@ -1463,7 +1526,7 @@
           <w:rPr>
             <w:noProof/>
           </w:rPr>
-          <w:instrText xml:space="preserve"> PAGEREF _Toc234320824 \h </w:instrText>
+          <w:instrText xml:space="preserve"> PAGEREF _Toc234343951 \h </w:instrText>
         </w:r>
         <w:r>
           <w:rPr>
@@ -1502,7 +1565,7 @@
           <w:sz w:val="24"/>
         </w:rPr>
       </w:pPr>
-      <w:hyperlink w:anchor="_Toc234320825" w:history="1">
+      <w:hyperlink w:anchor="_Toc234343952" w:history="1">
         <w:r>
           <w:rPr>
             <w:rStyle w:val="Hyperlink"/>
@@ -1526,7 +1589,7 @@
           <w:rPr>
             <w:noProof/>
           </w:rPr>
-          <w:instrText xml:space="preserve"> PAGEREF _Toc234320825 \h </w:instrText>
+          <w:instrText xml:space="preserve"> PAGEREF _Toc234343952 \h </w:instrText>
         </w:r>
         <w:r>
           <w:rPr>
@@ -1565,7 +1628,7 @@
           <w:sz w:val="24"/>
         </w:rPr>
       </w:pPr>
-      <w:hyperlink w:anchor="_Toc234320826" w:history="1">
+      <w:hyperlink w:anchor="_Toc234343953" w:history="1">
         <w:r>
           <w:rPr>
             <w:rStyle w:val="Hyperlink"/>
@@ -1589,7 +1652,7 @@
           <w:rPr>
             <w:noProof/>
           </w:rPr>
-          <w:instrText xml:space="preserve"> PAGEREF _Toc234320826 \h </w:instrText>
+          <w:instrText xml:space="preserve"> PAGEREF _Toc234343953 \h </w:instrText>
         </w:r>
         <w:r>
           <w:rPr>
@@ -1628,13 +1691,21 @@
           <w:sz w:val="24"/>
         </w:rPr>
       </w:pPr>
-      <w:hyperlink w:anchor="_Toc234320827" w:history="1">
+      <w:hyperlink w:anchor="_Toc234343954" w:history="1">
         <w:r>
           <w:rPr>
             <w:rStyle w:val="Hyperlink"/>
             <w:noProof/>
           </w:rPr>
-          <w:t>7.8 Model and Panel Classes</w:t>
+          <w:t>7.</w:t>
+        </w:r>
+        <w:r>
+          <w:rPr>
+            <w:rStyle w:val="Hyperlink"/>
+            <w:noProof/>
+          </w:rPr>
+          <w:lastRenderedPageBreak/>
+          <w:t>8 Model and Panel Classes</w:t>
         </w:r>
         <w:r>
           <w:rPr>
@@ -1652,7 +1723,133 @@
           <w:rPr>
             <w:noProof/>
           </w:rPr>
-          <w:instrText xml:space="preserve"> PAGEREF _Toc234320827 \h </w:instrText>
+          <w:instrText xml:space="preserve"> PAGEREF _Toc234343954 \h </w:instrText>
+        </w:r>
+        <w:r>
+          <w:rPr>
+            <w:noProof/>
+          </w:rPr>
+        </w:r>
+        <w:r>
+          <w:rPr>
+            <w:noProof/>
+          </w:rPr>
+          <w:fldChar w:fldCharType="separate"/>
+        </w:r>
+        <w:r>
+          <w:rPr>
+            <w:noProof/>
+          </w:rPr>
+          <w:t>17</w:t>
+        </w:r>
+        <w:r>
+          <w:rPr>
+            <w:noProof/>
+          </w:rPr>
+          <w:fldChar w:fldCharType="end"/>
+        </w:r>
+      </w:hyperlink>
+    </w:p>
+    <w:p>
+      <w:pPr>
+        <w:pStyle w:val="TOC2"/>
+        <w:tabs>
+          <w:tab w:val="right" w:leader="dot" w:pos="8990"/>
+        </w:tabs>
+        <w:rPr>
+          <w:rFonts w:asciiTheme="minorHAnsi" w:eastAsiaTheme="minorEastAsia" w:hAnsiTheme="minorHAnsi" w:cstheme="minorBidi"/>
+          <w:noProof/>
+          <w:sz w:val="24"/>
+        </w:rPr>
+      </w:pPr>
+      <w:hyperlink w:anchor="_Toc234343955" w:history="1">
+        <w:r>
+          <w:rPr>
+            <w:rStyle w:val="Hyperlink"/>
+            <w:noProof/>
+          </w:rPr>
+          <w:t>7.9 model.User, manager.UserManager and util.PasswordUtil</w:t>
+        </w:r>
+        <w:r>
+          <w:rPr>
+            <w:noProof/>
+          </w:rPr>
+          <w:tab/>
+        </w:r>
+        <w:r>
+          <w:rPr>
+            <w:noProof/>
+          </w:rPr>
+          <w:fldChar w:fldCharType="begin"/>
+        </w:r>
+        <w:r>
+          <w:rPr>
+            <w:noProof/>
+          </w:rPr>
+          <w:instrText xml:space="preserve"> PAGEREF _Toc234343955 \h </w:instrText>
+        </w:r>
+        <w:r>
+          <w:rPr>
+            <w:noProof/>
+          </w:rPr>
+        </w:r>
+        <w:r>
+          <w:rPr>
+            <w:noProof/>
+          </w:rPr>
+          <w:fldChar w:fldCharType="separate"/>
+        </w:r>
+        <w:r>
+          <w:rPr>
+            <w:noProof/>
+          </w:rPr>
+          <w:t>17</w:t>
+        </w:r>
+        <w:r>
+          <w:rPr>
+            <w:noProof/>
+          </w:rPr>
+          <w:fldChar w:fldCharType="end"/>
+        </w:r>
+      </w:hyperlink>
+    </w:p>
+    <w:p>
+      <w:pPr>
+        <w:pStyle w:val="TOC2"/>
+        <w:tabs>
+          <w:tab w:val="right" w:leader="dot" w:pos="8990"/>
+        </w:tabs>
+        <w:rPr>
+          <w:rFonts w:asciiTheme="minorHAnsi" w:eastAsiaTheme="minorEastAsia" w:hAnsiTheme="minorHAnsi" w:cstheme="minorBidi"/>
+          <w:noProof/>
+          <w:sz w:val="24"/>
+        </w:rPr>
+      </w:pPr>
+      <w:hyperlink w:anchor="_Toc234343956" w:history="1">
+        <w:r>
+          <w:rPr>
+            <w:rStyle w:val="Hyperlink"/>
+            <w:noProof/>
+          </w:rPr>
+          <w:t>7.10 ui.LoginWindow and panel.UsersPanel</w:t>
+        </w:r>
+        <w:r>
+          <w:rPr>
+            <w:noProof/>
+          </w:rPr>
+          <w:tab/>
+        </w:r>
+        <w:r>
+          <w:rPr>
+            <w:noProof/>
+          </w:rPr>
+          <w:fldChar w:fldCharType="begin"/>
+        </w:r>
+        <w:r>
+          <w:rPr>
+            <w:noProof/>
+          </w:rPr>
+          <w:instrText xml:space="preserve"> PAGEREF _Toc234343956 \h </w:instrText>
         </w:r>
         <w:r>
           <w:rPr>
@@ -1691,21 +1888,13 @@
           <w:sz w:val="24"/>
         </w:rPr>
       </w:pPr>
-      <w:hyperlink w:anchor="_Toc234320828" w:history="1">
+      <w:hyperlink w:anchor="_Toc234343957" w:history="1">
         <w:r>
           <w:rPr>
             <w:rStyle w:val="Hyperlink"/>
             <w:noProof/>
           </w:rPr>
-          <w:t>8. GUI DESIG</w:t>
-        </w:r>
-        <w:r>
-          <w:rPr>
-            <w:rStyle w:val="Hyperlink"/>
-            <w:noProof/>
-          </w:rPr>
-          <w:lastRenderedPageBreak/>
-          <w:t>N EXPLANATION</w:t>
+          <w:t>8. GUI DESIGN EXPLANATION</w:t>
         </w:r>
         <w:r>
           <w:rPr>
@@ -1723,7 +1912,7 @@
           <w:rPr>
             <w:noProof/>
           </w:rPr>
-          <w:instrText xml:space="preserve"> PAGEREF _Toc234320828 \h </w:instrText>
+          <w:instrText xml:space="preserve"> PAGEREF _Toc234343957 \h </w:instrText>
         </w:r>
         <w:r>
           <w:rPr>
@@ -1740,7 +1929,7 @@
           <w:rPr>
             <w:noProof/>
           </w:rPr>
-          <w:t>18</w:t>
+          <w:t>19</w:t>
         </w:r>
         <w:r>
           <w:rPr>
@@ -1762,7 +1951,7 @@
           <w:sz w:val="24"/>
         </w:rPr>
       </w:pPr>
-      <w:hyperlink w:anchor="_Toc234320829" w:history="1">
+      <w:hyperlink w:anchor="_Toc234343958" w:history="1">
         <w:r>
           <w:rPr>
             <w:rStyle w:val="Hyperlink"/>
@@ -1786,7 +1975,7 @@
           <w:rPr>
             <w:noProof/>
           </w:rPr>
-          <w:instrText xml:space="preserve"> PAGEREF _Toc234320829 \h </w:instrText>
+          <w:instrText xml:space="preserve"> PAGEREF _Toc234343958 \h </w:instrText>
         </w:r>
         <w:r>
           <w:rPr>
@@ -1803,7 +1992,7 @@
           <w:rPr>
             <w:noProof/>
           </w:rPr>
-          <w:t>19</w:t>
+          <w:t>21</w:t>
         </w:r>
         <w:r>
           <w:rPr>
@@ -1825,7 +2014,7 @@
           <w:sz w:val="24"/>
         </w:rPr>
       </w:pPr>
-      <w:hyperlink w:anchor="_Toc234320830" w:history="1">
+      <w:hyperlink w:anchor="_Toc234343959" w:history="1">
         <w:r>
           <w:rPr>
             <w:rStyle w:val="Hyperlink"/>
@@ -1849,7 +2038,7 @@
           <w:rPr>
             <w:noProof/>
           </w:rPr>
-          <w:instrText xml:space="preserve"> PAGEREF _Toc234320830 \h </w:instrText>
+          <w:instrText xml:space="preserve"> PAGEREF _Toc234343959 \h </w:instrText>
         </w:r>
         <w:r>
           <w:rPr>
@@ -1866,7 +2055,7 @@
           <w:rPr>
             <w:noProof/>
           </w:rPr>
-          <w:t>19</w:t>
+          <w:t>21</w:t>
         </w:r>
         <w:r>
           <w:rPr>
@@ -1888,7 +2077,7 @@
           <w:sz w:val="24"/>
         </w:rPr>
       </w:pPr>
-      <w:hyperlink w:anchor="_Toc234320831" w:history="1">
+      <w:hyperlink w:anchor="_Toc234343960" w:history="1">
         <w:r>
           <w:rPr>
             <w:rStyle w:val="Hyperlink"/>
@@ -1912,7 +2101,7 @@
           <w:rPr>
             <w:noProof/>
           </w:rPr>
-          <w:instrText xml:space="preserve"> PAGEREF _Toc234320831 \h </w:instrText>
+          <w:instrText xml:space="preserve"> PAGEREF _Toc234343960 \h </w:instrText>
         </w:r>
         <w:r>
           <w:rPr>
@@ -1929,7 +2118,7 @@
           <w:rPr>
             <w:noProof/>
           </w:rPr>
-          <w:t>19</w:t>
+          <w:t>21</w:t>
         </w:r>
         <w:r>
           <w:rPr>
@@ -1951,7 +2140,7 @@
           <w:sz w:val="24"/>
         </w:rPr>
       </w:pPr>
-      <w:hyperlink w:anchor="_Toc234320832" w:history="1">
+      <w:hyperlink w:anchor="_Toc234343961" w:history="1">
         <w:r>
           <w:rPr>
             <w:rStyle w:val="Hyperlink"/>
@@ -1975,7 +2164,7 @@
           <w:rPr>
             <w:noProof/>
           </w:rPr>
-          <w:instrText xml:space="preserve"> PAGEREF _Toc234320832 \h </w:instrText>
+          <w:instrText xml:space="preserve"> PAGEREF _Toc234343961 \h </w:instrText>
         </w:r>
         <w:r>
           <w:rPr>
@@ -1992,7 +2181,7 @@
           <w:rPr>
             <w:noProof/>
           </w:rPr>
-          <w:t>19</w:t>
+          <w:t>21</w:t>
         </w:r>
         <w:r>
           <w:rPr>
@@ -2014,7 +2203,7 @@
           <w:sz w:val="24"/>
         </w:rPr>
       </w:pPr>
-      <w:hyperlink w:anchor="_Toc234320833" w:history="1">
+      <w:hyperlink w:anchor="_Toc234343962" w:history="1">
         <w:r>
           <w:rPr>
             <w:rStyle w:val="Hyperlink"/>
@@ -2038,7 +2227,7 @@
           <w:rPr>
             <w:noProof/>
           </w:rPr>
-          <w:instrText xml:space="preserve"> PAGEREF _Toc234320833 \h </w:instrText>
+          <w:instrText xml:space="preserve"> PAGEREF _Toc234343962 \h </w:instrText>
         </w:r>
         <w:r>
           <w:rPr>
@@ -2055,7 +2244,7 @@
           <w:rPr>
             <w:noProof/>
           </w:rPr>
-          <w:t>19</w:t>
+          <w:t>21</w:t>
         </w:r>
         <w:r>
           <w:rPr>
@@ -2077,7 +2266,7 @@
           <w:sz w:val="24"/>
         </w:rPr>
       </w:pPr>
-      <w:hyperlink w:anchor="_Toc234320834" w:history="1">
+      <w:hyperlink w:anchor="_Toc234343963" w:history="1">
         <w:r>
           <w:rPr>
             <w:rStyle w:val="Hyperlink"/>
@@ -2101,7 +2290,7 @@
           <w:rPr>
             <w:noProof/>
           </w:rPr>
-          <w:instrText xml:space="preserve"> PAGEREF _Toc234320834 \h </w:instrText>
+          <w:instrText xml:space="preserve"> PAGEREF _Toc234343963 \h </w:instrText>
         </w:r>
         <w:r>
           <w:rPr>
@@ -2118,7 +2307,7 @@
           <w:rPr>
             <w:noProof/>
           </w:rPr>
-          <w:t>20</w:t>
+          <w:t>22</w:t>
         </w:r>
         <w:r>
           <w:rPr>
@@ -2140,7 +2329,7 @@
           <w:sz w:val="24"/>
         </w:rPr>
       </w:pPr>
-      <w:hyperlink w:anchor="_Toc234320835" w:history="1">
+      <w:hyperlink w:anchor="_Toc234343964" w:history="1">
         <w:r>
           <w:rPr>
             <w:rStyle w:val="Hyperlink"/>
@@ -2164,7 +2353,7 @@
           <w:rPr>
             <w:noProof/>
           </w:rPr>
-          <w:instrText xml:space="preserve"> PAGEREF _Toc234320835 \h </w:instrText>
+          <w:instrText xml:space="preserve"> PAGEREF _Toc234343964 \h </w:instrText>
         </w:r>
         <w:r>
           <w:rPr>
@@ -2181,7 +2370,7 @@
           <w:rPr>
             <w:noProof/>
           </w:rPr>
-          <w:t>20</w:t>
+          <w:t>22</w:t>
         </w:r>
         <w:r>
           <w:rPr>
@@ -2203,7 +2392,7 @@
           <w:sz w:val="24"/>
         </w:rPr>
       </w:pPr>
-      <w:hyperlink w:anchor="_Toc234320836" w:history="1">
+      <w:hyperlink w:anchor="_Toc234343965" w:history="1">
         <w:r>
           <w:rPr>
             <w:rStyle w:val="Hyperlink"/>
@@ -2227,7 +2416,7 @@
           <w:rPr>
             <w:noProof/>
           </w:rPr>
-          <w:instrText xml:space="preserve"> PAGEREF _Toc234320836 \h </w:instrText>
+          <w:instrText xml:space="preserve"> PAGEREF _Toc234343965 \h </w:instrText>
         </w:r>
         <w:r>
           <w:rPr>
@@ -2244,7 +2433,7 @@
           <w:rPr>
             <w:noProof/>
           </w:rPr>
-          <w:t>20</w:t>
+          <w:t>22</w:t>
         </w:r>
         <w:r>
           <w:rPr>
@@ -2266,7 +2455,7 @@
           <w:sz w:val="24"/>
         </w:rPr>
       </w:pPr>
-      <w:hyperlink w:anchor="_Toc234320837" w:history="1">
+      <w:hyperlink w:anchor="_Toc234343966" w:history="1">
         <w:r>
           <w:rPr>
             <w:rStyle w:val="Hyperlink"/>
@@ -2290,7 +2479,7 @@
           <w:rPr>
             <w:noProof/>
           </w:rPr>
-          <w:instrText xml:space="preserve"> PAGEREF _Toc234320837 \h </w:instrText>
+          <w:instrText xml:space="preserve"> PAGEREF _Toc234343966 \h </w:instrText>
         </w:r>
         <w:r>
           <w:rPr>
@@ -2307,7 +2496,7 @@
           <w:rPr>
             <w:noProof/>
           </w:rPr>
-          <w:t>21</w:t>
+          <w:t>23</w:t>
         </w:r>
         <w:r>
           <w:rPr>
@@ -2329,7 +2518,7 @@
           <w:sz w:val="24"/>
         </w:rPr>
       </w:pPr>
-      <w:hyperlink w:anchor="_Toc234320838" w:history="1">
+      <w:hyperlink w:anchor="_Toc234343967" w:history="1">
         <w:r>
           <w:rPr>
             <w:rStyle w:val="Hyperlink"/>
@@ -2353,7 +2542,7 @@
           <w:rPr>
             <w:noProof/>
           </w:rPr>
-          <w:instrText xml:space="preserve"> PAGEREF _Toc234320838 \h </w:instrText>
+          <w:instrText xml:space="preserve"> PAGEREF _Toc234343967 \h </w:instrText>
         </w:r>
         <w:r>
           <w:rPr>
@@ -2370,7 +2559,7 @@
           <w:rPr>
             <w:noProof/>
           </w:rPr>
-          <w:t>29</w:t>
+          <w:t>31</w:t>
         </w:r>
         <w:r>
           <w:rPr>
@@ -2392,7 +2581,7 @@
           <w:sz w:val="24"/>
         </w:rPr>
       </w:pPr>
-      <w:hyperlink w:anchor="_Toc234320839" w:history="1">
+      <w:hyperlink w:anchor="_Toc234343968" w:history="1">
         <w:r>
           <w:rPr>
             <w:rStyle w:val="Hyperlink"/>
@@ -2416,7 +2605,7 @@
           <w:rPr>
             <w:noProof/>
           </w:rPr>
-          <w:instrText xml:space="preserve"> PAGEREF _Toc234320839 \h </w:instrText>
+          <w:instrText xml:space="preserve"> PAGEREF _Toc234343968 \h </w:instrText>
         </w:r>
         <w:r>
           <w:rPr>
@@ -2433,7 +2622,7 @@
           <w:rPr>
             <w:noProof/>
           </w:rPr>
-          <w:t>30</w:t>
+          <w:t>32</w:t>
         </w:r>
         <w:r>
           <w:rPr>
@@ -2455,7 +2644,7 @@
           <w:sz w:val="24"/>
         </w:rPr>
       </w:pPr>
-      <w:hyperlink w:anchor="_Toc234320840" w:history="1">
+      <w:hyperlink w:anchor="_Toc234343969" w:history="1">
         <w:r>
           <w:rPr>
             <w:rStyle w:val="Hyperlink"/>
@@ -2479,7 +2668,7 @@
           <w:rPr>
             <w:noProof/>
           </w:rPr>
-          <w:instrText xml:space="preserve"> PAGEREF _Toc234320840 \h </w:instrText>
+          <w:instrText xml:space="preserve"> PAGEREF _Toc234343969 \h </w:instrText>
         </w:r>
         <w:r>
           <w:rPr>
@@ -2496,7 +2685,7 @@
           <w:rPr>
             <w:noProof/>
           </w:rPr>
-          <w:t>31</w:t>
+          <w:t>33</w:t>
         </w:r>
         <w:r>
           <w:rPr>
@@ -2518,7 +2707,7 @@
           <w:sz w:val="24"/>
         </w:rPr>
       </w:pPr>
-      <w:hyperlink w:anchor="_Toc234320841" w:history="1">
+      <w:hyperlink w:anchor="_Toc234343970" w:history="1">
         <w:r>
           <w:rPr>
             <w:rStyle w:val="Hyperlink"/>
@@ -2542,7 +2731,7 @@
           <w:rPr>
             <w:noProof/>
           </w:rPr>
-          <w:instrText xml:space="preserve"> PAGEREF _Toc234320841 \h </w:instrText>
+          <w:instrText xml:space="preserve"> PAGEREF _Toc234343970 \h </w:instrText>
         </w:r>
         <w:r>
           <w:rPr>
@@ -2559,7 +2748,7 @@
           <w:rPr>
             <w:noProof/>
           </w:rPr>
-          <w:t>32</w:t>
+          <w:t>34</w:t>
         </w:r>
         <w:r>
           <w:rPr>
@@ -2581,7 +2770,7 @@
           <w:sz w:val="24"/>
         </w:rPr>
       </w:pPr>
-      <w:hyperlink w:anchor="_Toc234320842" w:history="1">
+      <w:hyperlink w:anchor="_Toc234343971" w:history="1">
         <w:r>
           <w:rPr>
             <w:rStyle w:val="Hyperlink"/>
@@ -2605,7 +2794,7 @@
           <w:rPr>
             <w:noProof/>
           </w:rPr>
-          <w:instrText xml:space="preserve"> PAGEREF _Toc234320842 \h </w:instrText>
+          <w:instrText xml:space="preserve"> PAGEREF _Toc234343971 \h </w:instrText>
         </w:r>
         <w:r>
           <w:rPr>
@@ -2622,7 +2811,7 @@
           <w:rPr>
             <w:noProof/>
           </w:rPr>
-          <w:t>33</w:t>
+          <w:t>35</w:t>
         </w:r>
         <w:r>
           <w:rPr>
@@ -2644,7 +2833,7 @@
           <w:sz w:val="24"/>
         </w:rPr>
       </w:pPr>
-      <w:hyperlink w:anchor="_Toc234320843" w:history="1">
+      <w:hyperlink w:anchor="_Toc234343972" w:history="1">
         <w:r>
           <w:rPr>
             <w:rStyle w:val="Hyperlink"/>
@@ -2668,7 +2857,7 @@
           <w:rPr>
             <w:noProof/>
           </w:rPr>
-          <w:instrText xml:space="preserve"> PAGEREF _Toc234320843 \h </w:instrText>
+          <w:instrText xml:space="preserve"> PAGEREF _Toc234343972 \h </w:instrText>
         </w:r>
         <w:r>
           <w:rPr>
@@ -2685,7 +2874,7 @@
           <w:rPr>
             <w:noProof/>
           </w:rPr>
-          <w:t>34</w:t>
+          <w:t>36</w:t>
         </w:r>
         <w:r>
           <w:rPr>
@@ -2704,7 +2893,7 @@
       <w:pPr>
         <w:pStyle w:val="Heading1"/>
       </w:pPr>
-      <w:bookmarkStart w:id="0" w:name="_Toc234320805"/>
+      <w:bookmarkStart w:id="0" w:name="_Toc234343931"/>
       <w:r>
         <w:lastRenderedPageBreak/>
         <w:t>1. INTRODUCTION</w:t>
@@ -2739,7 +2928,7 @@
       <w:pPr>
         <w:pStyle w:val="Heading1"/>
       </w:pPr>
-      <w:bookmarkStart w:id="1" w:name="_Toc234320806"/>
+      <w:bookmarkStart w:id="1" w:name="_Toc234343932"/>
       <w:r>
         <w:lastRenderedPageBreak/>
         <w:t>2. PROBLEM STATEMENT</w:t>
@@ -2826,7 +3015,7 @@
       <w:pPr>
         <w:pStyle w:val="Heading1"/>
       </w:pPr>
-      <w:bookmarkStart w:id="2" w:name="_Toc234320807"/>
+      <w:bookmarkStart w:id="2" w:name="_Toc234343933"/>
       <w:r>
         <w:lastRenderedPageBreak/>
         <w:t>3. OBJECTIVES OF THE SYSTEM</w:t>
@@ -2929,7 +3118,7 @@
       <w:pPr>
         <w:pStyle w:val="Heading1"/>
       </w:pPr>
-      <w:bookmarkStart w:id="3" w:name="_Toc234320808"/>
+      <w:bookmarkStart w:id="3" w:name="_Toc234343934"/>
       <w:r>
         <w:lastRenderedPageBreak/>
         <w:t>4. SCOPE OF THE SYSTEM</w:t>
@@ -2940,7 +3129,7 @@
       <w:pPr>
         <w:pStyle w:val="Heading2"/>
       </w:pPr>
-      <w:bookmarkStart w:id="4" w:name="_Toc234320809"/>
+      <w:bookmarkStart w:id="4" w:name="_Toc234343935"/>
       <w:r>
         <w:t>4.1 In Scope</w:t>
       </w:r>
@@ -3082,7 +3271,7 @@
       <w:pPr>
         <w:pStyle w:val="Heading2"/>
       </w:pPr>
-      <w:bookmarkStart w:id="5" w:name="_Toc234320810"/>
+      <w:bookmarkStart w:id="5" w:name="_Toc234343936"/>
       <w:r>
         <w:t>4.2 Out of Scope</w:t>
       </w:r>
@@ -3152,7 +3341,7 @@
       <w:pPr>
         <w:pStyle w:val="Heading1"/>
       </w:pPr>
-      <w:bookmarkStart w:id="6" w:name="_Toc234320811"/>
+      <w:bookmarkStart w:id="6" w:name="_Toc234343937"/>
       <w:r>
         <w:lastRenderedPageBreak/>
         <w:t>5. METHODOLOGY</w:t>
@@ -3171,7 +3360,7 @@
       <w:pPr>
         <w:pStyle w:val="Heading2"/>
       </w:pPr>
-      <w:bookmarkStart w:id="7" w:name="_Toc234320812"/>
+      <w:bookmarkStart w:id="7" w:name="_Toc234343938"/>
       <w:r>
         <w:t>5.1 Development Environment and Tools</w:t>
       </w:r>
@@ -3229,7 +3418,7 @@
       <w:pPr>
         <w:pStyle w:val="Heading2"/>
       </w:pPr>
-      <w:bookmarkStart w:id="8" w:name="_Toc234320813"/>
+      <w:bookmarkStart w:id="8" w:name="_Toc234343939"/>
       <w:r>
         <w:t>5.2 Design Approach</w:t>
       </w:r>
@@ -3247,7 +3436,7 @@
       <w:pPr>
         <w:pStyle w:val="Heading2"/>
       </w:pPr>
-      <w:bookmarkStart w:id="9" w:name="_Toc234320814"/>
+      <w:bookmarkStart w:id="9" w:name="_Toc234343940"/>
       <w:r>
         <w:lastRenderedPageBreak/>
         <w:t>5.3 Verification Approach</w:t>
@@ -3266,7 +3455,7 @@
       <w:pPr>
         <w:pStyle w:val="Heading1"/>
       </w:pPr>
-      <w:bookmarkStart w:id="10" w:name="_Toc234320815"/>
+      <w:bookmarkStart w:id="10" w:name="_Toc234343941"/>
       <w:r>
         <w:lastRenderedPageBreak/>
         <w:t>6. SYSTEM DESIGN</w:t>
@@ -3733,7 +3922,7 @@
       <w:pPr>
         <w:pStyle w:val="Heading2"/>
       </w:pPr>
-      <w:bookmarkStart w:id="11" w:name="_Toc234320816"/>
+      <w:bookmarkStart w:id="11" w:name="_Toc234343942"/>
       <w:r>
         <w:t>6.1 Navigation Architecture</w:t>
       </w:r>
@@ -3751,7 +3940,7 @@
       <w:pPr>
         <w:pStyle w:val="Heading2"/>
       </w:pPr>
-      <w:bookmarkStart w:id="12" w:name="_Toc234320817"/>
+      <w:bookmarkStart w:id="12" w:name="_Toc234343943"/>
       <w:r>
         <w:t>6.2 Cross-Module Data Flow</w:t>
       </w:r>
@@ -3769,7 +3958,7 @@
       <w:pPr>
         <w:pStyle w:val="Heading2"/>
       </w:pPr>
-      <w:bookmarkStart w:id="13" w:name="_Toc234320818"/>
+      <w:bookmarkStart w:id="13" w:name="_Toc234343944"/>
       <w:r>
         <w:t>6.3 Persistence Model</w:t>
       </w:r>
@@ -3789,24 +3978,42 @@
     </w:p>
     <w:p>
       <w:pPr>
+        <w:pStyle w:val="Heading2"/>
+      </w:pPr>
+      <w:bookmarkStart w:id="14" w:name="_Toc234343945"/>
+      <w:r>
+        <w:t>6.4 Authentication and Access Control</w:t>
+      </w:r>
+      <w:bookmarkEnd w:id="14"/>
+    </w:p>
+    <w:p>
+      <w:pPr>
+        <w:jc w:val="both"/>
+      </w:pPr>
+      <w:r>
+        <w:t>Application access is gated ahead of MainWindow by ui.LoginWindow, the first window MainApp shows. On successful sign-in, LoginWindow disposes itself and constructs MainWindow with the authenticated model.User, which MainWindow keeps for the rest of the session to drive both the header (logged-in name and role, a Change Password action, and Logout) and role-based navigation: the User Management module and its sidebar entry are only added when the signed-in user's role is 'Admin'. Logout disposes MainWindow and reopens a fresh LoginWindow, returning the application to its unauthenticated state without restarting the JVM.</w:t>
+      </w:r>
+    </w:p>
+    <w:p>
+      <w:pPr>
         <w:pStyle w:val="Heading1"/>
       </w:pPr>
-      <w:bookmarkStart w:id="14" w:name="_Toc234320819"/>
+      <w:bookmarkStart w:id="15" w:name="_Toc234343946"/>
       <w:r>
         <w:lastRenderedPageBreak/>
         <w:t>7. DESCRIPTION OF CLASSES AND METHODS</w:t>
       </w:r>
-      <w:bookmarkEnd w:id="14"/>
+      <w:bookmarkEnd w:id="15"/>
     </w:p>
     <w:p>
       <w:pPr>
         <w:pStyle w:val="Heading2"/>
       </w:pPr>
-      <w:bookmarkStart w:id="15" w:name="_Toc234320820"/>
+      <w:bookmarkStart w:id="16" w:name="_Toc234343947"/>
       <w:r>
         <w:t>7.1 base.Entity (abstract class)</w:t>
       </w:r>
-      <w:bookmarkEnd w:id="15"/>
+      <w:bookmarkEnd w:id="16"/>
     </w:p>
     <w:p>
       <w:pPr>
@@ -3880,11 +4087,11 @@
       <w:pPr>
         <w:pStyle w:val="Heading2"/>
       </w:pPr>
-      <w:bookmarkStart w:id="16" w:name="_Toc234320821"/>
+      <w:bookmarkStart w:id="17" w:name="_Toc234343948"/>
       <w:r>
         <w:t>7.2 base.Manager&lt;T extends Entity&gt; (generic abstract class)</w:t>
       </w:r>
-      <w:bookmarkEnd w:id="16"/>
+      <w:bookmarkEnd w:id="17"/>
     </w:p>
     <w:p>
       <w:pPr>
@@ -3970,12 +4177,12 @@
       <w:pPr>
         <w:pStyle w:val="Heading2"/>
       </w:pPr>
-      <w:bookmarkStart w:id="17" w:name="_Toc234320822"/>
+      <w:bookmarkStart w:id="18" w:name="_Toc234343949"/>
       <w:r>
         <w:lastRenderedPageBreak/>
         <w:t>7.3 base.Displayable (interface)</w:t>
       </w:r>
-      <w:bookmarkEnd w:id="17"/>
+      <w:bookmarkEnd w:id="18"/>
     </w:p>
     <w:p>
       <w:pPr>
@@ -3989,11 +4196,11 @@
       <w:pPr>
         <w:pStyle w:val="Heading2"/>
       </w:pPr>
-      <w:bookmarkStart w:id="18" w:name="_Toc234320823"/>
+      <w:bookmarkStart w:id="19" w:name="_Toc234343950"/>
       <w:r>
         <w:t>7.4 ui.BasePanel (abstract class extending JPanel)</w:t>
       </w:r>
-      <w:bookmarkEnd w:id="18"/>
+      <w:bookmarkEnd w:id="19"/>
     </w:p>
     <w:p>
       <w:pPr>
@@ -4067,11 +4274,11 @@
       <w:pPr>
         <w:pStyle w:val="Heading2"/>
       </w:pPr>
-      <w:bookmarkStart w:id="19" w:name="_Toc234320824"/>
+      <w:bookmarkStart w:id="20" w:name="_Toc234343951"/>
       <w:r>
         <w:t>7.5 ui.MainWindow (extends JFrame) and ui.FormDialog (extends JDialog)</w:t>
       </w:r>
-      <w:bookmarkEnd w:id="19"/>
+      <w:bookmarkEnd w:id="20"/>
     </w:p>
     <w:p>
       <w:pPr>
@@ -4080,17 +4287,23 @@
       <w:r>
         <w:t>MainWindow assembles the header, sidebar, CardLayout content area and Home dashboard described in Section 6.1. FormDialog is a generic, reusable modal form builder: given a String[][] array of {key, label, type, options/default} rows, it constructs an entire GridBagLayout form (supporting TEXT, NUMBER, DATE, SELECT, AREA and READONLY field types) with Save/Cancel buttons, and exposes get(key)/set(key, value) accessors plus a static showDetail() helper for read-only detail pop-ups - avoiding hand-built dialog code in every panel.</w:t>
       </w:r>
+      <w:r>
+        <w:t xml:space="preserve"> MainWindow also owns two authentication-related actions in its header: logout(), which disposes the current window and opens a new LoginWindow, and changePassword(), a </w:t>
+      </w:r>
+      <w:r>
+        <w:lastRenderedPageBreak/>
+        <w:t>bespoke JDialog (current/new/confirm password fields) that calls UserManager.changePassword() for the signed-in user.</w:t>
+      </w:r>
     </w:p>
     <w:p>
       <w:pPr>
         <w:pStyle w:val="Heading2"/>
       </w:pPr>
-      <w:bookmarkStart w:id="20" w:name="_Toc234320825"/>
-      <w:r>
-        <w:lastRenderedPageBreak/>
+      <w:bookmarkStart w:id="21" w:name="_Toc234343952"/>
+      <w:r>
         <w:t>7.6 util.AppTheme, util.Validator, util.FileUtil</w:t>
       </w:r>
-      <w:bookmarkEnd w:id="20"/>
+      <w:bookmarkEnd w:id="21"/>
     </w:p>
     <w:p>
       <w:pPr>
@@ -4132,11 +4345,11 @@
       <w:pPr>
         <w:pStyle w:val="Heading2"/>
       </w:pPr>
-      <w:bookmarkStart w:id="21" w:name="_Toc234320826"/>
+      <w:bookmarkStart w:id="22" w:name="_Toc234343953"/>
       <w:r>
         <w:t>7.7 Manager Classes (manager package)</w:t>
       </w:r>
-      <w:bookmarkEnd w:id="21"/>
+      <w:bookmarkEnd w:id="22"/>
     </w:p>
     <w:p>
       <w:pPr>
@@ -4215,38 +4428,81 @@
         </w:numPr>
       </w:pPr>
       <w:r>
-        <w:t>AmbulanceManager, BloodManager, LabManager, MaternalManager, VaccinationManager - follow the same composition-of-Manager&lt;T&gt; pattern as AppointmentManager/PharmacyManager/BillingManager, each wrapping the file(s) relevant to its module (e.g. drivers/vehicles/dispatches; donors/requests/stock; tests/orders/results/constituents; mothers/records; vaccines/records).</w:t>
+        <w:t xml:space="preserve">AmbulanceManager, BloodManager, LabManager, MaternalManager, VaccinationManager - follow the same composition-of-Manager&lt;T&gt; pattern as AppointmentManager/PharmacyManager/BillingManager, each wrapping the file(s) </w:t>
+      </w:r>
+      <w:r>
+        <w:lastRenderedPageBreak/>
+        <w:t>relevant to its module (e.g. drivers/vehicles/dispatches; donors/requests/stock; tests/orders/results/constituents; mothers/records; vaccines/records).</w:t>
       </w:r>
     </w:p>
     <w:p>
       <w:pPr>
         <w:pStyle w:val="Heading2"/>
       </w:pPr>
-      <w:bookmarkStart w:id="22" w:name="_Toc234320827"/>
+      <w:bookmarkStart w:id="23" w:name="_Toc234343954"/>
+      <w:r>
+        <w:t>7.8 Model and Panel Classes</w:t>
+      </w:r>
+      <w:bookmarkEnd w:id="23"/>
+    </w:p>
+    <w:p>
+      <w:pPr>
+        <w:jc w:val="both"/>
+      </w:pPr>
+      <w:r>
+        <w:t>The model package contains 24 concrete entity classes (for example Appointment, Bill, BillService, Payment, PendingCharge, Medicine, Sale, QueuePatient, MedRecord, RecPatient, RecDoctor, Donor, BloodRequest, Vaccine, VaccRecord, AmbDriver, AmbulanceVehicle, Dispatch, LabTest, TestOrder, TestResult, TestConstituent, Mother, HealthRecord), each extending Entity and implementing Displayable, and each providing a matching static fromFile() factory method used by its manager's fromFileString() override. The panel package contains 10 module panels plus PatientsPanel/DoctorsPanel/RecordsPanel for the shared registry, each extending BasePanel and supplying the seven hook methods described in Section 7.4.</w:t>
+      </w:r>
+    </w:p>
+    <w:p>
+      <w:pPr>
+        <w:pStyle w:val="Heading2"/>
+      </w:pPr>
+      <w:bookmarkStart w:id="24" w:name="_Toc234343955"/>
+      <w:r>
+        <w:t>7.9 model.User, manager.UserManager and util.PasswordUtil</w:t>
+      </w:r>
+      <w:bookmarkEnd w:id="24"/>
+    </w:p>
+    <w:p>
+      <w:pPr>
+        <w:jc w:val="both"/>
+      </w:pPr>
+      <w:r>
+        <w:t>User extends Entity and implements Displayable like every other model class, adding username, a SHA-256 password hash, fullName, role ('Admin' or 'Staff') and an active flag; toFileString()/fromFile() persist it to sec_users.txt in the same pipe-delimited format as every other entity. UserManager wraps a Manager&lt;User&gt; and adds account-lifecycle methods beyond plain CRUD: it seeds a default 'admin' / '1234' account the first time the application runs, authenticate(username, password) returns a matching active User or null, addUser()/updateProfile()/setActive()/resetPassword() support administrator account management, and changePassword(userId, currentPassword, newPassword) supports self-service password changes after re-verifying the caller's current password. setActive() and updateProfile() both guard against deactivating or demoting the last remaining active administrator, preventing an accidental full lockout. PasswordUtil is a small, single-purpose utility class - hash(String) - that wraps java.security.MessageDigest to compute a SHA-256 hex digest, so no class outside PasswordUtil ever handles a raw password beyond the login/change-password forms themselves.</w:t>
+      </w:r>
+    </w:p>
+    <w:p>
+      <w:pPr>
+        <w:pStyle w:val="Heading2"/>
+      </w:pPr>
+      <w:bookmarkStart w:id="25" w:name="_Toc234343956"/>
+      <w:r>
+        <w:t>7.10 ui.LoginWindow and panel.UsersPanel</w:t>
+      </w:r>
+      <w:bookmarkEnd w:id="25"/>
+    </w:p>
+    <w:p>
+      <w:pPr>
+        <w:jc w:val="both"/>
+      </w:pPr>
+      <w:r>
+        <w:t xml:space="preserve">LoginWindow (extends JFrame) is the application's entry screen: a username field, a password field, a Log In button, and an inline error label. attemptLogin() calls UserManager.authenticate() and, on success, disposes itself and opens MainWindow with the </w:t>
+      </w:r>
       <w:r>
         <w:lastRenderedPageBreak/>
-        <w:t>7.8 Model and Panel Classes</w:t>
-      </w:r>
-      <w:bookmarkEnd w:id="22"/>
-    </w:p>
-    <w:p>
-      <w:pPr>
-        <w:jc w:val="both"/>
-      </w:pPr>
-      <w:r>
-        <w:t>The model package contains 24 concrete entity classes (for example Appointment, Bill, BillService, Payment, PendingCharge, Medicine, Sale, QueuePatient, MedRecord, RecPatient, RecDoctor, Donor, BloodRequest, Vaccine, VaccRecord, AmbDriver, AmbulanceVehicle, Dispatch, LabTest, TestOrder, TestResult, TestConstituent, Mother, HealthRecord), each extending Entity and implementing Displayable, and each providing a matching static fromFile() factory method used by its manager's fromFileString() override. The panel package contains 10 module panels plus PatientsPanel/DoctorsPanel/RecordsPanel for the shared registry, each extending BasePanel and supplying the seven hook methods described in Section 7.4.</w:t>
+        <w:t>returned User; on failure it shows an inline 'Invalid username or password.' message and clears the password field. UsersPanel extends BasePanel like every other module panel and supplies the same seven hook methods, but is only ever instantiated for an Admin user (see Section 6.4). Its extraButtons() adds two admin-specific actions beyond the standard Add/View/Edit/Delete set: an Activate/Deactivate toggle and a Reset Password action, both guarded so an administrator cannot deactivate their own account.</w:t>
       </w:r>
     </w:p>
     <w:p>
       <w:pPr>
         <w:pStyle w:val="Heading1"/>
       </w:pPr>
-      <w:bookmarkStart w:id="23" w:name="_Toc234320828"/>
+      <w:bookmarkStart w:id="26" w:name="_Toc234343957"/>
       <w:r>
         <w:lastRenderedPageBreak/>
         <w:t>8. GUI DESIGN EXPLANATION</w:t>
       </w:r>
-      <w:bookmarkEnd w:id="23"/>
+      <w:bookmarkEnd w:id="26"/>
     </w:p>
     <w:p>
       <w:pPr>
@@ -4318,24 +4574,37 @@
     </w:p>
     <w:p>
       <w:pPr>
+        <w:pStyle w:val="ListParagraph"/>
+        <w:numPr>
+          <w:ilvl w:val="0"/>
+          <w:numId w:val="11"/>
+        </w:numPr>
+      </w:pPr>
+      <w:r>
+        <w:lastRenderedPageBreak/>
+        <w:t>Login screen - ui.LoginWindow presents a centred card: a coloured header (application name and 'Sign in to continue'), username and password fields, a primary-styled Log In button, and a muted hint showing the default administrator credentials, all built with the same AppTheme fonts and colours used throughout the rest of the application so the login screen does not look like a bolted-on afterthought.</w:t>
+      </w:r>
+    </w:p>
+    <w:p>
+      <w:pPr>
         <w:pStyle w:val="Heading1"/>
       </w:pPr>
-      <w:bookmarkStart w:id="24" w:name="_Toc234320829"/>
+      <w:bookmarkStart w:id="27" w:name="_Toc234343958"/>
       <w:r>
         <w:lastRenderedPageBreak/>
         <w:t>9. OOP CONCEPTS IMPLEMENTED</w:t>
       </w:r>
-      <w:bookmarkEnd w:id="24"/>
+      <w:bookmarkEnd w:id="27"/>
     </w:p>
     <w:p>
       <w:pPr>
         <w:pStyle w:val="Heading2"/>
       </w:pPr>
-      <w:bookmarkStart w:id="25" w:name="_Toc234320830"/>
+      <w:bookmarkStart w:id="28" w:name="_Toc234343959"/>
       <w:r>
         <w:t>9.1 Encapsulation</w:t>
       </w:r>
-      <w:bookmarkEnd w:id="25"/>
+      <w:bookmarkEnd w:id="28"/>
     </w:p>
     <w:p>
       <w:pPr>
@@ -4344,16 +4613,19 @@
       <w:r>
         <w:t>Entity exposes its id only through getId()/setId(), keeping the field itself protected; every concrete model (for example Appointment) keeps its remaining fields private, exposing only the getters (and selective setters such as setStatus()) that the rest of the application actually needs. Manager&lt;T&gt; similarly keeps its items list and fileName as protected/final state, exposing behaviour only through its public add/update/remove/find/search methods rather than letting callers manipulate the underlying list directly.</w:t>
       </w:r>
+      <w:r>
+        <w:t xml:space="preserve"> PasswordUtil takes this further by encapsulating the only line of code in the entire application that computes a password hash, so that hashing algorithm/behaviour can change in one place without touching User, UserManager, LoginWindow or MainWindow.</w:t>
+      </w:r>
     </w:p>
     <w:p>
       <w:pPr>
         <w:pStyle w:val="Heading2"/>
       </w:pPr>
-      <w:bookmarkStart w:id="26" w:name="_Toc234320831"/>
+      <w:bookmarkStart w:id="29" w:name="_Toc234343960"/>
       <w:r>
         <w:t>9.2 Abstraction</w:t>
       </w:r>
-      <w:bookmarkEnd w:id="26"/>
+      <w:bookmarkEnd w:id="29"/>
     </w:p>
     <w:p>
       <w:pPr>
@@ -4367,11 +4639,11 @@
       <w:pPr>
         <w:pStyle w:val="Heading2"/>
       </w:pPr>
-      <w:bookmarkStart w:id="27" w:name="_Toc234320832"/>
+      <w:bookmarkStart w:id="30" w:name="_Toc234343961"/>
       <w:r>
         <w:t>9.3 Inheritance</w:t>
       </w:r>
-      <w:bookmarkEnd w:id="27"/>
+      <w:bookmarkEnd w:id="30"/>
     </w:p>
     <w:p>
       <w:pPr>
@@ -4380,35 +4652,41 @@
       <w:r>
         <w:t>Every one of the 24 model classes extends Entity; every one of the ten module panels extends BasePanel; and QueueManager extends Manager&lt;QueuePatient&gt; directly, adding queue-specific behaviour (addPatient(), serveNext()) on top of the inherited CRUD/persistence machinery.</w:t>
       </w:r>
+      <w:r>
+        <w:t xml:space="preserve"> The new User model class extends Entity in the same way, so the account subsystem added after the ten clinical modules reuses the same validation/persistence contract rather than inventing a parallel one.</w:t>
+      </w:r>
     </w:p>
     <w:p>
       <w:pPr>
         <w:pStyle w:val="Heading2"/>
       </w:pPr>
-      <w:bookmarkStart w:id="28" w:name="_Toc234320833"/>
+      <w:bookmarkStart w:id="31" w:name="_Toc234343962"/>
       <w:r>
         <w:t>9.4 Composition (contrasted with Inheritance)</w:t>
       </w:r>
-      <w:bookmarkEnd w:id="28"/>
+      <w:bookmarkEnd w:id="31"/>
     </w:p>
     <w:p>
       <w:pPr>
         <w:jc w:val="both"/>
       </w:pPr>
       <w:r>
-        <w:t>Most other managers - AppointmentManager, BillingManager, PharmacyManager, RecordManager, and the rest - do not extend Manager&lt;T&gt;; instead they hold one or more Manager&lt;T&gt; instances as fields (often built inline as anonymous subclasses, e.g. new Manager&lt;Appointment&gt;('appt_appointments.txt'){ ... }) and add their own business methods around them. Placing QueueManager's direct-inheritance style next to this composition style within the same codebase is a deliberate, teachable contrast between 'is-a' and 'has-a' relationships.</w:t>
+        <w:t xml:space="preserve">Most other managers - AppointmentManager, BillingManager, PharmacyManager, RecordManager, and the rest - do not extend Manager&lt;T&gt;; instead they hold one or more Manager&lt;T&gt; instances as fields (often built inline as anonymous subclasses, e.g. new Manager&lt;Appointment&gt;('appt_appointments.txt'){ ... }) and add their own business methods </w:t>
+      </w:r>
+      <w:r>
+        <w:lastRenderedPageBreak/>
+        <w:t>around them. Placing QueueManager's direct-inheritance style next to this composition style within the same codebase is a deliberate, teachable contrast between 'is-a' and 'has-a' relationships.</w:t>
       </w:r>
     </w:p>
     <w:p>
       <w:pPr>
         <w:pStyle w:val="Heading2"/>
       </w:pPr>
-      <w:bookmarkStart w:id="29" w:name="_Toc234320834"/>
-      <w:r>
-        <w:lastRenderedPageBreak/>
+      <w:bookmarkStart w:id="32" w:name="_Toc234343963"/>
+      <w:r>
         <w:t>9.5 Polymorphism</w:t>
       </w:r>
-      <w:bookmarkEnd w:id="29"/>
+      <w:bookmarkEnd w:id="32"/>
     </w:p>
     <w:p>
       <w:pPr>
@@ -4422,11 +4700,11 @@
       <w:pPr>
         <w:pStyle w:val="Heading2"/>
       </w:pPr>
-      <w:bookmarkStart w:id="30" w:name="_Toc234320835"/>
+      <w:bookmarkStart w:id="33" w:name="_Toc234343964"/>
       <w:r>
         <w:t>9.6 Generics</w:t>
       </w:r>
-      <w:bookmarkEnd w:id="30"/>
+      <w:bookmarkEnd w:id="33"/>
     </w:p>
     <w:p>
       <w:pPr>
@@ -4440,11 +4718,11 @@
       <w:pPr>
         <w:pStyle w:val="Heading2"/>
       </w:pPr>
-      <w:bookmarkStart w:id="31" w:name="_Toc234320836"/>
+      <w:bookmarkStart w:id="34" w:name="_Toc234343965"/>
       <w:r>
         <w:t>9.7 Design Patterns Observed</w:t>
       </w:r>
-      <w:bookmarkEnd w:id="31"/>
+      <w:bookmarkEnd w:id="34"/>
     </w:p>
     <w:p>
       <w:pPr>
@@ -4486,12 +4764,12 @@
       <w:pPr>
         <w:pStyle w:val="Heading1"/>
       </w:pPr>
-      <w:bookmarkStart w:id="32" w:name="_Toc234320837"/>
+      <w:bookmarkStart w:id="35" w:name="_Toc234343966"/>
       <w:r>
         <w:lastRenderedPageBreak/>
         <w:t>10. SCREENSHOTS AND OUTPUTS</w:t>
       </w:r>
-      <w:bookmarkEnd w:id="32"/>
+      <w:bookmarkEnd w:id="35"/>
     </w:p>
     <w:p>
       <w:pPr>
@@ -4515,7 +4793,7 @@
           <w:color w:val="808080"/>
         </w:rPr>
         <w:drawing>
-          <wp:inline distT="0" distB="0" distL="0" distR="0" wp14:anchorId="2E5D20A4" wp14:editId="0F3B4208">
+          <wp:inline distT="0" distB="0" distL="0" distR="0" wp14:anchorId="2E5D20A4" wp14:editId="29D7F118">
             <wp:extent cx="5334000" cy="2859024"/>
             <wp:effectExtent l="0" t="0" r="0" b="0"/>
             <wp:docPr id="714042723" name="Picture 1"/>
@@ -4592,7 +4870,7 @@
           <w:color w:val="808080"/>
         </w:rPr>
         <w:drawing>
-          <wp:inline distT="0" distB="0" distL="0" distR="0" wp14:anchorId="4CF482EC" wp14:editId="7FBCF621">
+          <wp:inline distT="0" distB="0" distL="0" distR="0" wp14:anchorId="4CF482EC" wp14:editId="11028C95">
             <wp:extent cx="5334000" cy="2857839"/>
             <wp:effectExtent l="0" t="0" r="0" b="0"/>
             <wp:docPr id="475526867" name="Picture 2"/>
@@ -4669,7 +4947,7 @@
           <w:color w:val="808080"/>
         </w:rPr>
         <w:drawing>
-          <wp:inline distT="0" distB="0" distL="0" distR="0" wp14:anchorId="49F4804B" wp14:editId="16C78819">
+          <wp:inline distT="0" distB="0" distL="0" distR="0" wp14:anchorId="49F4804B" wp14:editId="6DBD44BA">
             <wp:extent cx="5334000" cy="2864951"/>
             <wp:effectExtent l="0" t="0" r="0" b="0"/>
             <wp:docPr id="1035878586" name="Picture 3"/>
@@ -4746,7 +5024,7 @@
           <w:color w:val="808080"/>
         </w:rPr>
         <w:drawing>
-          <wp:inline distT="0" distB="0" distL="0" distR="0" wp14:anchorId="01DB7F1B" wp14:editId="515DCE7E">
+          <wp:inline distT="0" distB="0" distL="0" distR="0" wp14:anchorId="01DB7F1B" wp14:editId="73786B67">
             <wp:extent cx="5334000" cy="2848949"/>
             <wp:effectExtent l="0" t="0" r="0" b="8890"/>
             <wp:docPr id="1001767665" name="Picture 1"/>
@@ -4824,7 +5102,7 @@
         </w:rPr>
         <w:lastRenderedPageBreak/>
         <w:drawing>
-          <wp:inline distT="0" distB="0" distL="0" distR="0" wp14:anchorId="662AC6E3" wp14:editId="11825E06">
+          <wp:inline distT="0" distB="0" distL="0" distR="0" wp14:anchorId="662AC6E3" wp14:editId="4648D74C">
             <wp:extent cx="5334000" cy="2851912"/>
             <wp:effectExtent l="0" t="0" r="0" b="5715"/>
             <wp:docPr id="1466899551" name="Picture 2"/>
@@ -4901,7 +5179,7 @@
           <w:color w:val="808080"/>
         </w:rPr>
         <w:drawing>
-          <wp:inline distT="0" distB="0" distL="0" distR="0" wp14:anchorId="2A5D32E5" wp14:editId="134D249D">
+          <wp:inline distT="0" distB="0" distL="0" distR="0" wp14:anchorId="2A5D32E5" wp14:editId="165B43E8">
             <wp:extent cx="5334000" cy="2867914"/>
             <wp:effectExtent l="0" t="0" r="0" b="8890"/>
             <wp:docPr id="1482432158" name="Picture 3"/>
@@ -4979,7 +5257,7 @@
         </w:rPr>
         <w:lastRenderedPageBreak/>
         <w:drawing>
-          <wp:inline distT="0" distB="0" distL="0" distR="0" wp14:anchorId="7B4227F2" wp14:editId="13FE0687">
+          <wp:inline distT="0" distB="0" distL="0" distR="0" wp14:anchorId="7B4227F2" wp14:editId="3D34317C">
             <wp:extent cx="5334000" cy="2850727"/>
             <wp:effectExtent l="0" t="0" r="0" b="6985"/>
             <wp:docPr id="675627804" name="Picture 4"/>
@@ -5056,7 +5334,7 @@
           <w:color w:val="808080"/>
         </w:rPr>
         <w:drawing>
-          <wp:inline distT="0" distB="0" distL="0" distR="0" wp14:anchorId="581A2707" wp14:editId="63216A75">
+          <wp:inline distT="0" distB="0" distL="0" distR="0" wp14:anchorId="581A2707" wp14:editId="58B89B8C">
             <wp:extent cx="5334000" cy="2851319"/>
             <wp:effectExtent l="0" t="0" r="0" b="6350"/>
             <wp:docPr id="1229476174" name="Picture 5"/>
@@ -5134,7 +5412,7 @@
         </w:rPr>
         <w:lastRenderedPageBreak/>
         <w:drawing>
-          <wp:inline distT="0" distB="0" distL="0" distR="0" wp14:anchorId="3320E619" wp14:editId="038D69D3">
+          <wp:inline distT="0" distB="0" distL="0" distR="0" wp14:anchorId="3320E619" wp14:editId="79AF64BD">
             <wp:extent cx="5334000" cy="2856653"/>
             <wp:effectExtent l="0" t="0" r="0" b="1270"/>
             <wp:docPr id="270369643" name="Picture 6"/>
@@ -5211,7 +5489,7 @@
           <w:color w:val="808080"/>
         </w:rPr>
         <w:drawing>
-          <wp:inline distT="0" distB="0" distL="0" distR="0" wp14:anchorId="17182EA3" wp14:editId="02D0139F">
+          <wp:inline distT="0" distB="0" distL="0" distR="0" wp14:anchorId="17182EA3" wp14:editId="189DD2DF">
             <wp:extent cx="5334000" cy="2848949"/>
             <wp:effectExtent l="0" t="0" r="0" b="8890"/>
             <wp:docPr id="1640305537" name="Picture 7"/>
@@ -5289,7 +5567,7 @@
         </w:rPr>
         <w:lastRenderedPageBreak/>
         <w:drawing>
-          <wp:inline distT="0" distB="0" distL="0" distR="0" wp14:anchorId="1CFE849D" wp14:editId="01CF2521">
+          <wp:inline distT="0" distB="0" distL="0" distR="0" wp14:anchorId="1CFE849D" wp14:editId="6E60F4D7">
             <wp:extent cx="5334000" cy="2843615"/>
             <wp:effectExtent l="0" t="0" r="0" b="0"/>
             <wp:docPr id="1015366820" name="Picture 8"/>
@@ -5366,7 +5644,7 @@
           <w:color w:val="808080"/>
         </w:rPr>
         <w:drawing>
-          <wp:inline distT="0" distB="0" distL="0" distR="0" wp14:anchorId="73CC8328" wp14:editId="29BAE425">
+          <wp:inline distT="0" distB="0" distL="0" distR="0" wp14:anchorId="73CC8328" wp14:editId="70BBC427">
             <wp:extent cx="5334000" cy="2846578"/>
             <wp:effectExtent l="0" t="0" r="0" b="0"/>
             <wp:docPr id="79470811" name="Picture 9"/>
@@ -5444,7 +5722,7 @@
         </w:rPr>
         <w:lastRenderedPageBreak/>
         <w:drawing>
-          <wp:inline distT="0" distB="0" distL="0" distR="0" wp14:anchorId="7B1ABBE9" wp14:editId="29CC9D4A">
+          <wp:inline distT="0" distB="0" distL="0" distR="0" wp14:anchorId="7B1ABBE9" wp14:editId="0C493D27">
             <wp:extent cx="5334000" cy="2862580"/>
             <wp:effectExtent l="0" t="0" r="0" b="0"/>
             <wp:docPr id="282877113" name="Picture 10"/>
@@ -5521,7 +5799,7 @@
           <w:color w:val="808080"/>
         </w:rPr>
         <w:drawing>
-          <wp:inline distT="0" distB="0" distL="0" distR="0" wp14:anchorId="034E2001" wp14:editId="23FFDCF6">
+          <wp:inline distT="0" distB="0" distL="0" distR="0" wp14:anchorId="034E2001" wp14:editId="4DBAA498">
             <wp:extent cx="5334000" cy="2851912"/>
             <wp:effectExtent l="0" t="0" r="0" b="5715"/>
             <wp:docPr id="426359504" name="Picture 4"/>
@@ -5599,7 +5877,7 @@
         </w:rPr>
         <w:lastRenderedPageBreak/>
         <w:drawing>
-          <wp:inline distT="0" distB="0" distL="0" distR="0" wp14:anchorId="62F32EFC" wp14:editId="446CFBAC">
+          <wp:inline distT="0" distB="0" distL="0" distR="0" wp14:anchorId="62F32EFC" wp14:editId="7A5FF158">
             <wp:extent cx="5334000" cy="2864951"/>
             <wp:effectExtent l="0" t="0" r="0" b="0"/>
             <wp:docPr id="370561034" name="Picture 5"/>
@@ -5666,12 +5944,12 @@
       <w:pPr>
         <w:pStyle w:val="Heading1"/>
       </w:pPr>
-      <w:bookmarkStart w:id="33" w:name="_Toc234320838"/>
+      <w:bookmarkStart w:id="36" w:name="_Toc234343967"/>
       <w:r>
         <w:lastRenderedPageBreak/>
         <w:t>11. GITHUB REPOSITORY LINK</w:t>
       </w:r>
-      <w:bookmarkEnd w:id="33"/>
+      <w:bookmarkEnd w:id="36"/>
     </w:p>
     <w:p>
       <w:pPr>
@@ -5696,12 +5974,12 @@
       <w:pPr>
         <w:pStyle w:val="Heading1"/>
       </w:pPr>
-      <w:bookmarkStart w:id="34" w:name="_Toc234320839"/>
+      <w:bookmarkStart w:id="37" w:name="_Toc234343968"/>
       <w:r>
         <w:lastRenderedPageBreak/>
         <w:t>12. CHALLENGES ENCOUNTERED</w:t>
       </w:r>
-      <w:bookmarkEnd w:id="34"/>
+      <w:bookmarkEnd w:id="37"/>
     </w:p>
     <w:p>
       <w:pPr>
@@ -5765,14 +6043,26 @@
     </w:p>
     <w:p>
       <w:pPr>
+        <w:pStyle w:val="ListParagraph"/>
+        <w:numPr>
+          <w:ilvl w:val="0"/>
+          <w:numId w:val="13"/>
+        </w:numPr>
+      </w:pPr>
+      <w:r>
+        <w:t>Retrofitting a login gate onto an application whose ten modules already existed: MainWindow's constructor had to change to require an authenticated User, its sidebar/content construction had to become role-aware (building the User Management entry only for administrators) without disturbing the existing CardLayout navigation, and a self-lockout scenario (an administrator deactivating or demoting the only active admin account) had to be explicitly guarded against in UserManager.</w:t>
+      </w:r>
+    </w:p>
+    <w:p>
+      <w:pPr>
         <w:pStyle w:val="Heading1"/>
       </w:pPr>
-      <w:bookmarkStart w:id="35" w:name="_Toc234320840"/>
+      <w:bookmarkStart w:id="38" w:name="_Toc234343969"/>
       <w:r>
         <w:lastRenderedPageBreak/>
         <w:t>13. CONCLUSION</w:t>
       </w:r>
-      <w:bookmarkEnd w:id="35"/>
+      <w:bookmarkEnd w:id="38"/>
     </w:p>
     <w:p>
       <w:pPr>
@@ -5781,17 +6071,20 @@
       <w:r>
         <w:t>HospitalGUI demonstrates that a small, carefully designed set of abstract base types - Entity, the generic Manager, BasePanel, and the Displayable interface - can be reused across ten structurally different hospital modules to produce a single, internally consistent desktop application. Beyond its practical purpose of digitising queueing, records, pharmacy, appointments, blood donation, vaccination, ambulance dispatch, laboratory, billing and maternal health for a small hospital or clinic, the project serves as a clear, working demonstration of encapsulation, abstraction, inheritance, composition, polymorphism and generics within a non-trivial Java Swing application.</w:t>
       </w:r>
+      <w:r>
+        <w:t xml:space="preserve"> A subsequent iteration extended the same base-type reuse strategy to security concerns, adding a login gate, hashed credentials, and an admin-controlled account lifecycle (create, edit, deactivate, reset password, self-service password change) without introducing a database or network dependency.</w:t>
+      </w:r>
     </w:p>
     <w:p>
       <w:pPr>
         <w:pStyle w:val="Heading1"/>
       </w:pPr>
-      <w:bookmarkStart w:id="36" w:name="_Toc234320841"/>
+      <w:bookmarkStart w:id="39" w:name="_Toc234343970"/>
       <w:r>
         <w:lastRenderedPageBreak/>
         <w:t>14. RECOMMENDATIONS</w:t>
       </w:r>
-      <w:bookmarkEnd w:id="36"/>
+      <w:bookmarkEnd w:id="39"/>
     </w:p>
     <w:p>
       <w:pPr>
@@ -5814,7 +6107,7 @@
         </w:numPr>
       </w:pPr>
       <w:r>
-        <w:t>Introduce user authentication and role-based access control, since the current application has no login screen and any user who can run it has full access to every module and every patient's records.</w:t>
+        <w:t>Extend the new authentication layer with a password complexity policy, session/idle timeout, and finer-grained per-module permissions (the current model is a binary Admin/Staff distinction, so a Pharmacy-only or Billing-only account is not yet possible).</w:t>
       </w:r>
     </w:p>
     <w:p>
@@ -5869,12 +6162,12 @@
       <w:pPr>
         <w:pStyle w:val="Heading1"/>
       </w:pPr>
-      <w:bookmarkStart w:id="37" w:name="_Toc234320842"/>
+      <w:bookmarkStart w:id="40" w:name="_Toc234343971"/>
       <w:r>
         <w:lastRenderedPageBreak/>
         <w:t>15. REFERENCES</w:t>
       </w:r>
-      <w:bookmarkEnd w:id="37"/>
+      <w:bookmarkEnd w:id="40"/>
     </w:p>
     <w:p>
       <w:pPr>
@@ -5918,14 +6211,22 @@
     </w:p>
     <w:p>
       <w:pPr>
+        <w:jc w:val="both"/>
+      </w:pPr>
+      <w:r>
+        <w:t>National Institute of Standards and Technology (2015). FIPS PUB 180-4: Secure Hash Standard (SHS). U.S. Department of Commerce.</w:t>
+      </w:r>
+    </w:p>
+    <w:p>
+      <w:pPr>
         <w:pStyle w:val="Heading1"/>
       </w:pPr>
-      <w:bookmarkStart w:id="38" w:name="_Toc234320843"/>
+      <w:bookmarkStart w:id="41" w:name="_Toc234343972"/>
       <w:r>
         <w:lastRenderedPageBreak/>
         <w:t>APPENDIX: ADDITIONAL SCREENSHOTS</w:t>
       </w:r>
-      <w:bookmarkEnd w:id="38"/>
+      <w:bookmarkEnd w:id="41"/>
     </w:p>
     <w:p>
       <w:r>
@@ -6035,7 +6336,7 @@
         </w:rPr>
         <w:lastRenderedPageBreak/>
         <w:drawing>
-          <wp:inline distT="0" distB="0" distL="0" distR="0" wp14:anchorId="20C21B47" wp14:editId="5A17217F">
+          <wp:inline distT="0" distB="0" distL="0" distR="0" wp14:anchorId="20C21B47" wp14:editId="30319CFA">
             <wp:extent cx="5334000" cy="2863173"/>
             <wp:effectExtent l="0" t="0" r="0" b="0"/>
             <wp:docPr id="1421574492" name="Picture 19"/>
@@ -6084,7 +6385,7 @@
           <w:noProof/>
         </w:rPr>
         <w:drawing>
-          <wp:inline distT="0" distB="0" distL="0" distR="0" wp14:anchorId="4CD90A38" wp14:editId="3BF5A712">
+          <wp:inline distT="0" distB="0" distL="0" distR="0" wp14:anchorId="4CD90A38" wp14:editId="0E85704B">
             <wp:extent cx="5334000" cy="2857839"/>
             <wp:effectExtent l="0" t="0" r="0" b="0"/>
             <wp:docPr id="1726641900" name="Picture 18"/>
@@ -6134,7 +6435,7 @@
         </w:rPr>
         <w:lastRenderedPageBreak/>
         <w:drawing>
-          <wp:inline distT="0" distB="0" distL="0" distR="0" wp14:anchorId="3B7FA71C" wp14:editId="56D81DA2">
+          <wp:inline distT="0" distB="0" distL="0" distR="0" wp14:anchorId="3B7FA71C" wp14:editId="3B06CA23">
             <wp:extent cx="5334000" cy="2869099"/>
             <wp:effectExtent l="0" t="0" r="0" b="7620"/>
             <wp:docPr id="815747" name="Picture 17"/>
@@ -6183,7 +6484,7 @@
           <w:noProof/>
         </w:rPr>
         <w:drawing>
-          <wp:inline distT="0" distB="0" distL="0" distR="0" wp14:anchorId="17D0CB7A" wp14:editId="4398C55B">
+          <wp:inline distT="0" distB="0" distL="0" distR="0" wp14:anchorId="17D0CB7A" wp14:editId="5CDA3A98">
             <wp:extent cx="5334000" cy="2864951"/>
             <wp:effectExtent l="0" t="0" r="0" b="0"/>
             <wp:docPr id="1213715378" name="Picture 16"/>
@@ -6233,7 +6534,7 @@
         </w:rPr>
         <w:lastRenderedPageBreak/>
         <w:drawing>
-          <wp:inline distT="0" distB="0" distL="0" distR="0" wp14:anchorId="27634D9D" wp14:editId="3480931E">
+          <wp:inline distT="0" distB="0" distL="0" distR="0" wp14:anchorId="27634D9D" wp14:editId="2A06AAFB">
             <wp:extent cx="5334000" cy="2861987"/>
             <wp:effectExtent l="0" t="0" r="0" b="0"/>
             <wp:docPr id="400585266" name="Picture 15"/>
@@ -6282,7 +6583,7 @@
           <w:noProof/>
         </w:rPr>
         <w:drawing>
-          <wp:inline distT="0" distB="0" distL="0" distR="0" wp14:anchorId="5C8141D3" wp14:editId="53A9CF3F">
+          <wp:inline distT="0" distB="0" distL="0" distR="0" wp14:anchorId="5C8141D3" wp14:editId="569194CF">
             <wp:extent cx="5334000" cy="2834132"/>
             <wp:effectExtent l="0" t="0" r="0" b="4445"/>
             <wp:docPr id="2984802" name="Picture 14"/>
@@ -6332,7 +6633,7 @@
         </w:rPr>
         <w:lastRenderedPageBreak/>
         <w:drawing>
-          <wp:inline distT="0" distB="0" distL="0" distR="0" wp14:anchorId="1EFA47C3" wp14:editId="30F57582">
+          <wp:inline distT="0" distB="0" distL="0" distR="0" wp14:anchorId="1EFA47C3" wp14:editId="4FA0600C">
             <wp:extent cx="5334000" cy="2859024"/>
             <wp:effectExtent l="0" t="0" r="0" b="0"/>
             <wp:docPr id="186290466" name="Picture 13"/>
@@ -6381,7 +6682,7 @@
           <w:noProof/>
         </w:rPr>
         <w:drawing>
-          <wp:inline distT="0" distB="0" distL="0" distR="0" wp14:anchorId="4D8A47FE" wp14:editId="013D8A76">
+          <wp:inline distT="0" distB="0" distL="0" distR="0" wp14:anchorId="4D8A47FE" wp14:editId="116E4D83">
             <wp:extent cx="5334000" cy="2850727"/>
             <wp:effectExtent l="0" t="0" r="0" b="6985"/>
             <wp:docPr id="1472171324" name="Picture 12"/>
@@ -6431,7 +6732,7 @@
         </w:rPr>
         <w:lastRenderedPageBreak/>
         <w:drawing>
-          <wp:inline distT="0" distB="0" distL="0" distR="0" wp14:anchorId="3B9F7E2E" wp14:editId="6D30B931">
+          <wp:inline distT="0" distB="0" distL="0" distR="0" wp14:anchorId="3B9F7E2E" wp14:editId="7696C772">
             <wp:extent cx="5334000" cy="2850727"/>
             <wp:effectExtent l="0" t="0" r="0" b="6985"/>
             <wp:docPr id="775680071" name="Picture 11"/>
@@ -6480,7 +6781,7 @@
           <w:noProof/>
         </w:rPr>
         <w:drawing>
-          <wp:inline distT="0" distB="0" distL="0" distR="0" wp14:anchorId="73CA01E4" wp14:editId="316AE71B">
+          <wp:inline distT="0" distB="0" distL="0" distR="0" wp14:anchorId="73CA01E4" wp14:editId="0950AA02">
             <wp:extent cx="5334000" cy="2873841"/>
             <wp:effectExtent l="0" t="0" r="0" b="3175"/>
             <wp:docPr id="1137513282" name="Picture 10"/>
@@ -6530,7 +6831,7 @@
         </w:rPr>
         <w:lastRenderedPageBreak/>
         <w:drawing>
-          <wp:inline distT="0" distB="0" distL="0" distR="0" wp14:anchorId="701D6845" wp14:editId="48CE67A4">
+          <wp:inline distT="0" distB="0" distL="0" distR="0" wp14:anchorId="701D6845" wp14:editId="3AD7F14B">
             <wp:extent cx="5334000" cy="2856061"/>
             <wp:effectExtent l="0" t="0" r="0" b="1905"/>
             <wp:docPr id="392809353" name="Picture 9"/>
@@ -6579,7 +6880,7 @@
           <w:noProof/>
         </w:rPr>
         <w:drawing>
-          <wp:inline distT="0" distB="0" distL="0" distR="0" wp14:anchorId="14C9B7A5" wp14:editId="5ECBBAE9">
+          <wp:inline distT="0" distB="0" distL="0" distR="0" wp14:anchorId="14C9B7A5" wp14:editId="4C5D8584">
             <wp:extent cx="5334000" cy="2853690"/>
             <wp:effectExtent l="0" t="0" r="0" b="3810"/>
             <wp:docPr id="231558410" name="Picture 8"/>
@@ -6629,7 +6930,7 @@
         </w:rPr>
         <w:lastRenderedPageBreak/>
         <w:drawing>
-          <wp:inline distT="0" distB="0" distL="0" distR="0" wp14:anchorId="6F961963" wp14:editId="322C0BC1">
+          <wp:inline distT="0" distB="0" distL="0" distR="0" wp14:anchorId="6F961963" wp14:editId="0A0A68A7">
             <wp:extent cx="5334000" cy="2866136"/>
             <wp:effectExtent l="0" t="0" r="0" b="0"/>
             <wp:docPr id="2037957742" name="Picture 7"/>
@@ -6678,7 +6979,7 @@
           <w:noProof/>
         </w:rPr>
         <w:drawing>
-          <wp:inline distT="0" distB="0" distL="0" distR="0" wp14:anchorId="14E91590" wp14:editId="5C833F9B">
+          <wp:inline distT="0" distB="0" distL="0" distR="0" wp14:anchorId="14E91590" wp14:editId="651C4EDD">
             <wp:extent cx="5334000" cy="2866136"/>
             <wp:effectExtent l="0" t="0" r="0" b="0"/>
             <wp:docPr id="1797213203" name="Picture 6"/>
@@ -6728,7 +7029,7 @@
         </w:rPr>
         <w:lastRenderedPageBreak/>
         <w:drawing>
-          <wp:inline distT="0" distB="0" distL="0" distR="0" wp14:anchorId="0C064CE7" wp14:editId="1856FF0C">
+          <wp:inline distT="0" distB="0" distL="0" distR="0" wp14:anchorId="0C064CE7" wp14:editId="1DF1ECF6">
             <wp:extent cx="5334000" cy="2856061"/>
             <wp:effectExtent l="0" t="0" r="0" b="1905"/>
             <wp:docPr id="1158350721" name="Picture 5"/>
@@ -6777,7 +7078,7 @@
           <w:noProof/>
         </w:rPr>
         <w:drawing>
-          <wp:inline distT="0" distB="0" distL="0" distR="0" wp14:anchorId="4515E4C2" wp14:editId="308C7AFD">
+          <wp:inline distT="0" distB="0" distL="0" distR="0" wp14:anchorId="4515E4C2" wp14:editId="3C6230AB">
             <wp:extent cx="5334000" cy="2856653"/>
             <wp:effectExtent l="0" t="0" r="0" b="1270"/>
             <wp:docPr id="1504313374" name="Picture 4"/>
@@ -6827,7 +7128,7 @@
         </w:rPr>
         <w:lastRenderedPageBreak/>
         <w:drawing>
-          <wp:inline distT="0" distB="0" distL="0" distR="0" wp14:anchorId="285AAC3D" wp14:editId="0FE07245">
+          <wp:inline distT="0" distB="0" distL="0" distR="0" wp14:anchorId="285AAC3D" wp14:editId="7334670C">
             <wp:extent cx="5334000" cy="2860209"/>
             <wp:effectExtent l="0" t="0" r="0" b="0"/>
             <wp:docPr id="244583896" name="Picture 3"/>
@@ -6876,7 +7177,7 @@
           <w:noProof/>
         </w:rPr>
         <w:drawing>
-          <wp:inline distT="0" distB="0" distL="0" distR="0" wp14:anchorId="35C84DAB" wp14:editId="6DAC8E6A">
+          <wp:inline distT="0" distB="0" distL="0" distR="0" wp14:anchorId="35C84DAB" wp14:editId="7700C28C">
             <wp:extent cx="5334000" cy="2868507"/>
             <wp:effectExtent l="0" t="0" r="0" b="8255"/>
             <wp:docPr id="1429167751" name="Picture 2"/>
@@ -6926,7 +7227,7 @@
         </w:rPr>
         <w:lastRenderedPageBreak/>
         <w:drawing>
-          <wp:inline distT="0" distB="0" distL="0" distR="0" wp14:anchorId="22191274" wp14:editId="4C943B1C">
+          <wp:inline distT="0" distB="0" distL="0" distR="0" wp14:anchorId="22191274" wp14:editId="63816B5D">
             <wp:extent cx="5334000" cy="2864358"/>
             <wp:effectExtent l="0" t="0" r="0" b="0"/>
             <wp:docPr id="47709248" name="Picture 1"/>
@@ -6969,6 +7270,59 @@
       </w:r>
     </w:p>
     <w:p/>
+    <w:p>
+      <w:r>
+        <w:t>Figure A20: Login screen</w:t>
+      </w:r>
+    </w:p>
+    <w:p>
+      <w:r>
+        <w:rPr>
+          <w:noProof/>
+        </w:rPr>
+        <w:drawing>
+          <wp:inline distT="0" distB="0" distL="0" distR="0" wp14:anchorId="4134EF0C" wp14:editId="4337BC24">
+            <wp:extent cx="3556000" cy="3725334"/>
+            <wp:effectExtent l="0" t="0" r="6350" b="8890"/>
+            <wp:docPr id="1829947081" name="Picture 1"/>
+            <wp:cNvGraphicFramePr>
+              <a:graphicFrameLocks xmlns:a="http://schemas.openxmlformats.org/drawingml/2006/main" noChangeAspect="1"/>
+            </wp:cNvGraphicFramePr>
+            <a:graphic xmlns:a="http://schemas.openxmlformats.org/drawingml/2006/main">
+              <a:graphicData uri="http://schemas.openxmlformats.org/drawingml/2006/picture">
+                <pic:pic xmlns:pic="http://schemas.openxmlformats.org/drawingml/2006/picture">
+                  <pic:nvPicPr>
+                    <pic:cNvPr id="1829947081" name=""/>
+                    <pic:cNvPicPr/>
+                  </pic:nvPicPr>
+                  <pic:blipFill>
+                    <a:blip r:embed="rId39">
+                      <a:extLst>
+                        <a:ext uri="{28A0092B-C50C-407E-A947-70E740481C1C}">
+                          <a14:useLocalDpi xmlns:a14="http://schemas.microsoft.com/office/drawing/2010/main" val="0"/>
+                        </a:ext>
+                      </a:extLst>
+                    </a:blip>
+                    <a:stretch>
+                      <a:fillRect/>
+                    </a:stretch>
+                  </pic:blipFill>
+                  <pic:spPr>
+                    <a:xfrm>
+                      <a:off x="0" y="0"/>
+                      <a:ext cx="3556000" cy="3725334"/>
+                    </a:xfrm>
+                    <a:prstGeom prst="rect">
+                      <a:avLst/>
+                    </a:prstGeom>
+                  </pic:spPr>
+                </pic:pic>
+              </a:graphicData>
+            </a:graphic>
+          </wp:inline>
+        </w:drawing>
+      </w:r>
+    </w:p>
     <w:p/>
     <w:sectPr>
       <w:pgSz w:w="12240" w:h="15840"/>

</xml_diff>

<commit_message>
Add login, dashboard header, and User Management screenshots
</commit_message>
<xml_diff>
--- a/HospitalGUI_Technical_Report.docx
+++ b/HospitalGUI_Technical_Report.docx
@@ -242,7 +242,7 @@
       <w:r>
         <w:fldChar w:fldCharType="separate"/>
       </w:r>
-      <w:hyperlink w:anchor="_Toc234343931" w:history="1">
+      <w:hyperlink w:anchor="_Toc234344353" w:history="1">
         <w:r>
           <w:rPr>
             <w:rStyle w:val="Hyperlink"/>
@@ -266,7 +266,7 @@
           <w:rPr>
             <w:noProof/>
           </w:rPr>
-          <w:instrText xml:space="preserve"> PAGEREF _Toc234343931 \h </w:instrText>
+          <w:instrText xml:space="preserve"> PAGEREF _Toc234344353 \h </w:instrText>
         </w:r>
         <w:r>
           <w:rPr>
@@ -305,7 +305,7 @@
           <w:sz w:val="24"/>
         </w:rPr>
       </w:pPr>
-      <w:hyperlink w:anchor="_Toc234343932" w:history="1">
+      <w:hyperlink w:anchor="_Toc234344354" w:history="1">
         <w:r>
           <w:rPr>
             <w:rStyle w:val="Hyperlink"/>
@@ -329,7 +329,7 @@
           <w:rPr>
             <w:noProof/>
           </w:rPr>
-          <w:instrText xml:space="preserve"> PAGEREF _Toc234343932 \h </w:instrText>
+          <w:instrText xml:space="preserve"> PAGEREF _Toc234344354 \h </w:instrText>
         </w:r>
         <w:r>
           <w:rPr>
@@ -368,7 +368,7 @@
           <w:sz w:val="24"/>
         </w:rPr>
       </w:pPr>
-      <w:hyperlink w:anchor="_Toc234343933" w:history="1">
+      <w:hyperlink w:anchor="_Toc234344355" w:history="1">
         <w:r>
           <w:rPr>
             <w:rStyle w:val="Hyperlink"/>
@@ -392,7 +392,7 @@
           <w:rPr>
             <w:noProof/>
           </w:rPr>
-          <w:instrText xml:space="preserve"> PAGEREF _Toc234343933 \h </w:instrText>
+          <w:instrText xml:space="preserve"> PAGEREF _Toc234344355 \h </w:instrText>
         </w:r>
         <w:r>
           <w:rPr>
@@ -431,7 +431,7 @@
           <w:sz w:val="24"/>
         </w:rPr>
       </w:pPr>
-      <w:hyperlink w:anchor="_Toc234343934" w:history="1">
+      <w:hyperlink w:anchor="_Toc234344356" w:history="1">
         <w:r>
           <w:rPr>
             <w:rStyle w:val="Hyperlink"/>
@@ -455,7 +455,7 @@
           <w:rPr>
             <w:noProof/>
           </w:rPr>
-          <w:instrText xml:space="preserve"> PAGEREF _Toc234343934 \h </w:instrText>
+          <w:instrText xml:space="preserve"> PAGEREF _Toc234344356 \h </w:instrText>
         </w:r>
         <w:r>
           <w:rPr>
@@ -494,7 +494,7 @@
           <w:sz w:val="24"/>
         </w:rPr>
       </w:pPr>
-      <w:hyperlink w:anchor="_Toc234343935" w:history="1">
+      <w:hyperlink w:anchor="_Toc234344357" w:history="1">
         <w:r>
           <w:rPr>
             <w:rStyle w:val="Hyperlink"/>
@@ -518,7 +518,7 @@
           <w:rPr>
             <w:noProof/>
           </w:rPr>
-          <w:instrText xml:space="preserve"> PAGEREF _Toc234343935 \h </w:instrText>
+          <w:instrText xml:space="preserve"> PAGEREF _Toc234344357 \h </w:instrText>
         </w:r>
         <w:r>
           <w:rPr>
@@ -557,7 +557,7 @@
           <w:sz w:val="24"/>
         </w:rPr>
       </w:pPr>
-      <w:hyperlink w:anchor="_Toc234343936" w:history="1">
+      <w:hyperlink w:anchor="_Toc234344358" w:history="1">
         <w:r>
           <w:rPr>
             <w:rStyle w:val="Hyperlink"/>
@@ -581,7 +581,7 @@
           <w:rPr>
             <w:noProof/>
           </w:rPr>
-          <w:instrText xml:space="preserve"> PAGEREF _Toc234343936 \h </w:instrText>
+          <w:instrText xml:space="preserve"> PAGEREF _Toc234344358 \h </w:instrText>
         </w:r>
         <w:r>
           <w:rPr>
@@ -620,7 +620,7 @@
           <w:sz w:val="24"/>
         </w:rPr>
       </w:pPr>
-      <w:hyperlink w:anchor="_Toc234343937" w:history="1">
+      <w:hyperlink w:anchor="_Toc234344359" w:history="1">
         <w:r>
           <w:rPr>
             <w:rStyle w:val="Hyperlink"/>
@@ -644,7 +644,7 @@
           <w:rPr>
             <w:noProof/>
           </w:rPr>
-          <w:instrText xml:space="preserve"> PAGEREF _Toc234343937 \h </w:instrText>
+          <w:instrText xml:space="preserve"> PAGEREF _Toc234344359 \h </w:instrText>
         </w:r>
         <w:r>
           <w:rPr>
@@ -683,7 +683,7 @@
           <w:sz w:val="24"/>
         </w:rPr>
       </w:pPr>
-      <w:hyperlink w:anchor="_Toc234343938" w:history="1">
+      <w:hyperlink w:anchor="_Toc234344360" w:history="1">
         <w:r>
           <w:rPr>
             <w:rStyle w:val="Hyperlink"/>
@@ -707,7 +707,7 @@
           <w:rPr>
             <w:noProof/>
           </w:rPr>
-          <w:instrText xml:space="preserve"> PAGEREF _Toc234343938 \h </w:instrText>
+          <w:instrText xml:space="preserve"> PAGEREF _Toc234344360 \h </w:instrText>
         </w:r>
         <w:r>
           <w:rPr>
@@ -746,7 +746,7 @@
           <w:sz w:val="24"/>
         </w:rPr>
       </w:pPr>
-      <w:hyperlink w:anchor="_Toc234343939" w:history="1">
+      <w:hyperlink w:anchor="_Toc234344361" w:history="1">
         <w:r>
           <w:rPr>
             <w:rStyle w:val="Hyperlink"/>
@@ -770,7 +770,7 @@
           <w:rPr>
             <w:noProof/>
           </w:rPr>
-          <w:instrText xml:space="preserve"> PAGEREF _Toc234343939 \h </w:instrText>
+          <w:instrText xml:space="preserve"> PAGEREF _Toc234344361 \h </w:instrText>
         </w:r>
         <w:r>
           <w:rPr>
@@ -809,7 +809,7 @@
           <w:sz w:val="24"/>
         </w:rPr>
       </w:pPr>
-      <w:hyperlink w:anchor="_Toc234343940" w:history="1">
+      <w:hyperlink w:anchor="_Toc234344362" w:history="1">
         <w:r>
           <w:rPr>
             <w:rStyle w:val="Hyperlink"/>
@@ -833,7 +833,7 @@
           <w:rPr>
             <w:noProof/>
           </w:rPr>
-          <w:instrText xml:space="preserve"> PAGEREF _Toc234343940 \h </w:instrText>
+          <w:instrText xml:space="preserve"> PAGEREF _Toc234344362 \h </w:instrText>
         </w:r>
         <w:r>
           <w:rPr>
@@ -872,7 +872,7 @@
           <w:sz w:val="24"/>
         </w:rPr>
       </w:pPr>
-      <w:hyperlink w:anchor="_Toc234343941" w:history="1">
+      <w:hyperlink w:anchor="_Toc234344363" w:history="1">
         <w:r>
           <w:rPr>
             <w:rStyle w:val="Hyperlink"/>
@@ -896,7 +896,7 @@
           <w:rPr>
             <w:noProof/>
           </w:rPr>
-          <w:instrText xml:space="preserve"> PAGEREF _Toc234343941 \h </w:instrText>
+          <w:instrText xml:space="preserve"> PAGEREF _Toc234344363 \h </w:instrText>
         </w:r>
         <w:r>
           <w:rPr>
@@ -935,7 +935,7 @@
           <w:sz w:val="24"/>
         </w:rPr>
       </w:pPr>
-      <w:hyperlink w:anchor="_Toc234343942" w:history="1">
+      <w:hyperlink w:anchor="_Toc234344364" w:history="1">
         <w:r>
           <w:rPr>
             <w:rStyle w:val="Hyperlink"/>
@@ -959,7 +959,7 @@
           <w:rPr>
             <w:noProof/>
           </w:rPr>
-          <w:instrText xml:space="preserve"> PAGEREF _Toc234343942 \h </w:instrText>
+          <w:instrText xml:space="preserve"> PAGEREF _Toc234344364 \h </w:instrText>
         </w:r>
         <w:r>
           <w:rPr>
@@ -998,7 +998,7 @@
           <w:sz w:val="24"/>
         </w:rPr>
       </w:pPr>
-      <w:hyperlink w:anchor="_Toc234343943" w:history="1">
+      <w:hyperlink w:anchor="_Toc234344365" w:history="1">
         <w:r>
           <w:rPr>
             <w:rStyle w:val="Hyperlink"/>
@@ -1022,7 +1022,7 @@
           <w:rPr>
             <w:noProof/>
           </w:rPr>
-          <w:instrText xml:space="preserve"> PAGEREF _Toc234343943 \h </w:instrText>
+          <w:instrText xml:space="preserve"> PAGEREF _Toc234344365 \h </w:instrText>
         </w:r>
         <w:r>
           <w:rPr>
@@ -1061,7 +1061,7 @@
           <w:sz w:val="24"/>
         </w:rPr>
       </w:pPr>
-      <w:hyperlink w:anchor="_Toc234343944" w:history="1">
+      <w:hyperlink w:anchor="_Toc234344366" w:history="1">
         <w:r>
           <w:rPr>
             <w:rStyle w:val="Hyperlink"/>
@@ -1085,7 +1085,7 @@
           <w:rPr>
             <w:noProof/>
           </w:rPr>
-          <w:instrText xml:space="preserve"> PAGEREF _Toc234343944 \h </w:instrText>
+          <w:instrText xml:space="preserve"> PAGEREF _Toc234344366 \h </w:instrText>
         </w:r>
         <w:r>
           <w:rPr>
@@ -1124,7 +1124,7 @@
           <w:sz w:val="24"/>
         </w:rPr>
       </w:pPr>
-      <w:hyperlink w:anchor="_Toc234343945" w:history="1">
+      <w:hyperlink w:anchor="_Toc234344367" w:history="1">
         <w:r>
           <w:rPr>
             <w:rStyle w:val="Hyperlink"/>
@@ -1148,7 +1148,7 @@
           <w:rPr>
             <w:noProof/>
           </w:rPr>
-          <w:instrText xml:space="preserve"> PAGEREF _Toc234343945 \h </w:instrText>
+          <w:instrText xml:space="preserve"> PAGEREF _Toc234344367 \h </w:instrText>
         </w:r>
         <w:r>
           <w:rPr>
@@ -1187,7 +1187,7 @@
           <w:sz w:val="24"/>
         </w:rPr>
       </w:pPr>
-      <w:hyperlink w:anchor="_Toc234343946" w:history="1">
+      <w:hyperlink w:anchor="_Toc234344368" w:history="1">
         <w:r>
           <w:rPr>
             <w:rStyle w:val="Hyperlink"/>
@@ -1211,7 +1211,7 @@
           <w:rPr>
             <w:noProof/>
           </w:rPr>
-          <w:instrText xml:space="preserve"> PAGEREF _Toc234343946 \h </w:instrText>
+          <w:instrText xml:space="preserve"> PAGEREF _Toc234344368 \h </w:instrText>
         </w:r>
         <w:r>
           <w:rPr>
@@ -1250,7 +1250,7 @@
           <w:sz w:val="24"/>
         </w:rPr>
       </w:pPr>
-      <w:hyperlink w:anchor="_Toc234343947" w:history="1">
+      <w:hyperlink w:anchor="_Toc234344369" w:history="1">
         <w:r>
           <w:rPr>
             <w:rStyle w:val="Hyperlink"/>
@@ -1274,7 +1274,7 @@
           <w:rPr>
             <w:noProof/>
           </w:rPr>
-          <w:instrText xml:space="preserve"> PAGEREF _Toc234343947 \h </w:instrText>
+          <w:instrText xml:space="preserve"> PAGEREF _Toc234344369 \h </w:instrText>
         </w:r>
         <w:r>
           <w:rPr>
@@ -1313,7 +1313,7 @@
           <w:sz w:val="24"/>
         </w:rPr>
       </w:pPr>
-      <w:hyperlink w:anchor="_Toc234343948" w:history="1">
+      <w:hyperlink w:anchor="_Toc234344370" w:history="1">
         <w:r>
           <w:rPr>
             <w:rStyle w:val="Hyperlink"/>
@@ -1337,7 +1337,7 @@
           <w:rPr>
             <w:noProof/>
           </w:rPr>
-          <w:instrText xml:space="preserve"> PAGEREF _Toc234343948 \h </w:instrText>
+          <w:instrText xml:space="preserve"> PAGEREF _Toc234344370 \h </w:instrText>
         </w:r>
         <w:r>
           <w:rPr>
@@ -1376,7 +1376,7 @@
           <w:sz w:val="24"/>
         </w:rPr>
       </w:pPr>
-      <w:hyperlink w:anchor="_Toc234343949" w:history="1">
+      <w:hyperlink w:anchor="_Toc234344371" w:history="1">
         <w:r>
           <w:rPr>
             <w:rStyle w:val="Hyperlink"/>
@@ -1400,7 +1400,7 @@
           <w:rPr>
             <w:noProof/>
           </w:rPr>
-          <w:instrText xml:space="preserve"> PAGEREF _Toc234343949 \h </w:instrText>
+          <w:instrText xml:space="preserve"> PAGEREF _Toc234344371 \h </w:instrText>
         </w:r>
         <w:r>
           <w:rPr>
@@ -1439,7 +1439,7 @@
           <w:sz w:val="24"/>
         </w:rPr>
       </w:pPr>
-      <w:hyperlink w:anchor="_Toc234343950" w:history="1">
+      <w:hyperlink w:anchor="_Toc234344372" w:history="1">
         <w:r>
           <w:rPr>
             <w:rStyle w:val="Hyperlink"/>
@@ -1463,7 +1463,7 @@
           <w:rPr>
             <w:noProof/>
           </w:rPr>
-          <w:instrText xml:space="preserve"> PAGEREF _Toc234343950 \h </w:instrText>
+          <w:instrText xml:space="preserve"> PAGEREF _Toc234344372 \h </w:instrText>
         </w:r>
         <w:r>
           <w:rPr>
@@ -1502,7 +1502,7 @@
           <w:sz w:val="24"/>
         </w:rPr>
       </w:pPr>
-      <w:hyperlink w:anchor="_Toc234343951" w:history="1">
+      <w:hyperlink w:anchor="_Toc234344373" w:history="1">
         <w:r>
           <w:rPr>
             <w:rStyle w:val="Hyperlink"/>
@@ -1526,7 +1526,7 @@
           <w:rPr>
             <w:noProof/>
           </w:rPr>
-          <w:instrText xml:space="preserve"> PAGEREF _Toc234343951 \h </w:instrText>
+          <w:instrText xml:space="preserve"> PAGEREF _Toc234344373 \h </w:instrText>
         </w:r>
         <w:r>
           <w:rPr>
@@ -1565,7 +1565,7 @@
           <w:sz w:val="24"/>
         </w:rPr>
       </w:pPr>
-      <w:hyperlink w:anchor="_Toc234343952" w:history="1">
+      <w:hyperlink w:anchor="_Toc234344374" w:history="1">
         <w:r>
           <w:rPr>
             <w:rStyle w:val="Hyperlink"/>
@@ -1589,7 +1589,7 @@
           <w:rPr>
             <w:noProof/>
           </w:rPr>
-          <w:instrText xml:space="preserve"> PAGEREF _Toc234343952 \h </w:instrText>
+          <w:instrText xml:space="preserve"> PAGEREF _Toc234344374 \h </w:instrText>
         </w:r>
         <w:r>
           <w:rPr>
@@ -1628,7 +1628,7 @@
           <w:sz w:val="24"/>
         </w:rPr>
       </w:pPr>
-      <w:hyperlink w:anchor="_Toc234343953" w:history="1">
+      <w:hyperlink w:anchor="_Toc234344375" w:history="1">
         <w:r>
           <w:rPr>
             <w:rStyle w:val="Hyperlink"/>
@@ -1652,7 +1652,7 @@
           <w:rPr>
             <w:noProof/>
           </w:rPr>
-          <w:instrText xml:space="preserve"> PAGEREF _Toc234343953 \h </w:instrText>
+          <w:instrText xml:space="preserve"> PAGEREF _Toc234344375 \h </w:instrText>
         </w:r>
         <w:r>
           <w:rPr>
@@ -1691,13 +1691,13 @@
           <w:sz w:val="24"/>
         </w:rPr>
       </w:pPr>
-      <w:hyperlink w:anchor="_Toc234343954" w:history="1">
+      <w:hyperlink w:anchor="_Toc234344376" w:history="1">
         <w:r>
           <w:rPr>
             <w:rStyle w:val="Hyperlink"/>
             <w:noProof/>
           </w:rPr>
-          <w:t>7.</w:t>
+          <w:t xml:space="preserve">7.8 Model and </w:t>
         </w:r>
         <w:r>
           <w:rPr>
@@ -1705,7 +1705,7 @@
             <w:noProof/>
           </w:rPr>
           <w:lastRenderedPageBreak/>
-          <w:t>8 Model and Panel Classes</w:t>
+          <w:t>Panel Classes</w:t>
         </w:r>
         <w:r>
           <w:rPr>
@@ -1723,7 +1723,7 @@
           <w:rPr>
             <w:noProof/>
           </w:rPr>
-          <w:instrText xml:space="preserve"> PAGEREF _Toc234343954 \h </w:instrText>
+          <w:instrText xml:space="preserve"> PAGEREF _Toc234344376 \h </w:instrText>
         </w:r>
         <w:r>
           <w:rPr>
@@ -1762,7 +1762,7 @@
           <w:sz w:val="24"/>
         </w:rPr>
       </w:pPr>
-      <w:hyperlink w:anchor="_Toc234343955" w:history="1">
+      <w:hyperlink w:anchor="_Toc234344377" w:history="1">
         <w:r>
           <w:rPr>
             <w:rStyle w:val="Hyperlink"/>
@@ -1786,7 +1786,7 @@
           <w:rPr>
             <w:noProof/>
           </w:rPr>
-          <w:instrText xml:space="preserve"> PAGEREF _Toc234343955 \h </w:instrText>
+          <w:instrText xml:space="preserve"> PAGEREF _Toc234344377 \h </w:instrText>
         </w:r>
         <w:r>
           <w:rPr>
@@ -1825,7 +1825,7 @@
           <w:sz w:val="24"/>
         </w:rPr>
       </w:pPr>
-      <w:hyperlink w:anchor="_Toc234343956" w:history="1">
+      <w:hyperlink w:anchor="_Toc234344378" w:history="1">
         <w:r>
           <w:rPr>
             <w:rStyle w:val="Hyperlink"/>
@@ -1849,7 +1849,7 @@
           <w:rPr>
             <w:noProof/>
           </w:rPr>
-          <w:instrText xml:space="preserve"> PAGEREF _Toc234343956 \h </w:instrText>
+          <w:instrText xml:space="preserve"> PAGEREF _Toc234344378 \h </w:instrText>
         </w:r>
         <w:r>
           <w:rPr>
@@ -1888,7 +1888,7 @@
           <w:sz w:val="24"/>
         </w:rPr>
       </w:pPr>
-      <w:hyperlink w:anchor="_Toc234343957" w:history="1">
+      <w:hyperlink w:anchor="_Toc234344379" w:history="1">
         <w:r>
           <w:rPr>
             <w:rStyle w:val="Hyperlink"/>
@@ -1912,7 +1912,7 @@
           <w:rPr>
             <w:noProof/>
           </w:rPr>
-          <w:instrText xml:space="preserve"> PAGEREF _Toc234343957 \h </w:instrText>
+          <w:instrText xml:space="preserve"> PAGEREF _Toc234344379 \h </w:instrText>
         </w:r>
         <w:r>
           <w:rPr>
@@ -1951,7 +1951,7 @@
           <w:sz w:val="24"/>
         </w:rPr>
       </w:pPr>
-      <w:hyperlink w:anchor="_Toc234343958" w:history="1">
+      <w:hyperlink w:anchor="_Toc234344380" w:history="1">
         <w:r>
           <w:rPr>
             <w:rStyle w:val="Hyperlink"/>
@@ -1975,7 +1975,7 @@
           <w:rPr>
             <w:noProof/>
           </w:rPr>
-          <w:instrText xml:space="preserve"> PAGEREF _Toc234343958 \h </w:instrText>
+          <w:instrText xml:space="preserve"> PAGEREF _Toc234344380 \h </w:instrText>
         </w:r>
         <w:r>
           <w:rPr>
@@ -2014,7 +2014,7 @@
           <w:sz w:val="24"/>
         </w:rPr>
       </w:pPr>
-      <w:hyperlink w:anchor="_Toc234343959" w:history="1">
+      <w:hyperlink w:anchor="_Toc234344381" w:history="1">
         <w:r>
           <w:rPr>
             <w:rStyle w:val="Hyperlink"/>
@@ -2038,7 +2038,7 @@
           <w:rPr>
             <w:noProof/>
           </w:rPr>
-          <w:instrText xml:space="preserve"> PAGEREF _Toc234343959 \h </w:instrText>
+          <w:instrText xml:space="preserve"> PAGEREF _Toc234344381 \h </w:instrText>
         </w:r>
         <w:r>
           <w:rPr>
@@ -2077,7 +2077,7 @@
           <w:sz w:val="24"/>
         </w:rPr>
       </w:pPr>
-      <w:hyperlink w:anchor="_Toc234343960" w:history="1">
+      <w:hyperlink w:anchor="_Toc234344382" w:history="1">
         <w:r>
           <w:rPr>
             <w:rStyle w:val="Hyperlink"/>
@@ -2101,7 +2101,7 @@
           <w:rPr>
             <w:noProof/>
           </w:rPr>
-          <w:instrText xml:space="preserve"> PAGEREF _Toc234343960 \h </w:instrText>
+          <w:instrText xml:space="preserve"> PAGEREF _Toc234344382 \h </w:instrText>
         </w:r>
         <w:r>
           <w:rPr>
@@ -2140,7 +2140,7 @@
           <w:sz w:val="24"/>
         </w:rPr>
       </w:pPr>
-      <w:hyperlink w:anchor="_Toc234343961" w:history="1">
+      <w:hyperlink w:anchor="_Toc234344383" w:history="1">
         <w:r>
           <w:rPr>
             <w:rStyle w:val="Hyperlink"/>
@@ -2164,7 +2164,7 @@
           <w:rPr>
             <w:noProof/>
           </w:rPr>
-          <w:instrText xml:space="preserve"> PAGEREF _Toc234343961 \h </w:instrText>
+          <w:instrText xml:space="preserve"> PAGEREF _Toc234344383 \h </w:instrText>
         </w:r>
         <w:r>
           <w:rPr>
@@ -2203,7 +2203,7 @@
           <w:sz w:val="24"/>
         </w:rPr>
       </w:pPr>
-      <w:hyperlink w:anchor="_Toc234343962" w:history="1">
+      <w:hyperlink w:anchor="_Toc234344384" w:history="1">
         <w:r>
           <w:rPr>
             <w:rStyle w:val="Hyperlink"/>
@@ -2227,7 +2227,7 @@
           <w:rPr>
             <w:noProof/>
           </w:rPr>
-          <w:instrText xml:space="preserve"> PAGEREF _Toc234343962 \h </w:instrText>
+          <w:instrText xml:space="preserve"> PAGEREF _Toc234344384 \h </w:instrText>
         </w:r>
         <w:r>
           <w:rPr>
@@ -2266,7 +2266,7 @@
           <w:sz w:val="24"/>
         </w:rPr>
       </w:pPr>
-      <w:hyperlink w:anchor="_Toc234343963" w:history="1">
+      <w:hyperlink w:anchor="_Toc234344385" w:history="1">
         <w:r>
           <w:rPr>
             <w:rStyle w:val="Hyperlink"/>
@@ -2290,7 +2290,7 @@
           <w:rPr>
             <w:noProof/>
           </w:rPr>
-          <w:instrText xml:space="preserve"> PAGEREF _Toc234343963 \h </w:instrText>
+          <w:instrText xml:space="preserve"> PAGEREF _Toc234344385 \h </w:instrText>
         </w:r>
         <w:r>
           <w:rPr>
@@ -2329,7 +2329,7 @@
           <w:sz w:val="24"/>
         </w:rPr>
       </w:pPr>
-      <w:hyperlink w:anchor="_Toc234343964" w:history="1">
+      <w:hyperlink w:anchor="_Toc234344386" w:history="1">
         <w:r>
           <w:rPr>
             <w:rStyle w:val="Hyperlink"/>
@@ -2353,7 +2353,7 @@
           <w:rPr>
             <w:noProof/>
           </w:rPr>
-          <w:instrText xml:space="preserve"> PAGEREF _Toc234343964 \h </w:instrText>
+          <w:instrText xml:space="preserve"> PAGEREF _Toc234344386 \h </w:instrText>
         </w:r>
         <w:r>
           <w:rPr>
@@ -2392,7 +2392,7 @@
           <w:sz w:val="24"/>
         </w:rPr>
       </w:pPr>
-      <w:hyperlink w:anchor="_Toc234343965" w:history="1">
+      <w:hyperlink w:anchor="_Toc234344387" w:history="1">
         <w:r>
           <w:rPr>
             <w:rStyle w:val="Hyperlink"/>
@@ -2416,7 +2416,7 @@
           <w:rPr>
             <w:noProof/>
           </w:rPr>
-          <w:instrText xml:space="preserve"> PAGEREF _Toc234343965 \h </w:instrText>
+          <w:instrText xml:space="preserve"> PAGEREF _Toc234344387 \h </w:instrText>
         </w:r>
         <w:r>
           <w:rPr>
@@ -2455,7 +2455,7 @@
           <w:sz w:val="24"/>
         </w:rPr>
       </w:pPr>
-      <w:hyperlink w:anchor="_Toc234343966" w:history="1">
+      <w:hyperlink w:anchor="_Toc234344388" w:history="1">
         <w:r>
           <w:rPr>
             <w:rStyle w:val="Hyperlink"/>
@@ -2479,7 +2479,7 @@
           <w:rPr>
             <w:noProof/>
           </w:rPr>
-          <w:instrText xml:space="preserve"> PAGEREF _Toc234343966 \h </w:instrText>
+          <w:instrText xml:space="preserve"> PAGEREF _Toc234344388 \h </w:instrText>
         </w:r>
         <w:r>
           <w:rPr>
@@ -2518,7 +2518,7 @@
           <w:sz w:val="24"/>
         </w:rPr>
       </w:pPr>
-      <w:hyperlink w:anchor="_Toc234343967" w:history="1">
+      <w:hyperlink w:anchor="_Toc234344389" w:history="1">
         <w:r>
           <w:rPr>
             <w:rStyle w:val="Hyperlink"/>
@@ -2542,7 +2542,7 @@
           <w:rPr>
             <w:noProof/>
           </w:rPr>
-          <w:instrText xml:space="preserve"> PAGEREF _Toc234343967 \h </w:instrText>
+          <w:instrText xml:space="preserve"> PAGEREF _Toc234344389 \h </w:instrText>
         </w:r>
         <w:r>
           <w:rPr>
@@ -2581,7 +2581,7 @@
           <w:sz w:val="24"/>
         </w:rPr>
       </w:pPr>
-      <w:hyperlink w:anchor="_Toc234343968" w:history="1">
+      <w:hyperlink w:anchor="_Toc234344390" w:history="1">
         <w:r>
           <w:rPr>
             <w:rStyle w:val="Hyperlink"/>
@@ -2605,7 +2605,7 @@
           <w:rPr>
             <w:noProof/>
           </w:rPr>
-          <w:instrText xml:space="preserve"> PAGEREF _Toc234343968 \h </w:instrText>
+          <w:instrText xml:space="preserve"> PAGEREF _Toc234344390 \h </w:instrText>
         </w:r>
         <w:r>
           <w:rPr>
@@ -2644,7 +2644,7 @@
           <w:sz w:val="24"/>
         </w:rPr>
       </w:pPr>
-      <w:hyperlink w:anchor="_Toc234343969" w:history="1">
+      <w:hyperlink w:anchor="_Toc234344391" w:history="1">
         <w:r>
           <w:rPr>
             <w:rStyle w:val="Hyperlink"/>
@@ -2668,7 +2668,7 @@
           <w:rPr>
             <w:noProof/>
           </w:rPr>
-          <w:instrText xml:space="preserve"> PAGEREF _Toc234343969 \h </w:instrText>
+          <w:instrText xml:space="preserve"> PAGEREF _Toc234344391 \h </w:instrText>
         </w:r>
         <w:r>
           <w:rPr>
@@ -2707,7 +2707,7 @@
           <w:sz w:val="24"/>
         </w:rPr>
       </w:pPr>
-      <w:hyperlink w:anchor="_Toc234343970" w:history="1">
+      <w:hyperlink w:anchor="_Toc234344392" w:history="1">
         <w:r>
           <w:rPr>
             <w:rStyle w:val="Hyperlink"/>
@@ -2731,7 +2731,7 @@
           <w:rPr>
             <w:noProof/>
           </w:rPr>
-          <w:instrText xml:space="preserve"> PAGEREF _Toc234343970 \h </w:instrText>
+          <w:instrText xml:space="preserve"> PAGEREF _Toc234344392 \h </w:instrText>
         </w:r>
         <w:r>
           <w:rPr>
@@ -2770,7 +2770,7 @@
           <w:sz w:val="24"/>
         </w:rPr>
       </w:pPr>
-      <w:hyperlink w:anchor="_Toc234343971" w:history="1">
+      <w:hyperlink w:anchor="_Toc234344393" w:history="1">
         <w:r>
           <w:rPr>
             <w:rStyle w:val="Hyperlink"/>
@@ -2794,7 +2794,7 @@
           <w:rPr>
             <w:noProof/>
           </w:rPr>
-          <w:instrText xml:space="preserve"> PAGEREF _Toc234343971 \h </w:instrText>
+          <w:instrText xml:space="preserve"> PAGEREF _Toc234344393 \h </w:instrText>
         </w:r>
         <w:r>
           <w:rPr>
@@ -2833,7 +2833,7 @@
           <w:sz w:val="24"/>
         </w:rPr>
       </w:pPr>
-      <w:hyperlink w:anchor="_Toc234343972" w:history="1">
+      <w:hyperlink w:anchor="_Toc234344394" w:history="1">
         <w:r>
           <w:rPr>
             <w:rStyle w:val="Hyperlink"/>
@@ -2857,7 +2857,7 @@
           <w:rPr>
             <w:noProof/>
           </w:rPr>
-          <w:instrText xml:space="preserve"> PAGEREF _Toc234343972 \h </w:instrText>
+          <w:instrText xml:space="preserve"> PAGEREF _Toc234344394 \h </w:instrText>
         </w:r>
         <w:r>
           <w:rPr>
@@ -2893,7 +2893,7 @@
       <w:pPr>
         <w:pStyle w:val="Heading1"/>
       </w:pPr>
-      <w:bookmarkStart w:id="0" w:name="_Toc234343931"/>
+      <w:bookmarkStart w:id="0" w:name="_Toc234344353"/>
       <w:r>
         <w:lastRenderedPageBreak/>
         <w:t>1. INTRODUCTION</w:t>
@@ -2928,7 +2928,7 @@
       <w:pPr>
         <w:pStyle w:val="Heading1"/>
       </w:pPr>
-      <w:bookmarkStart w:id="1" w:name="_Toc234343932"/>
+      <w:bookmarkStart w:id="1" w:name="_Toc234344354"/>
       <w:r>
         <w:lastRenderedPageBreak/>
         <w:t>2. PROBLEM STATEMENT</w:t>
@@ -3015,7 +3015,7 @@
       <w:pPr>
         <w:pStyle w:val="Heading1"/>
       </w:pPr>
-      <w:bookmarkStart w:id="2" w:name="_Toc234343933"/>
+      <w:bookmarkStart w:id="2" w:name="_Toc234344355"/>
       <w:r>
         <w:lastRenderedPageBreak/>
         <w:t>3. OBJECTIVES OF THE SYSTEM</w:t>
@@ -3118,7 +3118,7 @@
       <w:pPr>
         <w:pStyle w:val="Heading1"/>
       </w:pPr>
-      <w:bookmarkStart w:id="3" w:name="_Toc234343934"/>
+      <w:bookmarkStart w:id="3" w:name="_Toc234344356"/>
       <w:r>
         <w:lastRenderedPageBreak/>
         <w:t>4. SCOPE OF THE SYSTEM</w:t>
@@ -3129,7 +3129,7 @@
       <w:pPr>
         <w:pStyle w:val="Heading2"/>
       </w:pPr>
-      <w:bookmarkStart w:id="4" w:name="_Toc234343935"/>
+      <w:bookmarkStart w:id="4" w:name="_Toc234344357"/>
       <w:r>
         <w:t>4.1 In Scope</w:t>
       </w:r>
@@ -3271,7 +3271,7 @@
       <w:pPr>
         <w:pStyle w:val="Heading2"/>
       </w:pPr>
-      <w:bookmarkStart w:id="5" w:name="_Toc234343936"/>
+      <w:bookmarkStart w:id="5" w:name="_Toc234344358"/>
       <w:r>
         <w:t>4.2 Out of Scope</w:t>
       </w:r>
@@ -3341,7 +3341,7 @@
       <w:pPr>
         <w:pStyle w:val="Heading1"/>
       </w:pPr>
-      <w:bookmarkStart w:id="6" w:name="_Toc234343937"/>
+      <w:bookmarkStart w:id="6" w:name="_Toc234344359"/>
       <w:r>
         <w:lastRenderedPageBreak/>
         <w:t>5. METHODOLOGY</w:t>
@@ -3360,7 +3360,7 @@
       <w:pPr>
         <w:pStyle w:val="Heading2"/>
       </w:pPr>
-      <w:bookmarkStart w:id="7" w:name="_Toc234343938"/>
+      <w:bookmarkStart w:id="7" w:name="_Toc234344360"/>
       <w:r>
         <w:t>5.1 Development Environment and Tools</w:t>
       </w:r>
@@ -3418,7 +3418,7 @@
       <w:pPr>
         <w:pStyle w:val="Heading2"/>
       </w:pPr>
-      <w:bookmarkStart w:id="8" w:name="_Toc234343939"/>
+      <w:bookmarkStart w:id="8" w:name="_Toc234344361"/>
       <w:r>
         <w:t>5.2 Design Approach</w:t>
       </w:r>
@@ -3436,7 +3436,7 @@
       <w:pPr>
         <w:pStyle w:val="Heading2"/>
       </w:pPr>
-      <w:bookmarkStart w:id="9" w:name="_Toc234343940"/>
+      <w:bookmarkStart w:id="9" w:name="_Toc234344362"/>
       <w:r>
         <w:lastRenderedPageBreak/>
         <w:t>5.3 Verification Approach</w:t>
@@ -3455,7 +3455,7 @@
       <w:pPr>
         <w:pStyle w:val="Heading1"/>
       </w:pPr>
-      <w:bookmarkStart w:id="10" w:name="_Toc234343941"/>
+      <w:bookmarkStart w:id="10" w:name="_Toc234344363"/>
       <w:r>
         <w:lastRenderedPageBreak/>
         <w:t>6. SYSTEM DESIGN</w:t>
@@ -3922,7 +3922,7 @@
       <w:pPr>
         <w:pStyle w:val="Heading2"/>
       </w:pPr>
-      <w:bookmarkStart w:id="11" w:name="_Toc234343942"/>
+      <w:bookmarkStart w:id="11" w:name="_Toc234344364"/>
       <w:r>
         <w:t>6.1 Navigation Architecture</w:t>
       </w:r>
@@ -3940,7 +3940,7 @@
       <w:pPr>
         <w:pStyle w:val="Heading2"/>
       </w:pPr>
-      <w:bookmarkStart w:id="12" w:name="_Toc234343943"/>
+      <w:bookmarkStart w:id="12" w:name="_Toc234344365"/>
       <w:r>
         <w:t>6.2 Cross-Module Data Flow</w:t>
       </w:r>
@@ -3958,7 +3958,7 @@
       <w:pPr>
         <w:pStyle w:val="Heading2"/>
       </w:pPr>
-      <w:bookmarkStart w:id="13" w:name="_Toc234343944"/>
+      <w:bookmarkStart w:id="13" w:name="_Toc234344366"/>
       <w:r>
         <w:t>6.3 Persistence Model</w:t>
       </w:r>
@@ -3980,7 +3980,7 @@
       <w:pPr>
         <w:pStyle w:val="Heading2"/>
       </w:pPr>
-      <w:bookmarkStart w:id="14" w:name="_Toc234343945"/>
+      <w:bookmarkStart w:id="14" w:name="_Toc234344367"/>
       <w:r>
         <w:t>6.4 Authentication and Access Control</w:t>
       </w:r>
@@ -3998,7 +3998,7 @@
       <w:pPr>
         <w:pStyle w:val="Heading1"/>
       </w:pPr>
-      <w:bookmarkStart w:id="15" w:name="_Toc234343946"/>
+      <w:bookmarkStart w:id="15" w:name="_Toc234344368"/>
       <w:r>
         <w:lastRenderedPageBreak/>
         <w:t>7. DESCRIPTION OF CLASSES AND METHODS</w:t>
@@ -4009,7 +4009,7 @@
       <w:pPr>
         <w:pStyle w:val="Heading2"/>
       </w:pPr>
-      <w:bookmarkStart w:id="16" w:name="_Toc234343947"/>
+      <w:bookmarkStart w:id="16" w:name="_Toc234344369"/>
       <w:r>
         <w:t>7.1 base.Entity (abstract class)</w:t>
       </w:r>
@@ -4087,7 +4087,7 @@
       <w:pPr>
         <w:pStyle w:val="Heading2"/>
       </w:pPr>
-      <w:bookmarkStart w:id="17" w:name="_Toc234343948"/>
+      <w:bookmarkStart w:id="17" w:name="_Toc234344370"/>
       <w:r>
         <w:t>7.2 base.Manager&lt;T extends Entity&gt; (generic abstract class)</w:t>
       </w:r>
@@ -4177,7 +4177,7 @@
       <w:pPr>
         <w:pStyle w:val="Heading2"/>
       </w:pPr>
-      <w:bookmarkStart w:id="18" w:name="_Toc234343949"/>
+      <w:bookmarkStart w:id="18" w:name="_Toc234344371"/>
       <w:r>
         <w:lastRenderedPageBreak/>
         <w:t>7.3 base.Displayable (interface)</w:t>
@@ -4196,7 +4196,7 @@
       <w:pPr>
         <w:pStyle w:val="Heading2"/>
       </w:pPr>
-      <w:bookmarkStart w:id="19" w:name="_Toc234343950"/>
+      <w:bookmarkStart w:id="19" w:name="_Toc234344372"/>
       <w:r>
         <w:t>7.4 ui.BasePanel (abstract class extending JPanel)</w:t>
       </w:r>
@@ -4274,7 +4274,7 @@
       <w:pPr>
         <w:pStyle w:val="Heading2"/>
       </w:pPr>
-      <w:bookmarkStart w:id="20" w:name="_Toc234343951"/>
+      <w:bookmarkStart w:id="20" w:name="_Toc234344373"/>
       <w:r>
         <w:t>7.5 ui.MainWindow (extends JFrame) and ui.FormDialog (extends JDialog)</w:t>
       </w:r>
@@ -4299,7 +4299,7 @@
       <w:pPr>
         <w:pStyle w:val="Heading2"/>
       </w:pPr>
-      <w:bookmarkStart w:id="21" w:name="_Toc234343952"/>
+      <w:bookmarkStart w:id="21" w:name="_Toc234344374"/>
       <w:r>
         <w:t>7.6 util.AppTheme, util.Validator, util.FileUtil</w:t>
       </w:r>
@@ -4345,7 +4345,7 @@
       <w:pPr>
         <w:pStyle w:val="Heading2"/>
       </w:pPr>
-      <w:bookmarkStart w:id="22" w:name="_Toc234343953"/>
+      <w:bookmarkStart w:id="22" w:name="_Toc234344375"/>
       <w:r>
         <w:t>7.7 Manager Classes (manager package)</w:t>
       </w:r>
@@ -4439,7 +4439,7 @@
       <w:pPr>
         <w:pStyle w:val="Heading2"/>
       </w:pPr>
-      <w:bookmarkStart w:id="23" w:name="_Toc234343954"/>
+      <w:bookmarkStart w:id="23" w:name="_Toc234344376"/>
       <w:r>
         <w:t>7.8 Model and Panel Classes</w:t>
       </w:r>
@@ -4457,7 +4457,7 @@
       <w:pPr>
         <w:pStyle w:val="Heading2"/>
       </w:pPr>
-      <w:bookmarkStart w:id="24" w:name="_Toc234343955"/>
+      <w:bookmarkStart w:id="24" w:name="_Toc234344377"/>
       <w:r>
         <w:t>7.9 model.User, manager.UserManager and util.PasswordUtil</w:t>
       </w:r>
@@ -4475,7 +4475,7 @@
       <w:pPr>
         <w:pStyle w:val="Heading2"/>
       </w:pPr>
-      <w:bookmarkStart w:id="25" w:name="_Toc234343956"/>
+      <w:bookmarkStart w:id="25" w:name="_Toc234344378"/>
       <w:r>
         <w:t>7.10 ui.LoginWindow and panel.UsersPanel</w:t>
       </w:r>
@@ -4497,7 +4497,7 @@
       <w:pPr>
         <w:pStyle w:val="Heading1"/>
       </w:pPr>
-      <w:bookmarkStart w:id="26" w:name="_Toc234343957"/>
+      <w:bookmarkStart w:id="26" w:name="_Toc234344379"/>
       <w:r>
         <w:lastRenderedPageBreak/>
         <w:t>8. GUI DESIGN EXPLANATION</w:t>
@@ -4589,7 +4589,7 @@
       <w:pPr>
         <w:pStyle w:val="Heading1"/>
       </w:pPr>
-      <w:bookmarkStart w:id="27" w:name="_Toc234343958"/>
+      <w:bookmarkStart w:id="27" w:name="_Toc234344380"/>
       <w:r>
         <w:lastRenderedPageBreak/>
         <w:t>9. OOP CONCEPTS IMPLEMENTED</w:t>
@@ -4600,7 +4600,7 @@
       <w:pPr>
         <w:pStyle w:val="Heading2"/>
       </w:pPr>
-      <w:bookmarkStart w:id="28" w:name="_Toc234343959"/>
+      <w:bookmarkStart w:id="28" w:name="_Toc234344381"/>
       <w:r>
         <w:t>9.1 Encapsulation</w:t>
       </w:r>
@@ -4621,7 +4621,7 @@
       <w:pPr>
         <w:pStyle w:val="Heading2"/>
       </w:pPr>
-      <w:bookmarkStart w:id="29" w:name="_Toc234343960"/>
+      <w:bookmarkStart w:id="29" w:name="_Toc234344382"/>
       <w:r>
         <w:t>9.2 Abstraction</w:t>
       </w:r>
@@ -4639,7 +4639,7 @@
       <w:pPr>
         <w:pStyle w:val="Heading2"/>
       </w:pPr>
-      <w:bookmarkStart w:id="30" w:name="_Toc234343961"/>
+      <w:bookmarkStart w:id="30" w:name="_Toc234344383"/>
       <w:r>
         <w:t>9.3 Inheritance</w:t>
       </w:r>
@@ -4660,7 +4660,7 @@
       <w:pPr>
         <w:pStyle w:val="Heading2"/>
       </w:pPr>
-      <w:bookmarkStart w:id="31" w:name="_Toc234343962"/>
+      <w:bookmarkStart w:id="31" w:name="_Toc234344384"/>
       <w:r>
         <w:t>9.4 Composition (contrasted with Inheritance)</w:t>
       </w:r>
@@ -4682,7 +4682,7 @@
       <w:pPr>
         <w:pStyle w:val="Heading2"/>
       </w:pPr>
-      <w:bookmarkStart w:id="32" w:name="_Toc234343963"/>
+      <w:bookmarkStart w:id="32" w:name="_Toc234344385"/>
       <w:r>
         <w:t>9.5 Polymorphism</w:t>
       </w:r>
@@ -4700,7 +4700,7 @@
       <w:pPr>
         <w:pStyle w:val="Heading2"/>
       </w:pPr>
-      <w:bookmarkStart w:id="33" w:name="_Toc234343964"/>
+      <w:bookmarkStart w:id="33" w:name="_Toc234344386"/>
       <w:r>
         <w:t>9.6 Generics</w:t>
       </w:r>
@@ -4718,7 +4718,7 @@
       <w:pPr>
         <w:pStyle w:val="Heading2"/>
       </w:pPr>
-      <w:bookmarkStart w:id="34" w:name="_Toc234343965"/>
+      <w:bookmarkStart w:id="34" w:name="_Toc234344387"/>
       <w:r>
         <w:t>9.7 Design Patterns Observed</w:t>
       </w:r>
@@ -4764,7 +4764,7 @@
       <w:pPr>
         <w:pStyle w:val="Heading1"/>
       </w:pPr>
-      <w:bookmarkStart w:id="35" w:name="_Toc234343966"/>
+      <w:bookmarkStart w:id="35" w:name="_Toc234344388"/>
       <w:r>
         <w:lastRenderedPageBreak/>
         <w:t>10. SCREENSHOTS AND OUTPUTS</w:t>
@@ -4793,7 +4793,7 @@
           <w:color w:val="808080"/>
         </w:rPr>
         <w:drawing>
-          <wp:inline distT="0" distB="0" distL="0" distR="0" wp14:anchorId="2E5D20A4" wp14:editId="29D7F118">
+          <wp:inline distT="0" distB="0" distL="0" distR="0" wp14:anchorId="2E5D20A4" wp14:editId="1DFA1748">
             <wp:extent cx="5334000" cy="2859024"/>
             <wp:effectExtent l="0" t="0" r="0" b="0"/>
             <wp:docPr id="714042723" name="Picture 1"/>
@@ -4870,7 +4870,7 @@
           <w:color w:val="808080"/>
         </w:rPr>
         <w:drawing>
-          <wp:inline distT="0" distB="0" distL="0" distR="0" wp14:anchorId="4CF482EC" wp14:editId="11028C95">
+          <wp:inline distT="0" distB="0" distL="0" distR="0" wp14:anchorId="4CF482EC" wp14:editId="711DC421">
             <wp:extent cx="5334000" cy="2857839"/>
             <wp:effectExtent l="0" t="0" r="0" b="0"/>
             <wp:docPr id="475526867" name="Picture 2"/>
@@ -4947,7 +4947,7 @@
           <w:color w:val="808080"/>
         </w:rPr>
         <w:drawing>
-          <wp:inline distT="0" distB="0" distL="0" distR="0" wp14:anchorId="49F4804B" wp14:editId="6DBD44BA">
+          <wp:inline distT="0" distB="0" distL="0" distR="0" wp14:anchorId="49F4804B" wp14:editId="589F44C3">
             <wp:extent cx="5334000" cy="2864951"/>
             <wp:effectExtent l="0" t="0" r="0" b="0"/>
             <wp:docPr id="1035878586" name="Picture 3"/>
@@ -5024,7 +5024,7 @@
           <w:color w:val="808080"/>
         </w:rPr>
         <w:drawing>
-          <wp:inline distT="0" distB="0" distL="0" distR="0" wp14:anchorId="01DB7F1B" wp14:editId="73786B67">
+          <wp:inline distT="0" distB="0" distL="0" distR="0" wp14:anchorId="01DB7F1B" wp14:editId="1E23A5E0">
             <wp:extent cx="5334000" cy="2848949"/>
             <wp:effectExtent l="0" t="0" r="0" b="8890"/>
             <wp:docPr id="1001767665" name="Picture 1"/>
@@ -5102,7 +5102,7 @@
         </w:rPr>
         <w:lastRenderedPageBreak/>
         <w:drawing>
-          <wp:inline distT="0" distB="0" distL="0" distR="0" wp14:anchorId="662AC6E3" wp14:editId="4648D74C">
+          <wp:inline distT="0" distB="0" distL="0" distR="0" wp14:anchorId="662AC6E3" wp14:editId="58610C59">
             <wp:extent cx="5334000" cy="2851912"/>
             <wp:effectExtent l="0" t="0" r="0" b="5715"/>
             <wp:docPr id="1466899551" name="Picture 2"/>
@@ -5179,7 +5179,7 @@
           <w:color w:val="808080"/>
         </w:rPr>
         <w:drawing>
-          <wp:inline distT="0" distB="0" distL="0" distR="0" wp14:anchorId="2A5D32E5" wp14:editId="165B43E8">
+          <wp:inline distT="0" distB="0" distL="0" distR="0" wp14:anchorId="2A5D32E5" wp14:editId="017DF65D">
             <wp:extent cx="5334000" cy="2867914"/>
             <wp:effectExtent l="0" t="0" r="0" b="8890"/>
             <wp:docPr id="1482432158" name="Picture 3"/>
@@ -5257,7 +5257,7 @@
         </w:rPr>
         <w:lastRenderedPageBreak/>
         <w:drawing>
-          <wp:inline distT="0" distB="0" distL="0" distR="0" wp14:anchorId="7B4227F2" wp14:editId="3D34317C">
+          <wp:inline distT="0" distB="0" distL="0" distR="0" wp14:anchorId="7B4227F2" wp14:editId="2CDEFC33">
             <wp:extent cx="5334000" cy="2850727"/>
             <wp:effectExtent l="0" t="0" r="0" b="6985"/>
             <wp:docPr id="675627804" name="Picture 4"/>
@@ -5334,7 +5334,7 @@
           <w:color w:val="808080"/>
         </w:rPr>
         <w:drawing>
-          <wp:inline distT="0" distB="0" distL="0" distR="0" wp14:anchorId="581A2707" wp14:editId="58B89B8C">
+          <wp:inline distT="0" distB="0" distL="0" distR="0" wp14:anchorId="581A2707" wp14:editId="48BD9A8D">
             <wp:extent cx="5334000" cy="2851319"/>
             <wp:effectExtent l="0" t="0" r="0" b="6350"/>
             <wp:docPr id="1229476174" name="Picture 5"/>
@@ -5412,7 +5412,7 @@
         </w:rPr>
         <w:lastRenderedPageBreak/>
         <w:drawing>
-          <wp:inline distT="0" distB="0" distL="0" distR="0" wp14:anchorId="3320E619" wp14:editId="79AF64BD">
+          <wp:inline distT="0" distB="0" distL="0" distR="0" wp14:anchorId="3320E619" wp14:editId="6A6F3E80">
             <wp:extent cx="5334000" cy="2856653"/>
             <wp:effectExtent l="0" t="0" r="0" b="1270"/>
             <wp:docPr id="270369643" name="Picture 6"/>
@@ -5489,7 +5489,7 @@
           <w:color w:val="808080"/>
         </w:rPr>
         <w:drawing>
-          <wp:inline distT="0" distB="0" distL="0" distR="0" wp14:anchorId="17182EA3" wp14:editId="189DD2DF">
+          <wp:inline distT="0" distB="0" distL="0" distR="0" wp14:anchorId="17182EA3" wp14:editId="0A2938A8">
             <wp:extent cx="5334000" cy="2848949"/>
             <wp:effectExtent l="0" t="0" r="0" b="8890"/>
             <wp:docPr id="1640305537" name="Picture 7"/>
@@ -5567,7 +5567,7 @@
         </w:rPr>
         <w:lastRenderedPageBreak/>
         <w:drawing>
-          <wp:inline distT="0" distB="0" distL="0" distR="0" wp14:anchorId="1CFE849D" wp14:editId="6E60F4D7">
+          <wp:inline distT="0" distB="0" distL="0" distR="0" wp14:anchorId="1CFE849D" wp14:editId="6B9D3C8F">
             <wp:extent cx="5334000" cy="2843615"/>
             <wp:effectExtent l="0" t="0" r="0" b="0"/>
             <wp:docPr id="1015366820" name="Picture 8"/>
@@ -5644,7 +5644,7 @@
           <w:color w:val="808080"/>
         </w:rPr>
         <w:drawing>
-          <wp:inline distT="0" distB="0" distL="0" distR="0" wp14:anchorId="73CC8328" wp14:editId="70BBC427">
+          <wp:inline distT="0" distB="0" distL="0" distR="0" wp14:anchorId="73CC8328" wp14:editId="3895F322">
             <wp:extent cx="5334000" cy="2846578"/>
             <wp:effectExtent l="0" t="0" r="0" b="0"/>
             <wp:docPr id="79470811" name="Picture 9"/>
@@ -5722,7 +5722,7 @@
         </w:rPr>
         <w:lastRenderedPageBreak/>
         <w:drawing>
-          <wp:inline distT="0" distB="0" distL="0" distR="0" wp14:anchorId="7B1ABBE9" wp14:editId="0C493D27">
+          <wp:inline distT="0" distB="0" distL="0" distR="0" wp14:anchorId="7B1ABBE9" wp14:editId="5230E389">
             <wp:extent cx="5334000" cy="2862580"/>
             <wp:effectExtent l="0" t="0" r="0" b="0"/>
             <wp:docPr id="282877113" name="Picture 10"/>
@@ -5799,7 +5799,7 @@
           <w:color w:val="808080"/>
         </w:rPr>
         <w:drawing>
-          <wp:inline distT="0" distB="0" distL="0" distR="0" wp14:anchorId="034E2001" wp14:editId="4DBAA498">
+          <wp:inline distT="0" distB="0" distL="0" distR="0" wp14:anchorId="034E2001" wp14:editId="3628B191">
             <wp:extent cx="5334000" cy="2851912"/>
             <wp:effectExtent l="0" t="0" r="0" b="5715"/>
             <wp:docPr id="426359504" name="Picture 4"/>
@@ -5877,7 +5877,7 @@
         </w:rPr>
         <w:lastRenderedPageBreak/>
         <w:drawing>
-          <wp:inline distT="0" distB="0" distL="0" distR="0" wp14:anchorId="62F32EFC" wp14:editId="7A5FF158">
+          <wp:inline distT="0" distB="0" distL="0" distR="0" wp14:anchorId="62F32EFC" wp14:editId="11A305F8">
             <wp:extent cx="5334000" cy="2864951"/>
             <wp:effectExtent l="0" t="0" r="0" b="0"/>
             <wp:docPr id="370561034" name="Picture 5"/>
@@ -5944,7 +5944,7 @@
       <w:pPr>
         <w:pStyle w:val="Heading1"/>
       </w:pPr>
-      <w:bookmarkStart w:id="36" w:name="_Toc234343967"/>
+      <w:bookmarkStart w:id="36" w:name="_Toc234344389"/>
       <w:r>
         <w:lastRenderedPageBreak/>
         <w:t>11. GITHUB REPOSITORY LINK</w:t>
@@ -5974,7 +5974,7 @@
       <w:pPr>
         <w:pStyle w:val="Heading1"/>
       </w:pPr>
-      <w:bookmarkStart w:id="37" w:name="_Toc234343968"/>
+      <w:bookmarkStart w:id="37" w:name="_Toc234344390"/>
       <w:r>
         <w:lastRenderedPageBreak/>
         <w:t>12. CHALLENGES ENCOUNTERED</w:t>
@@ -6057,7 +6057,7 @@
       <w:pPr>
         <w:pStyle w:val="Heading1"/>
       </w:pPr>
-      <w:bookmarkStart w:id="38" w:name="_Toc234343969"/>
+      <w:bookmarkStart w:id="38" w:name="_Toc234344391"/>
       <w:r>
         <w:lastRenderedPageBreak/>
         <w:t>13. CONCLUSION</w:t>
@@ -6079,7 +6079,7 @@
       <w:pPr>
         <w:pStyle w:val="Heading1"/>
       </w:pPr>
-      <w:bookmarkStart w:id="39" w:name="_Toc234343970"/>
+      <w:bookmarkStart w:id="39" w:name="_Toc234344392"/>
       <w:r>
         <w:lastRenderedPageBreak/>
         <w:t>14. RECOMMENDATIONS</w:t>
@@ -6162,7 +6162,7 @@
       <w:pPr>
         <w:pStyle w:val="Heading1"/>
       </w:pPr>
-      <w:bookmarkStart w:id="40" w:name="_Toc234343971"/>
+      <w:bookmarkStart w:id="40" w:name="_Toc234344393"/>
       <w:r>
         <w:lastRenderedPageBreak/>
         <w:t>15. REFERENCES</w:t>
@@ -6221,7 +6221,7 @@
       <w:pPr>
         <w:pStyle w:val="Heading1"/>
       </w:pPr>
-      <w:bookmarkStart w:id="41" w:name="_Toc234343972"/>
+      <w:bookmarkStart w:id="41" w:name="_Toc234344394"/>
       <w:r>
         <w:lastRenderedPageBreak/>
         <w:t>APPENDIX: ADDITIONAL SCREENSHOTS</w:t>
@@ -6336,7 +6336,7 @@
         </w:rPr>
         <w:lastRenderedPageBreak/>
         <w:drawing>
-          <wp:inline distT="0" distB="0" distL="0" distR="0" wp14:anchorId="20C21B47" wp14:editId="30319CFA">
+          <wp:inline distT="0" distB="0" distL="0" distR="0" wp14:anchorId="20C21B47" wp14:editId="7B0533D9">
             <wp:extent cx="5334000" cy="2863173"/>
             <wp:effectExtent l="0" t="0" r="0" b="0"/>
             <wp:docPr id="1421574492" name="Picture 19"/>
@@ -6385,7 +6385,7 @@
           <w:noProof/>
         </w:rPr>
         <w:drawing>
-          <wp:inline distT="0" distB="0" distL="0" distR="0" wp14:anchorId="4CD90A38" wp14:editId="0E85704B">
+          <wp:inline distT="0" distB="0" distL="0" distR="0" wp14:anchorId="4CD90A38" wp14:editId="2C9C1603">
             <wp:extent cx="5334000" cy="2857839"/>
             <wp:effectExtent l="0" t="0" r="0" b="0"/>
             <wp:docPr id="1726641900" name="Picture 18"/>
@@ -6435,7 +6435,7 @@
         </w:rPr>
         <w:lastRenderedPageBreak/>
         <w:drawing>
-          <wp:inline distT="0" distB="0" distL="0" distR="0" wp14:anchorId="3B7FA71C" wp14:editId="3B06CA23">
+          <wp:inline distT="0" distB="0" distL="0" distR="0" wp14:anchorId="3B7FA71C" wp14:editId="46184857">
             <wp:extent cx="5334000" cy="2869099"/>
             <wp:effectExtent l="0" t="0" r="0" b="7620"/>
             <wp:docPr id="815747" name="Picture 17"/>
@@ -6484,7 +6484,7 @@
           <w:noProof/>
         </w:rPr>
         <w:drawing>
-          <wp:inline distT="0" distB="0" distL="0" distR="0" wp14:anchorId="17D0CB7A" wp14:editId="5CDA3A98">
+          <wp:inline distT="0" distB="0" distL="0" distR="0" wp14:anchorId="17D0CB7A" wp14:editId="05CA89E2">
             <wp:extent cx="5334000" cy="2864951"/>
             <wp:effectExtent l="0" t="0" r="0" b="0"/>
             <wp:docPr id="1213715378" name="Picture 16"/>
@@ -6534,7 +6534,7 @@
         </w:rPr>
         <w:lastRenderedPageBreak/>
         <w:drawing>
-          <wp:inline distT="0" distB="0" distL="0" distR="0" wp14:anchorId="27634D9D" wp14:editId="2A06AAFB">
+          <wp:inline distT="0" distB="0" distL="0" distR="0" wp14:anchorId="27634D9D" wp14:editId="3AF5E121">
             <wp:extent cx="5334000" cy="2861987"/>
             <wp:effectExtent l="0" t="0" r="0" b="0"/>
             <wp:docPr id="400585266" name="Picture 15"/>
@@ -6583,7 +6583,7 @@
           <w:noProof/>
         </w:rPr>
         <w:drawing>
-          <wp:inline distT="0" distB="0" distL="0" distR="0" wp14:anchorId="5C8141D3" wp14:editId="569194CF">
+          <wp:inline distT="0" distB="0" distL="0" distR="0" wp14:anchorId="5C8141D3" wp14:editId="007F9EA5">
             <wp:extent cx="5334000" cy="2834132"/>
             <wp:effectExtent l="0" t="0" r="0" b="4445"/>
             <wp:docPr id="2984802" name="Picture 14"/>
@@ -6633,7 +6633,7 @@
         </w:rPr>
         <w:lastRenderedPageBreak/>
         <w:drawing>
-          <wp:inline distT="0" distB="0" distL="0" distR="0" wp14:anchorId="1EFA47C3" wp14:editId="4FA0600C">
+          <wp:inline distT="0" distB="0" distL="0" distR="0" wp14:anchorId="1EFA47C3" wp14:editId="35BF21C7">
             <wp:extent cx="5334000" cy="2859024"/>
             <wp:effectExtent l="0" t="0" r="0" b="0"/>
             <wp:docPr id="186290466" name="Picture 13"/>
@@ -6682,7 +6682,7 @@
           <w:noProof/>
         </w:rPr>
         <w:drawing>
-          <wp:inline distT="0" distB="0" distL="0" distR="0" wp14:anchorId="4D8A47FE" wp14:editId="116E4D83">
+          <wp:inline distT="0" distB="0" distL="0" distR="0" wp14:anchorId="4D8A47FE" wp14:editId="7640F9E1">
             <wp:extent cx="5334000" cy="2850727"/>
             <wp:effectExtent l="0" t="0" r="0" b="6985"/>
             <wp:docPr id="1472171324" name="Picture 12"/>
@@ -6732,7 +6732,7 @@
         </w:rPr>
         <w:lastRenderedPageBreak/>
         <w:drawing>
-          <wp:inline distT="0" distB="0" distL="0" distR="0" wp14:anchorId="3B9F7E2E" wp14:editId="7696C772">
+          <wp:inline distT="0" distB="0" distL="0" distR="0" wp14:anchorId="3B9F7E2E" wp14:editId="04A98431">
             <wp:extent cx="5334000" cy="2850727"/>
             <wp:effectExtent l="0" t="0" r="0" b="6985"/>
             <wp:docPr id="775680071" name="Picture 11"/>
@@ -6781,7 +6781,7 @@
           <w:noProof/>
         </w:rPr>
         <w:drawing>
-          <wp:inline distT="0" distB="0" distL="0" distR="0" wp14:anchorId="73CA01E4" wp14:editId="0950AA02">
+          <wp:inline distT="0" distB="0" distL="0" distR="0" wp14:anchorId="73CA01E4" wp14:editId="7A46AEB6">
             <wp:extent cx="5334000" cy="2873841"/>
             <wp:effectExtent l="0" t="0" r="0" b="3175"/>
             <wp:docPr id="1137513282" name="Picture 10"/>
@@ -6831,7 +6831,7 @@
         </w:rPr>
         <w:lastRenderedPageBreak/>
         <w:drawing>
-          <wp:inline distT="0" distB="0" distL="0" distR="0" wp14:anchorId="701D6845" wp14:editId="3AD7F14B">
+          <wp:inline distT="0" distB="0" distL="0" distR="0" wp14:anchorId="701D6845" wp14:editId="2D0D8226">
             <wp:extent cx="5334000" cy="2856061"/>
             <wp:effectExtent l="0" t="0" r="0" b="1905"/>
             <wp:docPr id="392809353" name="Picture 9"/>
@@ -6880,7 +6880,7 @@
           <w:noProof/>
         </w:rPr>
         <w:drawing>
-          <wp:inline distT="0" distB="0" distL="0" distR="0" wp14:anchorId="14C9B7A5" wp14:editId="4C5D8584">
+          <wp:inline distT="0" distB="0" distL="0" distR="0" wp14:anchorId="14C9B7A5" wp14:editId="4715DEB4">
             <wp:extent cx="5334000" cy="2853690"/>
             <wp:effectExtent l="0" t="0" r="0" b="3810"/>
             <wp:docPr id="231558410" name="Picture 8"/>
@@ -6930,7 +6930,7 @@
         </w:rPr>
         <w:lastRenderedPageBreak/>
         <w:drawing>
-          <wp:inline distT="0" distB="0" distL="0" distR="0" wp14:anchorId="6F961963" wp14:editId="0A0A68A7">
+          <wp:inline distT="0" distB="0" distL="0" distR="0" wp14:anchorId="6F961963" wp14:editId="2C6C0558">
             <wp:extent cx="5334000" cy="2866136"/>
             <wp:effectExtent l="0" t="0" r="0" b="0"/>
             <wp:docPr id="2037957742" name="Picture 7"/>
@@ -6979,7 +6979,7 @@
           <w:noProof/>
         </w:rPr>
         <w:drawing>
-          <wp:inline distT="0" distB="0" distL="0" distR="0" wp14:anchorId="14E91590" wp14:editId="651C4EDD">
+          <wp:inline distT="0" distB="0" distL="0" distR="0" wp14:anchorId="14E91590" wp14:editId="756485C0">
             <wp:extent cx="5334000" cy="2866136"/>
             <wp:effectExtent l="0" t="0" r="0" b="0"/>
             <wp:docPr id="1797213203" name="Picture 6"/>
@@ -7029,7 +7029,7 @@
         </w:rPr>
         <w:lastRenderedPageBreak/>
         <w:drawing>
-          <wp:inline distT="0" distB="0" distL="0" distR="0" wp14:anchorId="0C064CE7" wp14:editId="1DF1ECF6">
+          <wp:inline distT="0" distB="0" distL="0" distR="0" wp14:anchorId="0C064CE7" wp14:editId="4D55F353">
             <wp:extent cx="5334000" cy="2856061"/>
             <wp:effectExtent l="0" t="0" r="0" b="1905"/>
             <wp:docPr id="1158350721" name="Picture 5"/>
@@ -7078,7 +7078,7 @@
           <w:noProof/>
         </w:rPr>
         <w:drawing>
-          <wp:inline distT="0" distB="0" distL="0" distR="0" wp14:anchorId="4515E4C2" wp14:editId="3C6230AB">
+          <wp:inline distT="0" distB="0" distL="0" distR="0" wp14:anchorId="4515E4C2" wp14:editId="3339D966">
             <wp:extent cx="5334000" cy="2856653"/>
             <wp:effectExtent l="0" t="0" r="0" b="1270"/>
             <wp:docPr id="1504313374" name="Picture 4"/>
@@ -7128,7 +7128,7 @@
         </w:rPr>
         <w:lastRenderedPageBreak/>
         <w:drawing>
-          <wp:inline distT="0" distB="0" distL="0" distR="0" wp14:anchorId="285AAC3D" wp14:editId="7334670C">
+          <wp:inline distT="0" distB="0" distL="0" distR="0" wp14:anchorId="285AAC3D" wp14:editId="0D3B33AB">
             <wp:extent cx="5334000" cy="2860209"/>
             <wp:effectExtent l="0" t="0" r="0" b="0"/>
             <wp:docPr id="244583896" name="Picture 3"/>
@@ -7177,7 +7177,7 @@
           <w:noProof/>
         </w:rPr>
         <w:drawing>
-          <wp:inline distT="0" distB="0" distL="0" distR="0" wp14:anchorId="35C84DAB" wp14:editId="7700C28C">
+          <wp:inline distT="0" distB="0" distL="0" distR="0" wp14:anchorId="35C84DAB" wp14:editId="6B96A4BF">
             <wp:extent cx="5334000" cy="2868507"/>
             <wp:effectExtent l="0" t="0" r="0" b="8255"/>
             <wp:docPr id="1429167751" name="Picture 2"/>
@@ -7227,7 +7227,7 @@
         </w:rPr>
         <w:lastRenderedPageBreak/>
         <w:drawing>
-          <wp:inline distT="0" distB="0" distL="0" distR="0" wp14:anchorId="22191274" wp14:editId="63816B5D">
+          <wp:inline distT="0" distB="0" distL="0" distR="0" wp14:anchorId="22191274" wp14:editId="05D8DCAE">
             <wp:extent cx="5334000" cy="2864358"/>
             <wp:effectExtent l="0" t="0" r="0" b="0"/>
             <wp:docPr id="47709248" name="Picture 1"/>
@@ -7323,6 +7323,170 @@
         </w:drawing>
       </w:r>
     </w:p>
+    <w:p>
+      <w:r>
+        <w:t>Figure A21: Login screen</w:t>
+      </w:r>
+    </w:p>
+    <w:p>
+      <w:r>
+        <w:rPr>
+          <w:noProof/>
+        </w:rPr>
+        <w:lastRenderedPageBreak/>
+        <w:drawing>
+          <wp:inline distT="0" distB="0" distL="0" distR="0" wp14:anchorId="76A7A420" wp14:editId="46FFE0F2">
+            <wp:extent cx="4826000" cy="5101116"/>
+            <wp:effectExtent l="0" t="0" r="0" b="4445"/>
+            <wp:docPr id="917371263" name="Picture 1"/>
+            <wp:cNvGraphicFramePr>
+              <a:graphicFrameLocks xmlns:a="http://schemas.openxmlformats.org/drawingml/2006/main" noChangeAspect="1"/>
+            </wp:cNvGraphicFramePr>
+            <a:graphic xmlns:a="http://schemas.openxmlformats.org/drawingml/2006/main">
+              <a:graphicData uri="http://schemas.openxmlformats.org/drawingml/2006/picture">
+                <pic:pic xmlns:pic="http://schemas.openxmlformats.org/drawingml/2006/picture">
+                  <pic:nvPicPr>
+                    <pic:cNvPr id="917371263" name=""/>
+                    <pic:cNvPicPr/>
+                  </pic:nvPicPr>
+                  <pic:blipFill>
+                    <a:blip r:embed="rId40">
+                      <a:extLst>
+                        <a:ext uri="{28A0092B-C50C-407E-A947-70E740481C1C}">
+                          <a14:useLocalDpi xmlns:a14="http://schemas.microsoft.com/office/drawing/2010/main" val="0"/>
+                        </a:ext>
+                      </a:extLst>
+                    </a:blip>
+                    <a:stretch>
+                      <a:fillRect/>
+                    </a:stretch>
+                  </pic:blipFill>
+                  <pic:spPr>
+                    <a:xfrm>
+                      <a:off x="0" y="0"/>
+                      <a:ext cx="4826000" cy="5101116"/>
+                    </a:xfrm>
+                    <a:prstGeom prst="rect">
+                      <a:avLst/>
+                    </a:prstGeom>
+                  </pic:spPr>
+                </pic:pic>
+              </a:graphicData>
+            </a:graphic>
+          </wp:inline>
+        </w:drawing>
+      </w:r>
+    </w:p>
+    <w:p/>
+    <w:p>
+      <w:r>
+        <w:t>Figure A22: Home dashboard - logged-in header with Change Password / Logout and the User Management sidebar entry</w:t>
+      </w:r>
+    </w:p>
+    <w:p>
+      <w:r>
+        <w:rPr>
+          <w:noProof/>
+        </w:rPr>
+        <w:lastRenderedPageBreak/>
+        <w:drawing>
+          <wp:inline distT="0" distB="0" distL="0" distR="0" wp14:anchorId="7E0B940B" wp14:editId="2029FCED">
+            <wp:extent cx="4826000" cy="2604968"/>
+            <wp:effectExtent l="0" t="0" r="0" b="5080"/>
+            <wp:docPr id="291215042" name="Picture 2"/>
+            <wp:cNvGraphicFramePr>
+              <a:graphicFrameLocks xmlns:a="http://schemas.openxmlformats.org/drawingml/2006/main" noChangeAspect="1"/>
+            </wp:cNvGraphicFramePr>
+            <a:graphic xmlns:a="http://schemas.openxmlformats.org/drawingml/2006/main">
+              <a:graphicData uri="http://schemas.openxmlformats.org/drawingml/2006/picture">
+                <pic:pic xmlns:pic="http://schemas.openxmlformats.org/drawingml/2006/picture">
+                  <pic:nvPicPr>
+                    <pic:cNvPr id="291215042" name=""/>
+                    <pic:cNvPicPr/>
+                  </pic:nvPicPr>
+                  <pic:blipFill>
+                    <a:blip r:embed="rId41" cstate="print">
+                      <a:extLst>
+                        <a:ext uri="{28A0092B-C50C-407E-A947-70E740481C1C}">
+                          <a14:useLocalDpi xmlns:a14="http://schemas.microsoft.com/office/drawing/2010/main" val="0"/>
+                        </a:ext>
+                      </a:extLst>
+                    </a:blip>
+                    <a:stretch>
+                      <a:fillRect/>
+                    </a:stretch>
+                  </pic:blipFill>
+                  <pic:spPr>
+                    <a:xfrm>
+                      <a:off x="0" y="0"/>
+                      <a:ext cx="4826000" cy="2604968"/>
+                    </a:xfrm>
+                    <a:prstGeom prst="rect">
+                      <a:avLst/>
+                    </a:prstGeom>
+                  </pic:spPr>
+                </pic:pic>
+              </a:graphicData>
+            </a:graphic>
+          </wp:inline>
+        </w:drawing>
+      </w:r>
+    </w:p>
+    <w:p/>
+    <w:p>
+      <w:r>
+        <w:t>Figure A23: User Management - account list with Activate/Deactivate and Reset Password actions</w:t>
+      </w:r>
+    </w:p>
+    <w:p>
+      <w:r>
+        <w:rPr>
+          <w:noProof/>
+        </w:rPr>
+        <w:drawing>
+          <wp:inline distT="0" distB="0" distL="0" distR="0" wp14:anchorId="7432B6EE" wp14:editId="2D5E9294">
+            <wp:extent cx="4826000" cy="2596924"/>
+            <wp:effectExtent l="0" t="0" r="0" b="0"/>
+            <wp:docPr id="279722001" name="Picture 3"/>
+            <wp:cNvGraphicFramePr>
+              <a:graphicFrameLocks xmlns:a="http://schemas.openxmlformats.org/drawingml/2006/main" noChangeAspect="1"/>
+            </wp:cNvGraphicFramePr>
+            <a:graphic xmlns:a="http://schemas.openxmlformats.org/drawingml/2006/main">
+              <a:graphicData uri="http://schemas.openxmlformats.org/drawingml/2006/picture">
+                <pic:pic xmlns:pic="http://schemas.openxmlformats.org/drawingml/2006/picture">
+                  <pic:nvPicPr>
+                    <pic:cNvPr id="279722001" name=""/>
+                    <pic:cNvPicPr/>
+                  </pic:nvPicPr>
+                  <pic:blipFill>
+                    <a:blip r:embed="rId42" cstate="print">
+                      <a:extLst>
+                        <a:ext uri="{28A0092B-C50C-407E-A947-70E740481C1C}">
+                          <a14:useLocalDpi xmlns:a14="http://schemas.microsoft.com/office/drawing/2010/main" val="0"/>
+                        </a:ext>
+                      </a:extLst>
+                    </a:blip>
+                    <a:stretch>
+                      <a:fillRect/>
+                    </a:stretch>
+                  </pic:blipFill>
+                  <pic:spPr>
+                    <a:xfrm>
+                      <a:off x="0" y="0"/>
+                      <a:ext cx="4826000" cy="2596924"/>
+                    </a:xfrm>
+                    <a:prstGeom prst="rect">
+                      <a:avLst/>
+                    </a:prstGeom>
+                  </pic:spPr>
+                </pic:pic>
+              </a:graphicData>
+            </a:graphic>
+          </wp:inline>
+        </w:drawing>
+      </w:r>
+    </w:p>
+    <w:p/>
     <w:p/>
     <w:sectPr>
       <w:pgSz w:w="12240" w:h="15840"/>

</xml_diff>

<commit_message>
Move additional screenshots into Section 10, renumber Figures 15-38
</commit_message>
<xml_diff>
--- a/HospitalGUI_Technical_Report.docx
+++ b/HospitalGUI_Technical_Report.docx
@@ -242,7 +242,7 @@
       <w:r>
         <w:fldChar w:fldCharType="separate"/>
       </w:r>
-      <w:hyperlink w:anchor="_Toc234344353" w:history="1">
+      <w:hyperlink w:anchor="_Toc234347448" w:history="1">
         <w:r>
           <w:rPr>
             <w:rStyle w:val="Hyperlink"/>
@@ -266,7 +266,7 @@
           <w:rPr>
             <w:noProof/>
           </w:rPr>
-          <w:instrText xml:space="preserve"> PAGEREF _Toc234344353 \h </w:instrText>
+          <w:instrText xml:space="preserve"> PAGEREF _Toc234347448 \h </w:instrText>
         </w:r>
         <w:r>
           <w:rPr>
@@ -305,7 +305,7 @@
           <w:sz w:val="24"/>
         </w:rPr>
       </w:pPr>
-      <w:hyperlink w:anchor="_Toc234344354" w:history="1">
+      <w:hyperlink w:anchor="_Toc234347449" w:history="1">
         <w:r>
           <w:rPr>
             <w:rStyle w:val="Hyperlink"/>
@@ -329,7 +329,7 @@
           <w:rPr>
             <w:noProof/>
           </w:rPr>
-          <w:instrText xml:space="preserve"> PAGEREF _Toc234344354 \h </w:instrText>
+          <w:instrText xml:space="preserve"> PAGEREF _Toc234347449 \h </w:instrText>
         </w:r>
         <w:r>
           <w:rPr>
@@ -368,7 +368,7 @@
           <w:sz w:val="24"/>
         </w:rPr>
       </w:pPr>
-      <w:hyperlink w:anchor="_Toc234344355" w:history="1">
+      <w:hyperlink w:anchor="_Toc234347450" w:history="1">
         <w:r>
           <w:rPr>
             <w:rStyle w:val="Hyperlink"/>
@@ -392,7 +392,7 @@
           <w:rPr>
             <w:noProof/>
           </w:rPr>
-          <w:instrText xml:space="preserve"> PAGEREF _Toc234344355 \h </w:instrText>
+          <w:instrText xml:space="preserve"> PAGEREF _Toc234347450 \h </w:instrText>
         </w:r>
         <w:r>
           <w:rPr>
@@ -431,7 +431,7 @@
           <w:sz w:val="24"/>
         </w:rPr>
       </w:pPr>
-      <w:hyperlink w:anchor="_Toc234344356" w:history="1">
+      <w:hyperlink w:anchor="_Toc234347451" w:history="1">
         <w:r>
           <w:rPr>
             <w:rStyle w:val="Hyperlink"/>
@@ -455,7 +455,7 @@
           <w:rPr>
             <w:noProof/>
           </w:rPr>
-          <w:instrText xml:space="preserve"> PAGEREF _Toc234344356 \h </w:instrText>
+          <w:instrText xml:space="preserve"> PAGEREF _Toc234347451 \h </w:instrText>
         </w:r>
         <w:r>
           <w:rPr>
@@ -494,7 +494,7 @@
           <w:sz w:val="24"/>
         </w:rPr>
       </w:pPr>
-      <w:hyperlink w:anchor="_Toc234344357" w:history="1">
+      <w:hyperlink w:anchor="_Toc234347452" w:history="1">
         <w:r>
           <w:rPr>
             <w:rStyle w:val="Hyperlink"/>
@@ -518,7 +518,7 @@
           <w:rPr>
             <w:noProof/>
           </w:rPr>
-          <w:instrText xml:space="preserve"> PAGEREF _Toc234344357 \h </w:instrText>
+          <w:instrText xml:space="preserve"> PAGEREF _Toc234347452 \h </w:instrText>
         </w:r>
         <w:r>
           <w:rPr>
@@ -557,7 +557,7 @@
           <w:sz w:val="24"/>
         </w:rPr>
       </w:pPr>
-      <w:hyperlink w:anchor="_Toc234344358" w:history="1">
+      <w:hyperlink w:anchor="_Toc234347453" w:history="1">
         <w:r>
           <w:rPr>
             <w:rStyle w:val="Hyperlink"/>
@@ -581,7 +581,7 @@
           <w:rPr>
             <w:noProof/>
           </w:rPr>
-          <w:instrText xml:space="preserve"> PAGEREF _Toc234344358 \h </w:instrText>
+          <w:instrText xml:space="preserve"> PAGEREF _Toc234347453 \h </w:instrText>
         </w:r>
         <w:r>
           <w:rPr>
@@ -620,7 +620,7 @@
           <w:sz w:val="24"/>
         </w:rPr>
       </w:pPr>
-      <w:hyperlink w:anchor="_Toc234344359" w:history="1">
+      <w:hyperlink w:anchor="_Toc234347454" w:history="1">
         <w:r>
           <w:rPr>
             <w:rStyle w:val="Hyperlink"/>
@@ -644,7 +644,7 @@
           <w:rPr>
             <w:noProof/>
           </w:rPr>
-          <w:instrText xml:space="preserve"> PAGEREF _Toc234344359 \h </w:instrText>
+          <w:instrText xml:space="preserve"> PAGEREF _Toc234347454 \h </w:instrText>
         </w:r>
         <w:r>
           <w:rPr>
@@ -683,7 +683,7 @@
           <w:sz w:val="24"/>
         </w:rPr>
       </w:pPr>
-      <w:hyperlink w:anchor="_Toc234344360" w:history="1">
+      <w:hyperlink w:anchor="_Toc234347455" w:history="1">
         <w:r>
           <w:rPr>
             <w:rStyle w:val="Hyperlink"/>
@@ -707,7 +707,7 @@
           <w:rPr>
             <w:noProof/>
           </w:rPr>
-          <w:instrText xml:space="preserve"> PAGEREF _Toc234344360 \h </w:instrText>
+          <w:instrText xml:space="preserve"> PAGEREF _Toc234347455 \h </w:instrText>
         </w:r>
         <w:r>
           <w:rPr>
@@ -746,7 +746,7 @@
           <w:sz w:val="24"/>
         </w:rPr>
       </w:pPr>
-      <w:hyperlink w:anchor="_Toc234344361" w:history="1">
+      <w:hyperlink w:anchor="_Toc234347456" w:history="1">
         <w:r>
           <w:rPr>
             <w:rStyle w:val="Hyperlink"/>
@@ -770,7 +770,7 @@
           <w:rPr>
             <w:noProof/>
           </w:rPr>
-          <w:instrText xml:space="preserve"> PAGEREF _Toc234344361 \h </w:instrText>
+          <w:instrText xml:space="preserve"> PAGEREF _Toc234347456 \h </w:instrText>
         </w:r>
         <w:r>
           <w:rPr>
@@ -809,7 +809,7 @@
           <w:sz w:val="24"/>
         </w:rPr>
       </w:pPr>
-      <w:hyperlink w:anchor="_Toc234344362" w:history="1">
+      <w:hyperlink w:anchor="_Toc234347457" w:history="1">
         <w:r>
           <w:rPr>
             <w:rStyle w:val="Hyperlink"/>
@@ -833,7 +833,7 @@
           <w:rPr>
             <w:noProof/>
           </w:rPr>
-          <w:instrText xml:space="preserve"> PAGEREF _Toc234344362 \h </w:instrText>
+          <w:instrText xml:space="preserve"> PAGEREF _Toc234347457 \h </w:instrText>
         </w:r>
         <w:r>
           <w:rPr>
@@ -872,7 +872,7 @@
           <w:sz w:val="24"/>
         </w:rPr>
       </w:pPr>
-      <w:hyperlink w:anchor="_Toc234344363" w:history="1">
+      <w:hyperlink w:anchor="_Toc234347458" w:history="1">
         <w:r>
           <w:rPr>
             <w:rStyle w:val="Hyperlink"/>
@@ -896,7 +896,7 @@
           <w:rPr>
             <w:noProof/>
           </w:rPr>
-          <w:instrText xml:space="preserve"> PAGEREF _Toc234344363 \h </w:instrText>
+          <w:instrText xml:space="preserve"> PAGEREF _Toc234347458 \h </w:instrText>
         </w:r>
         <w:r>
           <w:rPr>
@@ -935,7 +935,7 @@
           <w:sz w:val="24"/>
         </w:rPr>
       </w:pPr>
-      <w:hyperlink w:anchor="_Toc234344364" w:history="1">
+      <w:hyperlink w:anchor="_Toc234347459" w:history="1">
         <w:r>
           <w:rPr>
             <w:rStyle w:val="Hyperlink"/>
@@ -959,7 +959,7 @@
           <w:rPr>
             <w:noProof/>
           </w:rPr>
-          <w:instrText xml:space="preserve"> PAGEREF _Toc234344364 \h </w:instrText>
+          <w:instrText xml:space="preserve"> PAGEREF _Toc234347459 \h </w:instrText>
         </w:r>
         <w:r>
           <w:rPr>
@@ -998,7 +998,7 @@
           <w:sz w:val="24"/>
         </w:rPr>
       </w:pPr>
-      <w:hyperlink w:anchor="_Toc234344365" w:history="1">
+      <w:hyperlink w:anchor="_Toc234347460" w:history="1">
         <w:r>
           <w:rPr>
             <w:rStyle w:val="Hyperlink"/>
@@ -1022,7 +1022,7 @@
           <w:rPr>
             <w:noProof/>
           </w:rPr>
-          <w:instrText xml:space="preserve"> PAGEREF _Toc234344365 \h </w:instrText>
+          <w:instrText xml:space="preserve"> PAGEREF _Toc234347460 \h </w:instrText>
         </w:r>
         <w:r>
           <w:rPr>
@@ -1061,7 +1061,7 @@
           <w:sz w:val="24"/>
         </w:rPr>
       </w:pPr>
-      <w:hyperlink w:anchor="_Toc234344366" w:history="1">
+      <w:hyperlink w:anchor="_Toc234347461" w:history="1">
         <w:r>
           <w:rPr>
             <w:rStyle w:val="Hyperlink"/>
@@ -1085,7 +1085,7 @@
           <w:rPr>
             <w:noProof/>
           </w:rPr>
-          <w:instrText xml:space="preserve"> PAGEREF _Toc234344366 \h </w:instrText>
+          <w:instrText xml:space="preserve"> PAGEREF _Toc234347461 \h </w:instrText>
         </w:r>
         <w:r>
           <w:rPr>
@@ -1124,7 +1124,7 @@
           <w:sz w:val="24"/>
         </w:rPr>
       </w:pPr>
-      <w:hyperlink w:anchor="_Toc234344367" w:history="1">
+      <w:hyperlink w:anchor="_Toc234347462" w:history="1">
         <w:r>
           <w:rPr>
             <w:rStyle w:val="Hyperlink"/>
@@ -1148,7 +1148,7 @@
           <w:rPr>
             <w:noProof/>
           </w:rPr>
-          <w:instrText xml:space="preserve"> PAGEREF _Toc234344367 \h </w:instrText>
+          <w:instrText xml:space="preserve"> PAGEREF _Toc234347462 \h </w:instrText>
         </w:r>
         <w:r>
           <w:rPr>
@@ -1187,7 +1187,7 @@
           <w:sz w:val="24"/>
         </w:rPr>
       </w:pPr>
-      <w:hyperlink w:anchor="_Toc234344368" w:history="1">
+      <w:hyperlink w:anchor="_Toc234347463" w:history="1">
         <w:r>
           <w:rPr>
             <w:rStyle w:val="Hyperlink"/>
@@ -1211,7 +1211,7 @@
           <w:rPr>
             <w:noProof/>
           </w:rPr>
-          <w:instrText xml:space="preserve"> PAGEREF _Toc234344368 \h </w:instrText>
+          <w:instrText xml:space="preserve"> PAGEREF _Toc234347463 \h </w:instrText>
         </w:r>
         <w:r>
           <w:rPr>
@@ -1250,7 +1250,7 @@
           <w:sz w:val="24"/>
         </w:rPr>
       </w:pPr>
-      <w:hyperlink w:anchor="_Toc234344369" w:history="1">
+      <w:hyperlink w:anchor="_Toc234347464" w:history="1">
         <w:r>
           <w:rPr>
             <w:rStyle w:val="Hyperlink"/>
@@ -1274,7 +1274,7 @@
           <w:rPr>
             <w:noProof/>
           </w:rPr>
-          <w:instrText xml:space="preserve"> PAGEREF _Toc234344369 \h </w:instrText>
+          <w:instrText xml:space="preserve"> PAGEREF _Toc234347464 \h </w:instrText>
         </w:r>
         <w:r>
           <w:rPr>
@@ -1313,7 +1313,7 @@
           <w:sz w:val="24"/>
         </w:rPr>
       </w:pPr>
-      <w:hyperlink w:anchor="_Toc234344370" w:history="1">
+      <w:hyperlink w:anchor="_Toc234347465" w:history="1">
         <w:r>
           <w:rPr>
             <w:rStyle w:val="Hyperlink"/>
@@ -1337,7 +1337,7 @@
           <w:rPr>
             <w:noProof/>
           </w:rPr>
-          <w:instrText xml:space="preserve"> PAGEREF _Toc234344370 \h </w:instrText>
+          <w:instrText xml:space="preserve"> PAGEREF _Toc234347465 \h </w:instrText>
         </w:r>
         <w:r>
           <w:rPr>
@@ -1376,7 +1376,7 @@
           <w:sz w:val="24"/>
         </w:rPr>
       </w:pPr>
-      <w:hyperlink w:anchor="_Toc234344371" w:history="1">
+      <w:hyperlink w:anchor="_Toc234347466" w:history="1">
         <w:r>
           <w:rPr>
             <w:rStyle w:val="Hyperlink"/>
@@ -1400,7 +1400,7 @@
           <w:rPr>
             <w:noProof/>
           </w:rPr>
-          <w:instrText xml:space="preserve"> PAGEREF _Toc234344371 \h </w:instrText>
+          <w:instrText xml:space="preserve"> PAGEREF _Toc234347466 \h </w:instrText>
         </w:r>
         <w:r>
           <w:rPr>
@@ -1439,7 +1439,7 @@
           <w:sz w:val="24"/>
         </w:rPr>
       </w:pPr>
-      <w:hyperlink w:anchor="_Toc234344372" w:history="1">
+      <w:hyperlink w:anchor="_Toc234347467" w:history="1">
         <w:r>
           <w:rPr>
             <w:rStyle w:val="Hyperlink"/>
@@ -1463,7 +1463,7 @@
           <w:rPr>
             <w:noProof/>
           </w:rPr>
-          <w:instrText xml:space="preserve"> PAGEREF _Toc234344372 \h </w:instrText>
+          <w:instrText xml:space="preserve"> PAGEREF _Toc234347467 \h </w:instrText>
         </w:r>
         <w:r>
           <w:rPr>
@@ -1502,7 +1502,7 @@
           <w:sz w:val="24"/>
         </w:rPr>
       </w:pPr>
-      <w:hyperlink w:anchor="_Toc234344373" w:history="1">
+      <w:hyperlink w:anchor="_Toc234347468" w:history="1">
         <w:r>
           <w:rPr>
             <w:rStyle w:val="Hyperlink"/>
@@ -1526,7 +1526,7 @@
           <w:rPr>
             <w:noProof/>
           </w:rPr>
-          <w:instrText xml:space="preserve"> PAGEREF _Toc234344373 \h </w:instrText>
+          <w:instrText xml:space="preserve"> PAGEREF _Toc234347468 \h </w:instrText>
         </w:r>
         <w:r>
           <w:rPr>
@@ -1565,7 +1565,7 @@
           <w:sz w:val="24"/>
         </w:rPr>
       </w:pPr>
-      <w:hyperlink w:anchor="_Toc234344374" w:history="1">
+      <w:hyperlink w:anchor="_Toc234347469" w:history="1">
         <w:r>
           <w:rPr>
             <w:rStyle w:val="Hyperlink"/>
@@ -1589,7 +1589,7 @@
           <w:rPr>
             <w:noProof/>
           </w:rPr>
-          <w:instrText xml:space="preserve"> PAGEREF _Toc234344374 \h </w:instrText>
+          <w:instrText xml:space="preserve"> PAGEREF _Toc234347469 \h </w:instrText>
         </w:r>
         <w:r>
           <w:rPr>
@@ -1628,7 +1628,7 @@
           <w:sz w:val="24"/>
         </w:rPr>
       </w:pPr>
-      <w:hyperlink w:anchor="_Toc234344375" w:history="1">
+      <w:hyperlink w:anchor="_Toc234347470" w:history="1">
         <w:r>
           <w:rPr>
             <w:rStyle w:val="Hyperlink"/>
@@ -1652,7 +1652,7 @@
           <w:rPr>
             <w:noProof/>
           </w:rPr>
-          <w:instrText xml:space="preserve"> PAGEREF _Toc234344375 \h </w:instrText>
+          <w:instrText xml:space="preserve"> PAGEREF _Toc234347470 \h </w:instrText>
         </w:r>
         <w:r>
           <w:rPr>
@@ -1691,21 +1691,13 @@
           <w:sz w:val="24"/>
         </w:rPr>
       </w:pPr>
-      <w:hyperlink w:anchor="_Toc234344376" w:history="1">
+      <w:hyperlink w:anchor="_Toc234347471" w:history="1">
         <w:r>
           <w:rPr>
             <w:rStyle w:val="Hyperlink"/>
             <w:noProof/>
           </w:rPr>
-          <w:t xml:space="preserve">7.8 Model and </w:t>
-        </w:r>
-        <w:r>
-          <w:rPr>
-            <w:rStyle w:val="Hyperlink"/>
-            <w:noProof/>
-          </w:rPr>
-          <w:lastRenderedPageBreak/>
-          <w:t>Panel Classes</w:t>
+          <w:t>7.8 Model and Panel Classes</w:t>
         </w:r>
         <w:r>
           <w:rPr>
@@ -1723,7 +1715,7 @@
           <w:rPr>
             <w:noProof/>
           </w:rPr>
-          <w:instrText xml:space="preserve"> PAGEREF _Toc234344376 \h </w:instrText>
+          <w:instrText xml:space="preserve"> PAGEREF _Toc234347471 \h </w:instrText>
         </w:r>
         <w:r>
           <w:rPr>
@@ -1762,7 +1754,7 @@
           <w:sz w:val="24"/>
         </w:rPr>
       </w:pPr>
-      <w:hyperlink w:anchor="_Toc234344377" w:history="1">
+      <w:hyperlink w:anchor="_Toc234347472" w:history="1">
         <w:r>
           <w:rPr>
             <w:rStyle w:val="Hyperlink"/>
@@ -1786,7 +1778,7 @@
           <w:rPr>
             <w:noProof/>
           </w:rPr>
-          <w:instrText xml:space="preserve"> PAGEREF _Toc234344377 \h </w:instrText>
+          <w:instrText xml:space="preserve"> PAGEREF _Toc234347472 \h </w:instrText>
         </w:r>
         <w:r>
           <w:rPr>
@@ -1825,7 +1817,7 @@
           <w:sz w:val="24"/>
         </w:rPr>
       </w:pPr>
-      <w:hyperlink w:anchor="_Toc234344378" w:history="1">
+      <w:hyperlink w:anchor="_Toc234347473" w:history="1">
         <w:r>
           <w:rPr>
             <w:rStyle w:val="Hyperlink"/>
@@ -1849,7 +1841,7 @@
           <w:rPr>
             <w:noProof/>
           </w:rPr>
-          <w:instrText xml:space="preserve"> PAGEREF _Toc234344378 \h </w:instrText>
+          <w:instrText xml:space="preserve"> PAGEREF _Toc234347473 \h </w:instrText>
         </w:r>
         <w:r>
           <w:rPr>
@@ -1888,7 +1880,7 @@
           <w:sz w:val="24"/>
         </w:rPr>
       </w:pPr>
-      <w:hyperlink w:anchor="_Toc234344379" w:history="1">
+      <w:hyperlink w:anchor="_Toc234347474" w:history="1">
         <w:r>
           <w:rPr>
             <w:rStyle w:val="Hyperlink"/>
@@ -1912,7 +1904,7 @@
           <w:rPr>
             <w:noProof/>
           </w:rPr>
-          <w:instrText xml:space="preserve"> PAGEREF _Toc234344379 \h </w:instrText>
+          <w:instrText xml:space="preserve"> PAGEREF _Toc234347474 \h </w:instrText>
         </w:r>
         <w:r>
           <w:rPr>
@@ -1951,7 +1943,7 @@
           <w:sz w:val="24"/>
         </w:rPr>
       </w:pPr>
-      <w:hyperlink w:anchor="_Toc234344380" w:history="1">
+      <w:hyperlink w:anchor="_Toc234347475" w:history="1">
         <w:r>
           <w:rPr>
             <w:rStyle w:val="Hyperlink"/>
@@ -1975,7 +1967,7 @@
           <w:rPr>
             <w:noProof/>
           </w:rPr>
-          <w:instrText xml:space="preserve"> PAGEREF _Toc234344380 \h </w:instrText>
+          <w:instrText xml:space="preserve"> PAGEREF _Toc234347475 \h </w:instrText>
         </w:r>
         <w:r>
           <w:rPr>
@@ -2014,7 +2006,7 @@
           <w:sz w:val="24"/>
         </w:rPr>
       </w:pPr>
-      <w:hyperlink w:anchor="_Toc234344381" w:history="1">
+      <w:hyperlink w:anchor="_Toc234347476" w:history="1">
         <w:r>
           <w:rPr>
             <w:rStyle w:val="Hyperlink"/>
@@ -2038,7 +2030,7 @@
           <w:rPr>
             <w:noProof/>
           </w:rPr>
-          <w:instrText xml:space="preserve"> PAGEREF _Toc234344381 \h </w:instrText>
+          <w:instrText xml:space="preserve"> PAGEREF _Toc234347476 \h </w:instrText>
         </w:r>
         <w:r>
           <w:rPr>
@@ -2077,7 +2069,7 @@
           <w:sz w:val="24"/>
         </w:rPr>
       </w:pPr>
-      <w:hyperlink w:anchor="_Toc234344382" w:history="1">
+      <w:hyperlink w:anchor="_Toc234347477" w:history="1">
         <w:r>
           <w:rPr>
             <w:rStyle w:val="Hyperlink"/>
@@ -2101,7 +2093,7 @@
           <w:rPr>
             <w:noProof/>
           </w:rPr>
-          <w:instrText xml:space="preserve"> PAGEREF _Toc234344382 \h </w:instrText>
+          <w:instrText xml:space="preserve"> PAGEREF _Toc234347477 \h </w:instrText>
         </w:r>
         <w:r>
           <w:rPr>
@@ -2140,7 +2132,7 @@
           <w:sz w:val="24"/>
         </w:rPr>
       </w:pPr>
-      <w:hyperlink w:anchor="_Toc234344383" w:history="1">
+      <w:hyperlink w:anchor="_Toc234347478" w:history="1">
         <w:r>
           <w:rPr>
             <w:rStyle w:val="Hyperlink"/>
@@ -2164,7 +2156,7 @@
           <w:rPr>
             <w:noProof/>
           </w:rPr>
-          <w:instrText xml:space="preserve"> PAGEREF _Toc234344383 \h </w:instrText>
+          <w:instrText xml:space="preserve"> PAGEREF _Toc234347478 \h </w:instrText>
         </w:r>
         <w:r>
           <w:rPr>
@@ -2203,7 +2195,7 @@
           <w:sz w:val="24"/>
         </w:rPr>
       </w:pPr>
-      <w:hyperlink w:anchor="_Toc234344384" w:history="1">
+      <w:hyperlink w:anchor="_Toc234347479" w:history="1">
         <w:r>
           <w:rPr>
             <w:rStyle w:val="Hyperlink"/>
@@ -2227,7 +2219,7 @@
           <w:rPr>
             <w:noProof/>
           </w:rPr>
-          <w:instrText xml:space="preserve"> PAGEREF _Toc234344384 \h </w:instrText>
+          <w:instrText xml:space="preserve"> PAGEREF _Toc234347479 \h </w:instrText>
         </w:r>
         <w:r>
           <w:rPr>
@@ -2266,7 +2258,7 @@
           <w:sz w:val="24"/>
         </w:rPr>
       </w:pPr>
-      <w:hyperlink w:anchor="_Toc234344385" w:history="1">
+      <w:hyperlink w:anchor="_Toc234347480" w:history="1">
         <w:r>
           <w:rPr>
             <w:rStyle w:val="Hyperlink"/>
@@ -2290,7 +2282,7 @@
           <w:rPr>
             <w:noProof/>
           </w:rPr>
-          <w:instrText xml:space="preserve"> PAGEREF _Toc234344385 \h </w:instrText>
+          <w:instrText xml:space="preserve"> PAGEREF _Toc234347480 \h </w:instrText>
         </w:r>
         <w:r>
           <w:rPr>
@@ -2329,7 +2321,7 @@
           <w:sz w:val="24"/>
         </w:rPr>
       </w:pPr>
-      <w:hyperlink w:anchor="_Toc234344386" w:history="1">
+      <w:hyperlink w:anchor="_Toc234347481" w:history="1">
         <w:r>
           <w:rPr>
             <w:rStyle w:val="Hyperlink"/>
@@ -2353,7 +2345,7 @@
           <w:rPr>
             <w:noProof/>
           </w:rPr>
-          <w:instrText xml:space="preserve"> PAGEREF _Toc234344386 \h </w:instrText>
+          <w:instrText xml:space="preserve"> PAGEREF _Toc234347481 \h </w:instrText>
         </w:r>
         <w:r>
           <w:rPr>
@@ -2392,7 +2384,7 @@
           <w:sz w:val="24"/>
         </w:rPr>
       </w:pPr>
-      <w:hyperlink w:anchor="_Toc234344387" w:history="1">
+      <w:hyperlink w:anchor="_Toc234347482" w:history="1">
         <w:r>
           <w:rPr>
             <w:rStyle w:val="Hyperlink"/>
@@ -2416,7 +2408,7 @@
           <w:rPr>
             <w:noProof/>
           </w:rPr>
-          <w:instrText xml:space="preserve"> PAGEREF _Toc234344387 \h </w:instrText>
+          <w:instrText xml:space="preserve"> PAGEREF _Toc234347482 \h </w:instrText>
         </w:r>
         <w:r>
           <w:rPr>
@@ -2455,7 +2447,7 @@
           <w:sz w:val="24"/>
         </w:rPr>
       </w:pPr>
-      <w:hyperlink w:anchor="_Toc234344388" w:history="1">
+      <w:hyperlink w:anchor="_Toc234347483" w:history="1">
         <w:r>
           <w:rPr>
             <w:rStyle w:val="Hyperlink"/>
@@ -2479,7 +2471,7 @@
           <w:rPr>
             <w:noProof/>
           </w:rPr>
-          <w:instrText xml:space="preserve"> PAGEREF _Toc234344388 \h </w:instrText>
+          <w:instrText xml:space="preserve"> PAGEREF _Toc234347483 \h </w:instrText>
         </w:r>
         <w:r>
           <w:rPr>
@@ -2518,7 +2510,7 @@
           <w:sz w:val="24"/>
         </w:rPr>
       </w:pPr>
-      <w:hyperlink w:anchor="_Toc234344389" w:history="1">
+      <w:hyperlink w:anchor="_Toc234347484" w:history="1">
         <w:r>
           <w:rPr>
             <w:rStyle w:val="Hyperlink"/>
@@ -2542,7 +2534,7 @@
           <w:rPr>
             <w:noProof/>
           </w:rPr>
-          <w:instrText xml:space="preserve"> PAGEREF _Toc234344389 \h </w:instrText>
+          <w:instrText xml:space="preserve"> PAGEREF _Toc234347484 \h </w:instrText>
         </w:r>
         <w:r>
           <w:rPr>
@@ -2559,7 +2551,7 @@
           <w:rPr>
             <w:noProof/>
           </w:rPr>
-          <w:t>31</w:t>
+          <w:t>43</w:t>
         </w:r>
         <w:r>
           <w:rPr>
@@ -2581,7 +2573,7 @@
           <w:sz w:val="24"/>
         </w:rPr>
       </w:pPr>
-      <w:hyperlink w:anchor="_Toc234344390" w:history="1">
+      <w:hyperlink w:anchor="_Toc234347485" w:history="1">
         <w:r>
           <w:rPr>
             <w:rStyle w:val="Hyperlink"/>
@@ -2605,7 +2597,7 @@
           <w:rPr>
             <w:noProof/>
           </w:rPr>
-          <w:instrText xml:space="preserve"> PAGEREF _Toc234344390 \h </w:instrText>
+          <w:instrText xml:space="preserve"> PAGEREF _Toc234347485 \h </w:instrText>
         </w:r>
         <w:r>
           <w:rPr>
@@ -2622,7 +2614,7 @@
           <w:rPr>
             <w:noProof/>
           </w:rPr>
-          <w:t>32</w:t>
+          <w:t>44</w:t>
         </w:r>
         <w:r>
           <w:rPr>
@@ -2644,7 +2636,7 @@
           <w:sz w:val="24"/>
         </w:rPr>
       </w:pPr>
-      <w:hyperlink w:anchor="_Toc234344391" w:history="1">
+      <w:hyperlink w:anchor="_Toc234347486" w:history="1">
         <w:r>
           <w:rPr>
             <w:rStyle w:val="Hyperlink"/>
@@ -2668,7 +2660,7 @@
           <w:rPr>
             <w:noProof/>
           </w:rPr>
-          <w:instrText xml:space="preserve"> PAGEREF _Toc234344391 \h </w:instrText>
+          <w:instrText xml:space="preserve"> PAGEREF _Toc234347486 \h </w:instrText>
         </w:r>
         <w:r>
           <w:rPr>
@@ -2685,7 +2677,7 @@
           <w:rPr>
             <w:noProof/>
           </w:rPr>
-          <w:t>33</w:t>
+          <w:t>45</w:t>
         </w:r>
         <w:r>
           <w:rPr>
@@ -2707,7 +2699,7 @@
           <w:sz w:val="24"/>
         </w:rPr>
       </w:pPr>
-      <w:hyperlink w:anchor="_Toc234344392" w:history="1">
+      <w:hyperlink w:anchor="_Toc234347487" w:history="1">
         <w:r>
           <w:rPr>
             <w:rStyle w:val="Hyperlink"/>
@@ -2731,7 +2723,7 @@
           <w:rPr>
             <w:noProof/>
           </w:rPr>
-          <w:instrText xml:space="preserve"> PAGEREF _Toc234344392 \h </w:instrText>
+          <w:instrText xml:space="preserve"> PAGEREF _Toc234347487 \h </w:instrText>
         </w:r>
         <w:r>
           <w:rPr>
@@ -2748,7 +2740,7 @@
           <w:rPr>
             <w:noProof/>
           </w:rPr>
-          <w:t>34</w:t>
+          <w:t>46</w:t>
         </w:r>
         <w:r>
           <w:rPr>
@@ -2770,7 +2762,7 @@
           <w:sz w:val="24"/>
         </w:rPr>
       </w:pPr>
-      <w:hyperlink w:anchor="_Toc234344393" w:history="1">
+      <w:hyperlink w:anchor="_Toc234347488" w:history="1">
         <w:r>
           <w:rPr>
             <w:rStyle w:val="Hyperlink"/>
@@ -2794,7 +2786,7 @@
           <w:rPr>
             <w:noProof/>
           </w:rPr>
-          <w:instrText xml:space="preserve"> PAGEREF _Toc234344393 \h </w:instrText>
+          <w:instrText xml:space="preserve"> PAGEREF _Toc234347488 \h </w:instrText>
         </w:r>
         <w:r>
           <w:rPr>
@@ -2811,7 +2803,7 @@
           <w:rPr>
             <w:noProof/>
           </w:rPr>
-          <w:t>35</w:t>
+          <w:t>47</w:t>
         </w:r>
         <w:r>
           <w:rPr>
@@ -2822,69 +2814,6 @@
       </w:hyperlink>
     </w:p>
     <w:p>
-      <w:pPr>
-        <w:pStyle w:val="TOC1"/>
-        <w:tabs>
-          <w:tab w:val="right" w:leader="dot" w:pos="8990"/>
-        </w:tabs>
-        <w:rPr>
-          <w:rFonts w:asciiTheme="minorHAnsi" w:eastAsiaTheme="minorEastAsia" w:hAnsiTheme="minorHAnsi" w:cstheme="minorBidi"/>
-          <w:noProof/>
-          <w:sz w:val="24"/>
-        </w:rPr>
-      </w:pPr>
-      <w:hyperlink w:anchor="_Toc234344394" w:history="1">
-        <w:r>
-          <w:rPr>
-            <w:rStyle w:val="Hyperlink"/>
-            <w:noProof/>
-          </w:rPr>
-          <w:t>APPENDIX: ADDITIONAL SCREENSHOTS</w:t>
-        </w:r>
-        <w:r>
-          <w:rPr>
-            <w:noProof/>
-          </w:rPr>
-          <w:tab/>
-        </w:r>
-        <w:r>
-          <w:rPr>
-            <w:noProof/>
-          </w:rPr>
-          <w:fldChar w:fldCharType="begin"/>
-        </w:r>
-        <w:r>
-          <w:rPr>
-            <w:noProof/>
-          </w:rPr>
-          <w:instrText xml:space="preserve"> PAGEREF _Toc234344394 \h </w:instrText>
-        </w:r>
-        <w:r>
-          <w:rPr>
-            <w:noProof/>
-          </w:rPr>
-        </w:r>
-        <w:r>
-          <w:rPr>
-            <w:noProof/>
-          </w:rPr>
-          <w:fldChar w:fldCharType="separate"/>
-        </w:r>
-        <w:r>
-          <w:rPr>
-            <w:noProof/>
-          </w:rPr>
-          <w:t>36</w:t>
-        </w:r>
-        <w:r>
-          <w:rPr>
-            <w:noProof/>
-          </w:rPr>
-          <w:fldChar w:fldCharType="end"/>
-        </w:r>
-      </w:hyperlink>
-    </w:p>
-    <w:p>
       <w:r>
         <w:fldChar w:fldCharType="end"/>
       </w:r>
@@ -2893,7 +2822,7 @@
       <w:pPr>
         <w:pStyle w:val="Heading1"/>
       </w:pPr>
-      <w:bookmarkStart w:id="0" w:name="_Toc234344353"/>
+      <w:bookmarkStart w:id="0" w:name="_Toc234347448"/>
       <w:r>
         <w:lastRenderedPageBreak/>
         <w:t>1. INTRODUCTION</w:t>
@@ -2928,7 +2857,7 @@
       <w:pPr>
         <w:pStyle w:val="Heading1"/>
       </w:pPr>
-      <w:bookmarkStart w:id="1" w:name="_Toc234344354"/>
+      <w:bookmarkStart w:id="1" w:name="_Toc234347449"/>
       <w:r>
         <w:lastRenderedPageBreak/>
         <w:t>2. PROBLEM STATEMENT</w:t>
@@ -3015,7 +2944,7 @@
       <w:pPr>
         <w:pStyle w:val="Heading1"/>
       </w:pPr>
-      <w:bookmarkStart w:id="2" w:name="_Toc234344355"/>
+      <w:bookmarkStart w:id="2" w:name="_Toc234347450"/>
       <w:r>
         <w:lastRenderedPageBreak/>
         <w:t>3. OBJECTIVES OF THE SYSTEM</w:t>
@@ -3118,7 +3047,7 @@
       <w:pPr>
         <w:pStyle w:val="Heading1"/>
       </w:pPr>
-      <w:bookmarkStart w:id="3" w:name="_Toc234344356"/>
+      <w:bookmarkStart w:id="3" w:name="_Toc234347451"/>
       <w:r>
         <w:lastRenderedPageBreak/>
         <w:t>4. SCOPE OF THE SYSTEM</w:t>
@@ -3129,7 +3058,7 @@
       <w:pPr>
         <w:pStyle w:val="Heading2"/>
       </w:pPr>
-      <w:bookmarkStart w:id="4" w:name="_Toc234344357"/>
+      <w:bookmarkStart w:id="4" w:name="_Toc234347452"/>
       <w:r>
         <w:t>4.1 In Scope</w:t>
       </w:r>
@@ -3271,7 +3200,7 @@
       <w:pPr>
         <w:pStyle w:val="Heading2"/>
       </w:pPr>
-      <w:bookmarkStart w:id="5" w:name="_Toc234344358"/>
+      <w:bookmarkStart w:id="5" w:name="_Toc234347453"/>
       <w:r>
         <w:t>4.2 Out of Scope</w:t>
       </w:r>
@@ -3341,7 +3270,7 @@
       <w:pPr>
         <w:pStyle w:val="Heading1"/>
       </w:pPr>
-      <w:bookmarkStart w:id="6" w:name="_Toc234344359"/>
+      <w:bookmarkStart w:id="6" w:name="_Toc234347454"/>
       <w:r>
         <w:lastRenderedPageBreak/>
         <w:t>5. METHODOLOGY</w:t>
@@ -3360,7 +3289,7 @@
       <w:pPr>
         <w:pStyle w:val="Heading2"/>
       </w:pPr>
-      <w:bookmarkStart w:id="7" w:name="_Toc234344360"/>
+      <w:bookmarkStart w:id="7" w:name="_Toc234347455"/>
       <w:r>
         <w:t>5.1 Development Environment and Tools</w:t>
       </w:r>
@@ -3418,7 +3347,7 @@
       <w:pPr>
         <w:pStyle w:val="Heading2"/>
       </w:pPr>
-      <w:bookmarkStart w:id="8" w:name="_Toc234344361"/>
+      <w:bookmarkStart w:id="8" w:name="_Toc234347456"/>
       <w:r>
         <w:t>5.2 Design Approach</w:t>
       </w:r>
@@ -3436,7 +3365,7 @@
       <w:pPr>
         <w:pStyle w:val="Heading2"/>
       </w:pPr>
-      <w:bookmarkStart w:id="9" w:name="_Toc234344362"/>
+      <w:bookmarkStart w:id="9" w:name="_Toc234347457"/>
       <w:r>
         <w:lastRenderedPageBreak/>
         <w:t>5.3 Verification Approach</w:t>
@@ -3455,7 +3384,7 @@
       <w:pPr>
         <w:pStyle w:val="Heading1"/>
       </w:pPr>
-      <w:bookmarkStart w:id="10" w:name="_Toc234344363"/>
+      <w:bookmarkStart w:id="10" w:name="_Toc234347458"/>
       <w:r>
         <w:lastRenderedPageBreak/>
         <w:t>6. SYSTEM DESIGN</w:t>
@@ -3922,7 +3851,7 @@
       <w:pPr>
         <w:pStyle w:val="Heading2"/>
       </w:pPr>
-      <w:bookmarkStart w:id="11" w:name="_Toc234344364"/>
+      <w:bookmarkStart w:id="11" w:name="_Toc234347459"/>
       <w:r>
         <w:t>6.1 Navigation Architecture</w:t>
       </w:r>
@@ -3940,7 +3869,7 @@
       <w:pPr>
         <w:pStyle w:val="Heading2"/>
       </w:pPr>
-      <w:bookmarkStart w:id="12" w:name="_Toc234344365"/>
+      <w:bookmarkStart w:id="12" w:name="_Toc234347460"/>
       <w:r>
         <w:t>6.2 Cross-Module Data Flow</w:t>
       </w:r>
@@ -3958,7 +3887,7 @@
       <w:pPr>
         <w:pStyle w:val="Heading2"/>
       </w:pPr>
-      <w:bookmarkStart w:id="13" w:name="_Toc234344366"/>
+      <w:bookmarkStart w:id="13" w:name="_Toc234347461"/>
       <w:r>
         <w:t>6.3 Persistence Model</w:t>
       </w:r>
@@ -3980,7 +3909,7 @@
       <w:pPr>
         <w:pStyle w:val="Heading2"/>
       </w:pPr>
-      <w:bookmarkStart w:id="14" w:name="_Toc234344367"/>
+      <w:bookmarkStart w:id="14" w:name="_Toc234347462"/>
       <w:r>
         <w:t>6.4 Authentication and Access Control</w:t>
       </w:r>
@@ -3998,7 +3927,7 @@
       <w:pPr>
         <w:pStyle w:val="Heading1"/>
       </w:pPr>
-      <w:bookmarkStart w:id="15" w:name="_Toc234344368"/>
+      <w:bookmarkStart w:id="15" w:name="_Toc234347463"/>
       <w:r>
         <w:lastRenderedPageBreak/>
         <w:t>7. DESCRIPTION OF CLASSES AND METHODS</w:t>
@@ -4009,7 +3938,7 @@
       <w:pPr>
         <w:pStyle w:val="Heading2"/>
       </w:pPr>
-      <w:bookmarkStart w:id="16" w:name="_Toc234344369"/>
+      <w:bookmarkStart w:id="16" w:name="_Toc234347464"/>
       <w:r>
         <w:t>7.1 base.Entity (abstract class)</w:t>
       </w:r>
@@ -4087,7 +4016,7 @@
       <w:pPr>
         <w:pStyle w:val="Heading2"/>
       </w:pPr>
-      <w:bookmarkStart w:id="17" w:name="_Toc234344370"/>
+      <w:bookmarkStart w:id="17" w:name="_Toc234347465"/>
       <w:r>
         <w:t>7.2 base.Manager&lt;T extends Entity&gt; (generic abstract class)</w:t>
       </w:r>
@@ -4177,7 +4106,7 @@
       <w:pPr>
         <w:pStyle w:val="Heading2"/>
       </w:pPr>
-      <w:bookmarkStart w:id="18" w:name="_Toc234344371"/>
+      <w:bookmarkStart w:id="18" w:name="_Toc234347466"/>
       <w:r>
         <w:lastRenderedPageBreak/>
         <w:t>7.3 base.Displayable (interface)</w:t>
@@ -4196,7 +4125,7 @@
       <w:pPr>
         <w:pStyle w:val="Heading2"/>
       </w:pPr>
-      <w:bookmarkStart w:id="19" w:name="_Toc234344372"/>
+      <w:bookmarkStart w:id="19" w:name="_Toc234347467"/>
       <w:r>
         <w:t>7.4 ui.BasePanel (abstract class extending JPanel)</w:t>
       </w:r>
@@ -4274,7 +4203,7 @@
       <w:pPr>
         <w:pStyle w:val="Heading2"/>
       </w:pPr>
-      <w:bookmarkStart w:id="20" w:name="_Toc234344373"/>
+      <w:bookmarkStart w:id="20" w:name="_Toc234347468"/>
       <w:r>
         <w:t>7.5 ui.MainWindow (extends JFrame) and ui.FormDialog (extends JDialog)</w:t>
       </w:r>
@@ -4299,7 +4228,7 @@
       <w:pPr>
         <w:pStyle w:val="Heading2"/>
       </w:pPr>
-      <w:bookmarkStart w:id="21" w:name="_Toc234344374"/>
+      <w:bookmarkStart w:id="21" w:name="_Toc234347469"/>
       <w:r>
         <w:t>7.6 util.AppTheme, util.Validator, util.FileUtil</w:t>
       </w:r>
@@ -4345,7 +4274,7 @@
       <w:pPr>
         <w:pStyle w:val="Heading2"/>
       </w:pPr>
-      <w:bookmarkStart w:id="22" w:name="_Toc234344375"/>
+      <w:bookmarkStart w:id="22" w:name="_Toc234347470"/>
       <w:r>
         <w:t>7.7 Manager Classes (manager package)</w:t>
       </w:r>
@@ -4439,7 +4368,7 @@
       <w:pPr>
         <w:pStyle w:val="Heading2"/>
       </w:pPr>
-      <w:bookmarkStart w:id="23" w:name="_Toc234344376"/>
+      <w:bookmarkStart w:id="23" w:name="_Toc234347471"/>
       <w:r>
         <w:t>7.8 Model and Panel Classes</w:t>
       </w:r>
@@ -4457,7 +4386,7 @@
       <w:pPr>
         <w:pStyle w:val="Heading2"/>
       </w:pPr>
-      <w:bookmarkStart w:id="24" w:name="_Toc234344377"/>
+      <w:bookmarkStart w:id="24" w:name="_Toc234347472"/>
       <w:r>
         <w:t>7.9 model.User, manager.UserManager and util.PasswordUtil</w:t>
       </w:r>
@@ -4475,7 +4404,7 @@
       <w:pPr>
         <w:pStyle w:val="Heading2"/>
       </w:pPr>
-      <w:bookmarkStart w:id="25" w:name="_Toc234344378"/>
+      <w:bookmarkStart w:id="25" w:name="_Toc234347473"/>
       <w:r>
         <w:t>7.10 ui.LoginWindow and panel.UsersPanel</w:t>
       </w:r>
@@ -4497,7 +4426,7 @@
       <w:pPr>
         <w:pStyle w:val="Heading1"/>
       </w:pPr>
-      <w:bookmarkStart w:id="26" w:name="_Toc234344379"/>
+      <w:bookmarkStart w:id="26" w:name="_Toc234347474"/>
       <w:r>
         <w:lastRenderedPageBreak/>
         <w:t>8. GUI DESIGN EXPLANATION</w:t>
@@ -4589,7 +4518,7 @@
       <w:pPr>
         <w:pStyle w:val="Heading1"/>
       </w:pPr>
-      <w:bookmarkStart w:id="27" w:name="_Toc234344380"/>
+      <w:bookmarkStart w:id="27" w:name="_Toc234347475"/>
       <w:r>
         <w:lastRenderedPageBreak/>
         <w:t>9. OOP CONCEPTS IMPLEMENTED</w:t>
@@ -4600,7 +4529,7 @@
       <w:pPr>
         <w:pStyle w:val="Heading2"/>
       </w:pPr>
-      <w:bookmarkStart w:id="28" w:name="_Toc234344381"/>
+      <w:bookmarkStart w:id="28" w:name="_Toc234347476"/>
       <w:r>
         <w:t>9.1 Encapsulation</w:t>
       </w:r>
@@ -4621,7 +4550,7 @@
       <w:pPr>
         <w:pStyle w:val="Heading2"/>
       </w:pPr>
-      <w:bookmarkStart w:id="29" w:name="_Toc234344382"/>
+      <w:bookmarkStart w:id="29" w:name="_Toc234347477"/>
       <w:r>
         <w:t>9.2 Abstraction</w:t>
       </w:r>
@@ -4639,7 +4568,7 @@
       <w:pPr>
         <w:pStyle w:val="Heading2"/>
       </w:pPr>
-      <w:bookmarkStart w:id="30" w:name="_Toc234344383"/>
+      <w:bookmarkStart w:id="30" w:name="_Toc234347478"/>
       <w:r>
         <w:t>9.3 Inheritance</w:t>
       </w:r>
@@ -4660,7 +4589,7 @@
       <w:pPr>
         <w:pStyle w:val="Heading2"/>
       </w:pPr>
-      <w:bookmarkStart w:id="31" w:name="_Toc234344384"/>
+      <w:bookmarkStart w:id="31" w:name="_Toc234347479"/>
       <w:r>
         <w:t>9.4 Composition (contrasted with Inheritance)</w:t>
       </w:r>
@@ -4682,7 +4611,7 @@
       <w:pPr>
         <w:pStyle w:val="Heading2"/>
       </w:pPr>
-      <w:bookmarkStart w:id="32" w:name="_Toc234344385"/>
+      <w:bookmarkStart w:id="32" w:name="_Toc234347480"/>
       <w:r>
         <w:t>9.5 Polymorphism</w:t>
       </w:r>
@@ -4700,7 +4629,7 @@
       <w:pPr>
         <w:pStyle w:val="Heading2"/>
       </w:pPr>
-      <w:bookmarkStart w:id="33" w:name="_Toc234344386"/>
+      <w:bookmarkStart w:id="33" w:name="_Toc234347481"/>
       <w:r>
         <w:t>9.6 Generics</w:t>
       </w:r>
@@ -4718,7 +4647,7 @@
       <w:pPr>
         <w:pStyle w:val="Heading2"/>
       </w:pPr>
-      <w:bookmarkStart w:id="34" w:name="_Toc234344387"/>
+      <w:bookmarkStart w:id="34" w:name="_Toc234347482"/>
       <w:r>
         <w:t>9.7 Design Patterns Observed</w:t>
       </w:r>
@@ -4764,7 +4693,7 @@
       <w:pPr>
         <w:pStyle w:val="Heading1"/>
       </w:pPr>
-      <w:bookmarkStart w:id="35" w:name="_Toc234344388"/>
+      <w:bookmarkStart w:id="35" w:name="_Toc234347483"/>
       <w:r>
         <w:lastRenderedPageBreak/>
         <w:t>10. SCREENSHOTS AND OUTPUTS</w:t>
@@ -4793,7 +4722,7 @@
           <w:color w:val="808080"/>
         </w:rPr>
         <w:drawing>
-          <wp:inline distT="0" distB="0" distL="0" distR="0" wp14:anchorId="2E5D20A4" wp14:editId="1DFA1748">
+          <wp:inline distT="0" distB="0" distL="0" distR="0" wp14:anchorId="2E5D20A4" wp14:editId="7A49CBD3">
             <wp:extent cx="5334000" cy="2859024"/>
             <wp:effectExtent l="0" t="0" r="0" b="0"/>
             <wp:docPr id="714042723" name="Picture 1"/>
@@ -4870,7 +4799,7 @@
           <w:color w:val="808080"/>
         </w:rPr>
         <w:drawing>
-          <wp:inline distT="0" distB="0" distL="0" distR="0" wp14:anchorId="4CF482EC" wp14:editId="711DC421">
+          <wp:inline distT="0" distB="0" distL="0" distR="0" wp14:anchorId="4CF482EC" wp14:editId="7E1B599D">
             <wp:extent cx="5334000" cy="2857839"/>
             <wp:effectExtent l="0" t="0" r="0" b="0"/>
             <wp:docPr id="475526867" name="Picture 2"/>
@@ -4947,7 +4876,7 @@
           <w:color w:val="808080"/>
         </w:rPr>
         <w:drawing>
-          <wp:inline distT="0" distB="0" distL="0" distR="0" wp14:anchorId="49F4804B" wp14:editId="589F44C3">
+          <wp:inline distT="0" distB="0" distL="0" distR="0" wp14:anchorId="49F4804B" wp14:editId="08108DC4">
             <wp:extent cx="5334000" cy="2864951"/>
             <wp:effectExtent l="0" t="0" r="0" b="0"/>
             <wp:docPr id="1035878586" name="Picture 3"/>
@@ -5024,7 +4953,7 @@
           <w:color w:val="808080"/>
         </w:rPr>
         <w:drawing>
-          <wp:inline distT="0" distB="0" distL="0" distR="0" wp14:anchorId="01DB7F1B" wp14:editId="1E23A5E0">
+          <wp:inline distT="0" distB="0" distL="0" distR="0" wp14:anchorId="01DB7F1B" wp14:editId="329E903F">
             <wp:extent cx="5334000" cy="2848949"/>
             <wp:effectExtent l="0" t="0" r="0" b="8890"/>
             <wp:docPr id="1001767665" name="Picture 1"/>
@@ -5102,7 +5031,7 @@
         </w:rPr>
         <w:lastRenderedPageBreak/>
         <w:drawing>
-          <wp:inline distT="0" distB="0" distL="0" distR="0" wp14:anchorId="662AC6E3" wp14:editId="58610C59">
+          <wp:inline distT="0" distB="0" distL="0" distR="0" wp14:anchorId="662AC6E3" wp14:editId="17D71DCA">
             <wp:extent cx="5334000" cy="2851912"/>
             <wp:effectExtent l="0" t="0" r="0" b="5715"/>
             <wp:docPr id="1466899551" name="Picture 2"/>
@@ -5179,7 +5108,7 @@
           <w:color w:val="808080"/>
         </w:rPr>
         <w:drawing>
-          <wp:inline distT="0" distB="0" distL="0" distR="0" wp14:anchorId="2A5D32E5" wp14:editId="017DF65D">
+          <wp:inline distT="0" distB="0" distL="0" distR="0" wp14:anchorId="2A5D32E5" wp14:editId="6D1348A7">
             <wp:extent cx="5334000" cy="2867914"/>
             <wp:effectExtent l="0" t="0" r="0" b="8890"/>
             <wp:docPr id="1482432158" name="Picture 3"/>
@@ -5257,7 +5186,7 @@
         </w:rPr>
         <w:lastRenderedPageBreak/>
         <w:drawing>
-          <wp:inline distT="0" distB="0" distL="0" distR="0" wp14:anchorId="7B4227F2" wp14:editId="2CDEFC33">
+          <wp:inline distT="0" distB="0" distL="0" distR="0" wp14:anchorId="7B4227F2" wp14:editId="5E047BEE">
             <wp:extent cx="5334000" cy="2850727"/>
             <wp:effectExtent l="0" t="0" r="0" b="6985"/>
             <wp:docPr id="675627804" name="Picture 4"/>
@@ -5334,7 +5263,7 @@
           <w:color w:val="808080"/>
         </w:rPr>
         <w:drawing>
-          <wp:inline distT="0" distB="0" distL="0" distR="0" wp14:anchorId="581A2707" wp14:editId="48BD9A8D">
+          <wp:inline distT="0" distB="0" distL="0" distR="0" wp14:anchorId="581A2707" wp14:editId="67AFCAD0">
             <wp:extent cx="5334000" cy="2851319"/>
             <wp:effectExtent l="0" t="0" r="0" b="6350"/>
             <wp:docPr id="1229476174" name="Picture 5"/>
@@ -5412,7 +5341,7 @@
         </w:rPr>
         <w:lastRenderedPageBreak/>
         <w:drawing>
-          <wp:inline distT="0" distB="0" distL="0" distR="0" wp14:anchorId="3320E619" wp14:editId="6A6F3E80">
+          <wp:inline distT="0" distB="0" distL="0" distR="0" wp14:anchorId="3320E619" wp14:editId="239008D6">
             <wp:extent cx="5334000" cy="2856653"/>
             <wp:effectExtent l="0" t="0" r="0" b="1270"/>
             <wp:docPr id="270369643" name="Picture 6"/>
@@ -5489,7 +5418,7 @@
           <w:color w:val="808080"/>
         </w:rPr>
         <w:drawing>
-          <wp:inline distT="0" distB="0" distL="0" distR="0" wp14:anchorId="17182EA3" wp14:editId="0A2938A8">
+          <wp:inline distT="0" distB="0" distL="0" distR="0" wp14:anchorId="17182EA3" wp14:editId="46ED9593">
             <wp:extent cx="5334000" cy="2848949"/>
             <wp:effectExtent l="0" t="0" r="0" b="8890"/>
             <wp:docPr id="1640305537" name="Picture 7"/>
@@ -5567,7 +5496,7 @@
         </w:rPr>
         <w:lastRenderedPageBreak/>
         <w:drawing>
-          <wp:inline distT="0" distB="0" distL="0" distR="0" wp14:anchorId="1CFE849D" wp14:editId="6B9D3C8F">
+          <wp:inline distT="0" distB="0" distL="0" distR="0" wp14:anchorId="1CFE849D" wp14:editId="03A75ED4">
             <wp:extent cx="5334000" cy="2843615"/>
             <wp:effectExtent l="0" t="0" r="0" b="0"/>
             <wp:docPr id="1015366820" name="Picture 8"/>
@@ -5644,7 +5573,7 @@
           <w:color w:val="808080"/>
         </w:rPr>
         <w:drawing>
-          <wp:inline distT="0" distB="0" distL="0" distR="0" wp14:anchorId="73CC8328" wp14:editId="3895F322">
+          <wp:inline distT="0" distB="0" distL="0" distR="0" wp14:anchorId="73CC8328" wp14:editId="368767D6">
             <wp:extent cx="5334000" cy="2846578"/>
             <wp:effectExtent l="0" t="0" r="0" b="0"/>
             <wp:docPr id="79470811" name="Picture 9"/>
@@ -5722,7 +5651,7 @@
         </w:rPr>
         <w:lastRenderedPageBreak/>
         <w:drawing>
-          <wp:inline distT="0" distB="0" distL="0" distR="0" wp14:anchorId="7B1ABBE9" wp14:editId="5230E389">
+          <wp:inline distT="0" distB="0" distL="0" distR="0" wp14:anchorId="7B1ABBE9" wp14:editId="27DF247C">
             <wp:extent cx="5334000" cy="2862580"/>
             <wp:effectExtent l="0" t="0" r="0" b="0"/>
             <wp:docPr id="282877113" name="Picture 10"/>
@@ -5799,7 +5728,7 @@
           <w:color w:val="808080"/>
         </w:rPr>
         <w:drawing>
-          <wp:inline distT="0" distB="0" distL="0" distR="0" wp14:anchorId="034E2001" wp14:editId="3628B191">
+          <wp:inline distT="0" distB="0" distL="0" distR="0" wp14:anchorId="034E2001" wp14:editId="485CB6D7">
             <wp:extent cx="5334000" cy="2851912"/>
             <wp:effectExtent l="0" t="0" r="0" b="5715"/>
             <wp:docPr id="426359504" name="Picture 4"/>
@@ -5877,7 +5806,7 @@
         </w:rPr>
         <w:lastRenderedPageBreak/>
         <w:drawing>
-          <wp:inline distT="0" distB="0" distL="0" distR="0" wp14:anchorId="62F32EFC" wp14:editId="11A305F8">
+          <wp:inline distT="0" distB="0" distL="0" distR="0" wp14:anchorId="62F32EFC" wp14:editId="010217EE">
             <wp:extent cx="5334000" cy="2864951"/>
             <wp:effectExtent l="0" t="0" r="0" b="0"/>
             <wp:docPr id="370561034" name="Picture 5"/>
@@ -5920,413 +5849,99 @@
       </w:r>
     </w:p>
     <w:p>
-      <w:pPr>
-        <w:rPr>
-          <w:color w:val="000000"/>
-        </w:rPr>
-      </w:pPr>
-      <w:r>
-        <w:rPr>
-          <w:i/>
-          <w:color w:val="808080"/>
-        </w:rPr>
-        <w:t>Figure 15: Register New Doctor dialog (FormDialog reused across modules)</w:t>
-      </w:r>
-    </w:p>
-    <w:p>
-      <w:pPr>
-        <w:rPr>
-          <w:color w:val="000000"/>
-        </w:rPr>
-      </w:pPr>
-    </w:p>
-    <w:p>
-      <w:pPr>
-        <w:pStyle w:val="Heading1"/>
-      </w:pPr>
-      <w:bookmarkStart w:id="36" w:name="_Toc234344389"/>
+      <w:r>
+        <w:t>Figure 15: Doctors - doctor detail view</w:t>
+      </w:r>
+    </w:p>
+    <w:p>
+      <w:r>
+        <w:t>Figure 16: Queue Management - patient detail view</w:t>
+      </w:r>
+    </w:p>
+    <w:p>
+      <w:r>
+        <w:t>Figure 17: Queue Management - triage entry</w:t>
+      </w:r>
+    </w:p>
+    <w:p>
+      <w:r>
+        <w:t>Figure 18: Medical Records - record detail view</w:t>
+      </w:r>
+    </w:p>
+    <w:p>
+      <w:r>
+        <w:t>Figure 19: Medical Records - edit record</w:t>
+      </w:r>
+    </w:p>
+    <w:p>
+      <w:r>
+        <w:t>Figure 20: Medical Records - select patient for history</w:t>
+      </w:r>
+    </w:p>
+    <w:p>
+      <w:r>
+        <w:t>Figure 21: Medical Records - patient history (records and lab results)</w:t>
+      </w:r>
+    </w:p>
+    <w:p>
+      <w:r>
+        <w:t>Figure 22: Pharmacy - low stock alert report</w:t>
+      </w:r>
+    </w:p>
+    <w:p>
+      <w:r>
+        <w:t>Figure 23: Pharmacy - sales revenue report</w:t>
+      </w:r>
+    </w:p>
+    <w:p>
+      <w:r>
+        <w:t>Figure 24: Appointments - booking list</w:t>
+      </w:r>
+    </w:p>
+    <w:p>
+      <w:r>
+        <w:t>Figure 25: Appointments - list view</w:t>
+      </w:r>
+    </w:p>
+    <w:p>
+      <w:r>
+        <w:t>Figure 26: Blood Donation - blood bank stock report</w:t>
+      </w:r>
+    </w:p>
+    <w:p>
+      <w:r>
+        <w:t>Figure 27: Vaccination - vaccine catalogue</w:t>
+      </w:r>
+    </w:p>
+    <w:p>
+      <w:r>
+        <w:t>Figure 28: Ambulance Dispatch - vehicle registry</w:t>
+      </w:r>
+    </w:p>
+    <w:p>
+      <w:r>
+        <w:t>Figure 29: Laboratory - test results</w:t>
+      </w:r>
+    </w:p>
+    <w:p>
       <w:r>
         <w:lastRenderedPageBreak/>
-        <w:t>11. GITHUB REPOSITORY LINK</w:t>
-      </w:r>
-      <w:bookmarkEnd w:id="36"/>
-    </w:p>
-    <w:p>
-      <w:pPr>
-        <w:jc w:val="both"/>
-      </w:pPr>
-      <w:r>
-        <w:t xml:space="preserve">Repository: </w:t>
-      </w:r>
-      <w:r>
-        <w:t>https://github.com/bdodoo-ops/Hostital</w:t>
-      </w:r>
-    </w:p>
-    <w:p>
-      <w:pPr>
-        <w:jc w:val="both"/>
-      </w:pPr>
-      <w:r>
-        <w:t>The HospitalGUI source is organised under HospitalGUI/src, with parallel bin/ and out/ compiled-output directories and an IntelliJ IDEA project configuration (.idea/), reflecting standard incremental desktop-application development within an IDE.</w:t>
-      </w:r>
-    </w:p>
-    <w:p>
-      <w:pPr>
-        <w:pStyle w:val="Heading1"/>
-      </w:pPr>
-      <w:bookmarkStart w:id="37" w:name="_Toc234344390"/>
-      <w:r>
-        <w:lastRenderedPageBreak/>
-        <w:t>12. CHALLENGES ENCOUNTERED</w:t>
-      </w:r>
-      <w:bookmarkEnd w:id="37"/>
-    </w:p>
-    <w:p>
-      <w:pPr>
-        <w:pStyle w:val="ListParagraph"/>
-        <w:numPr>
-          <w:ilvl w:val="0"/>
-          <w:numId w:val="13"/>
-        </w:numPr>
-      </w:pPr>
-      <w:r>
-        <w:t>Designing a single generic Manager&lt;T&gt; flexible enough to serve more than twenty structurally different entity types (patients, medicines, bills, lab tests, vaccination records, and more) while still preserving compile-time type safety and a simple, predictable CRUD contract.</w:t>
-      </w:r>
-    </w:p>
-    <w:p>
-      <w:pPr>
-        <w:pStyle w:val="ListParagraph"/>
-        <w:numPr>
-          <w:ilvl w:val="0"/>
-          <w:numId w:val="13"/>
-        </w:numPr>
-      </w:pPr>
-      <w:r>
-        <w:t>Keeping one shared BasePanel abstraction usable across ten modules that are not all alike - some are purely tabular record-keepers (Pharmacy stock, Blood stock), some are workflow-driven (Queue's priority-based 'serve next'), and some coordinate several related entities at once (Billing's services/bills/payments/pending charges) - which required the abstract hook methods in BasePanel to stay general enough for all of them without leaking module-specific logic into the shared base class.</w:t>
-      </w:r>
-    </w:p>
-    <w:p>
-      <w:pPr>
-        <w:pStyle w:val="ListParagraph"/>
-        <w:numPr>
-          <w:ilvl w:val="0"/>
-          <w:numId w:val="13"/>
-        </w:numPr>
-      </w:pPr>
-      <w:r>
-        <w:t>Coordinating cross-module billing correctly: ensuring Pharmacy sales, Lab tests, Vaccinations and Queue services all raise pending charges consistently through BillingManager, and that floating-point rounding on partial payments reliably flips a Bill's status to 'Paid' rather than leaving it perpetually 'Partial' because of tiny floating-point residues.</w:t>
-      </w:r>
-    </w:p>
-    <w:p>
-      <w:pPr>
-        <w:pStyle w:val="ListParagraph"/>
-        <w:numPr>
-          <w:ilvl w:val="0"/>
-          <w:numId w:val="13"/>
-        </w:numPr>
-      </w:pPr>
-      <w:r>
-        <w:t>Choosing a persistence strategy without a database: flat, pipe-delimited text files are simple and dependency-free, but every add/update/remove rewrites the entire file for that entity type, and Manager.loadFromFile() must silently skip any malformed or corrupted line to avoid crashing the application on start-up.</w:t>
-      </w:r>
-    </w:p>
-    <w:p>
-      <w:pPr>
-        <w:pStyle w:val="ListParagraph"/>
-        <w:numPr>
-          <w:ilvl w:val="0"/>
-          <w:numId w:val="13"/>
-        </w:numPr>
-      </w:pPr>
-      <w:r>
-        <w:t>Building a single-window, multi-module desktop UI with plain Swing/AWT (no external UI framework) - including a custom alternating-row table renderer, a live search-as-you-type filter, a home dashboard whose clickable cards must keep the sidebar's active-button highlight synchronised, and a reusable dialog builder general enough to cover text, numeric, date, dropdown, multi-line and read-only fields.</w:t>
-      </w:r>
-    </w:p>
-    <w:p>
-      <w:pPr>
-        <w:pStyle w:val="ListParagraph"/>
-        <w:numPr>
-          <w:ilvl w:val="0"/>
-          <w:numId w:val="13"/>
-        </w:numPr>
-      </w:pPr>
-      <w:r>
-        <w:t>Retrofitting a login gate onto an application whose ten modules already existed: MainWindow's constructor had to change to require an authenticated User, its sidebar/content construction had to become role-aware (building the User Management entry only for administrators) without disturbing the existing CardLayout navigation, and a self-lockout scenario (an administrator deactivating or demoting the only active admin account) had to be explicitly guarded against in UserManager.</w:t>
-      </w:r>
-    </w:p>
-    <w:p>
-      <w:pPr>
-        <w:pStyle w:val="Heading1"/>
-      </w:pPr>
-      <w:bookmarkStart w:id="38" w:name="_Toc234344391"/>
-      <w:r>
-        <w:lastRenderedPageBreak/>
-        <w:t>13. CONCLUSION</w:t>
-      </w:r>
-      <w:bookmarkEnd w:id="38"/>
-    </w:p>
-    <w:p>
-      <w:pPr>
-        <w:jc w:val="both"/>
-      </w:pPr>
-      <w:r>
-        <w:t>HospitalGUI demonstrates that a small, carefully designed set of abstract base types - Entity, the generic Manager, BasePanel, and the Displayable interface - can be reused across ten structurally different hospital modules to produce a single, internally consistent desktop application. Beyond its practical purpose of digitising queueing, records, pharmacy, appointments, blood donation, vaccination, ambulance dispatch, laboratory, billing and maternal health for a small hospital or clinic, the project serves as a clear, working demonstration of encapsulation, abstraction, inheritance, composition, polymorphism and generics within a non-trivial Java Swing application.</w:t>
-      </w:r>
-      <w:r>
-        <w:t xml:space="preserve"> A subsequent iteration extended the same base-type reuse strategy to security concerns, adding a login gate, hashed credentials, and an admin-controlled account lifecycle (create, edit, deactivate, reset password, self-service password change) without introducing a database or network dependency.</w:t>
-      </w:r>
-    </w:p>
-    <w:p>
-      <w:pPr>
-        <w:pStyle w:val="Heading1"/>
-      </w:pPr>
-      <w:bookmarkStart w:id="39" w:name="_Toc234344392"/>
-      <w:r>
-        <w:lastRenderedPageBreak/>
-        <w:t>14. RECOMMENDATIONS</w:t>
-      </w:r>
-      <w:bookmarkEnd w:id="39"/>
-    </w:p>
-    <w:p>
-      <w:pPr>
-        <w:pStyle w:val="ListParagraph"/>
-        <w:numPr>
-          <w:ilvl w:val="0"/>
-          <w:numId w:val="14"/>
-        </w:numPr>
-      </w:pPr>
-      <w:r>
-        <w:t>Replace flat-file persistence with an embedded or networked database (for example SQLite or MySQL via JDBC) to gain referential integrity, safer partial updates, and support for concurrent access as the system scales beyond a single user.</w:t>
-      </w:r>
-    </w:p>
-    <w:p>
-      <w:pPr>
-        <w:pStyle w:val="ListParagraph"/>
-        <w:numPr>
-          <w:ilvl w:val="0"/>
-          <w:numId w:val="14"/>
-        </w:numPr>
-      </w:pPr>
-      <w:r>
-        <w:t>Extend the new authentication layer with a password complexity policy, session/idle timeout, and finer-grained per-module permissions (the current model is a binary Admin/Staff distinction, so a Pharmacy-only or Billing-only account is not yet possible).</w:t>
-      </w:r>
-    </w:p>
-    <w:p>
-      <w:pPr>
-        <w:pStyle w:val="ListParagraph"/>
-        <w:numPr>
-          <w:ilvl w:val="0"/>
-          <w:numId w:val="14"/>
-        </w:numPr>
-      </w:pPr>
-      <w:r>
-        <w:t>Add an automated unit test suite (for example JUnit) covering Manager&lt;T&gt;'s CRUD behaviour and each manager's business rules - billing rounding, stock checks, and queue priority ordering - to reduce reliance on manual, exploratory UI testing.</w:t>
-      </w:r>
-    </w:p>
-    <w:p>
-      <w:pPr>
-        <w:pStyle w:val="ListParagraph"/>
-        <w:numPr>
-          <w:ilvl w:val="0"/>
-          <w:numId w:val="14"/>
-        </w:numPr>
-      </w:pPr>
-      <w:r>
-        <w:t>Add reporting and export capability (CSV or PDF) for bills, stock levels and medical records, since data currently exists only inside local flat text files with no built-in export path.</w:t>
-      </w:r>
-    </w:p>
-    <w:p>
-      <w:pPr>
-        <w:pStyle w:val="ListParagraph"/>
-        <w:numPr>
-          <w:ilvl w:val="0"/>
-          <w:numId w:val="14"/>
-        </w:numPr>
-      </w:pPr>
-      <w:r>
-        <w:t>Consider replacing direct manager-to-manager calls (such as Pharmacy pushing pending charges straight into Billing) with an explicit event or observer mechanism, to reduce coupling as more modules are added.</w:t>
-      </w:r>
-    </w:p>
-    <w:p>
-      <w:pPr>
-        <w:pStyle w:val="ListParagraph"/>
-        <w:numPr>
-          <w:ilvl w:val="0"/>
-          <w:numId w:val="14"/>
-        </w:numPr>
-      </w:pPr>
-      <w:r>
-        <w:t>Add pagination or lazy loading within Manager&lt;T&gt; if record volumes grow substantially, since the entire file for an entity type is currently loaded into memory and rewritten on every save.</w:t>
-      </w:r>
-    </w:p>
-    <w:p>
-      <w:pPr>
-        <w:pStyle w:val="Heading1"/>
-      </w:pPr>
-      <w:bookmarkStart w:id="40" w:name="_Toc234344393"/>
-      <w:r>
-        <w:lastRenderedPageBreak/>
-        <w:t>15. REFERENCES</w:t>
-      </w:r>
-      <w:bookmarkEnd w:id="40"/>
-    </w:p>
-    <w:p>
-      <w:pPr>
-        <w:jc w:val="both"/>
-      </w:pPr>
-      <w:r>
-        <w:t>Oracle Corporation (2026). The Java Tutorials - Creating a GUI with JFC/Swing. https://docs.oracle.com/javase/tutorial/uiswing/</w:t>
-      </w:r>
-    </w:p>
-    <w:p>
-      <w:pPr>
-        <w:jc w:val="both"/>
-      </w:pPr>
-      <w:r>
-        <w:t>Oracle Corporation (2026). Java Platform, Standard Edition Documentation - Generics and the Collections Framework. https://docs.oracle.com/en/java/javase/</w:t>
-      </w:r>
-    </w:p>
-    <w:p>
-      <w:pPr>
-        <w:jc w:val="both"/>
-      </w:pPr>
-      <w:r>
-        <w:t>Gamma, E., Helm, R., Johnson, R., and Vlissides, J. (1994). Design Patterns: Elements of Reusable Object-Oriented Software. Addison-Wesley. (Template Method and Singleton patterns.)</w:t>
-      </w:r>
-    </w:p>
-    <w:p>
-      <w:pPr>
-        <w:jc w:val="both"/>
-      </w:pPr>
-      <w:r>
-        <w:t>Horstmann, C. (2019). Core Java, Volume I - Fundamentals (11th ed.). Prentice Hall.</w:t>
-      </w:r>
-    </w:p>
-    <w:p>
-      <w:pPr>
-        <w:jc w:val="both"/>
-      </w:pPr>
-      <w:r>
-        <w:t>Oracle Corporation (2026). javax.swing.table and javax.swing.JTable API Documentation. https://docs.oracle.com/javase/</w:t>
-      </w:r>
-    </w:p>
-    <w:p>
-      <w:pPr>
-        <w:jc w:val="both"/>
-      </w:pPr>
-      <w:r>
-        <w:t>National Institute of Standards and Technology (2015). FIPS PUB 180-4: Secure Hash Standard (SHS). U.S. Department of Commerce.</w:t>
-      </w:r>
-    </w:p>
-    <w:p>
-      <w:pPr>
-        <w:pStyle w:val="Heading1"/>
-      </w:pPr>
-      <w:bookmarkStart w:id="41" w:name="_Toc234344394"/>
-      <w:r>
-        <w:lastRenderedPageBreak/>
-        <w:t>APPENDIX: ADDITIONAL SCREENSHOTS</w:t>
-      </w:r>
-      <w:bookmarkEnd w:id="41"/>
-    </w:p>
-    <w:p>
-      <w:r>
-        <w:t>The figures below are the remaining captures from the screenshots folder, supplementing the figures referenced in Section 10.</w:t>
-      </w:r>
-    </w:p>
-    <w:p/>
-    <w:p>
-      <w:r>
-        <w:t>Figure A1: Doctors - doctor detail view</w:t>
-      </w:r>
-    </w:p>
-    <w:p>
-      <w:r>
-        <w:t>Figure A2: Queue Management - patient detail view</w:t>
-      </w:r>
-    </w:p>
-    <w:p>
-      <w:r>
-        <w:t>Figure A3: Queue Management - triage entry</w:t>
-      </w:r>
-    </w:p>
-    <w:p>
-      <w:r>
-        <w:t>Figure A4: Medical Records - record detail view</w:t>
-      </w:r>
-    </w:p>
-    <w:p>
-      <w:r>
-        <w:t>Figure A5: Medical Records - edit record</w:t>
-      </w:r>
-    </w:p>
-    <w:p>
-      <w:r>
-        <w:t>Figure A6: Medical Records - select patient for history</w:t>
-      </w:r>
-    </w:p>
-    <w:p>
-      <w:r>
-        <w:t>Figure A7: Medical Records - patient history (records and lab results)</w:t>
-      </w:r>
-    </w:p>
-    <w:p>
-      <w:r>
-        <w:t>Figure A8: Pharmacy - low stock alert report</w:t>
-      </w:r>
-    </w:p>
-    <w:p>
-      <w:r>
-        <w:t>Figure A9: Pharmacy - sales revenue report</w:t>
-      </w:r>
-    </w:p>
-    <w:p>
-      <w:r>
-        <w:t>Figure A10: Appointments - booking list</w:t>
-      </w:r>
-    </w:p>
-    <w:p>
-      <w:r>
-        <w:t>Figure A11: Appointments - list view</w:t>
-      </w:r>
-    </w:p>
-    <w:p>
-      <w:r>
-        <w:t>Figure A12: Blood Donation - blood bank stock report</w:t>
-      </w:r>
-    </w:p>
-    <w:p>
-      <w:r>
-        <w:t>Figure A13: Vaccination - vaccine catalogue</w:t>
-      </w:r>
-    </w:p>
-    <w:p>
-      <w:r>
-        <w:t>Figure A14: Ambulance Dispatch - vehicle registry</w:t>
-      </w:r>
-    </w:p>
-    <w:p>
-      <w:r>
-        <w:t>Figure A15: Laboratory - test results</w:t>
-      </w:r>
-    </w:p>
-    <w:p>
-      <w:r>
-        <w:t>Figure A16: Laboratory - test catalogue</w:t>
-      </w:r>
-    </w:p>
-    <w:p>
-      <w:r>
-        <w:t>Figure A17: Laboratory - test constituents and reference ranges</w:t>
-      </w:r>
-    </w:p>
-    <w:p>
-      <w:r>
-        <w:t>Figure A18: Billing and Payment - bill list</w:t>
-      </w:r>
-    </w:p>
-    <w:p>
-      <w:r>
-        <w:t>Figure A19: Billing and Payment - revenue report</w:t>
+        <w:t>Figure 30: Laboratory - test catalogue</w:t>
+      </w:r>
+    </w:p>
+    <w:p>
+      <w:r>
+        <w:t>Figure 31: Laboratory - test constituents and reference ranges</w:t>
+      </w:r>
+    </w:p>
+    <w:p>
+      <w:r>
+        <w:t>Figure 32: Billing and Payment - bill list</w:t>
+      </w:r>
+    </w:p>
+    <w:p>
+      <w:r>
+        <w:t>Figure 33: Billing and Payment - revenue report</w:t>
       </w:r>
     </w:p>
     <w:p>
@@ -6334,9 +5949,8 @@
         <w:rPr>
           <w:noProof/>
         </w:rPr>
-        <w:lastRenderedPageBreak/>
         <w:drawing>
-          <wp:inline distT="0" distB="0" distL="0" distR="0" wp14:anchorId="20C21B47" wp14:editId="7B0533D9">
+          <wp:inline distT="0" distB="0" distL="0" distR="0" wp14:anchorId="39816DDF" wp14:editId="1DE8A4AC">
             <wp:extent cx="5334000" cy="2863173"/>
             <wp:effectExtent l="0" t="0" r="0" b="0"/>
             <wp:docPr id="1421574492" name="Picture 19"/>
@@ -6385,7 +5999,7 @@
           <w:noProof/>
         </w:rPr>
         <w:drawing>
-          <wp:inline distT="0" distB="0" distL="0" distR="0" wp14:anchorId="4CD90A38" wp14:editId="2C9C1603">
+          <wp:inline distT="0" distB="0" distL="0" distR="0" wp14:anchorId="6070C2C3" wp14:editId="386BE2CD">
             <wp:extent cx="5334000" cy="2857839"/>
             <wp:effectExtent l="0" t="0" r="0" b="0"/>
             <wp:docPr id="1726641900" name="Picture 18"/>
@@ -6435,7 +6049,7 @@
         </w:rPr>
         <w:lastRenderedPageBreak/>
         <w:drawing>
-          <wp:inline distT="0" distB="0" distL="0" distR="0" wp14:anchorId="3B7FA71C" wp14:editId="46184857">
+          <wp:inline distT="0" distB="0" distL="0" distR="0" wp14:anchorId="703965B9" wp14:editId="3F0B87F7">
             <wp:extent cx="5334000" cy="2869099"/>
             <wp:effectExtent l="0" t="0" r="0" b="7620"/>
             <wp:docPr id="815747" name="Picture 17"/>
@@ -6484,7 +6098,7 @@
           <w:noProof/>
         </w:rPr>
         <w:drawing>
-          <wp:inline distT="0" distB="0" distL="0" distR="0" wp14:anchorId="17D0CB7A" wp14:editId="05CA89E2">
+          <wp:inline distT="0" distB="0" distL="0" distR="0" wp14:anchorId="58B7B5A7" wp14:editId="1E6C6280">
             <wp:extent cx="5334000" cy="2864951"/>
             <wp:effectExtent l="0" t="0" r="0" b="0"/>
             <wp:docPr id="1213715378" name="Picture 16"/>
@@ -6534,7 +6148,7 @@
         </w:rPr>
         <w:lastRenderedPageBreak/>
         <w:drawing>
-          <wp:inline distT="0" distB="0" distL="0" distR="0" wp14:anchorId="27634D9D" wp14:editId="3AF5E121">
+          <wp:inline distT="0" distB="0" distL="0" distR="0" wp14:anchorId="6E174655" wp14:editId="73CD1A07">
             <wp:extent cx="5334000" cy="2861987"/>
             <wp:effectExtent l="0" t="0" r="0" b="0"/>
             <wp:docPr id="400585266" name="Picture 15"/>
@@ -6583,7 +6197,7 @@
           <w:noProof/>
         </w:rPr>
         <w:drawing>
-          <wp:inline distT="0" distB="0" distL="0" distR="0" wp14:anchorId="5C8141D3" wp14:editId="007F9EA5">
+          <wp:inline distT="0" distB="0" distL="0" distR="0" wp14:anchorId="1B3E1AE7" wp14:editId="617F82E3">
             <wp:extent cx="5334000" cy="2834132"/>
             <wp:effectExtent l="0" t="0" r="0" b="4445"/>
             <wp:docPr id="2984802" name="Picture 14"/>
@@ -6633,7 +6247,7 @@
         </w:rPr>
         <w:lastRenderedPageBreak/>
         <w:drawing>
-          <wp:inline distT="0" distB="0" distL="0" distR="0" wp14:anchorId="1EFA47C3" wp14:editId="35BF21C7">
+          <wp:inline distT="0" distB="0" distL="0" distR="0" wp14:anchorId="2682D1A1" wp14:editId="00D75FB6">
             <wp:extent cx="5334000" cy="2859024"/>
             <wp:effectExtent l="0" t="0" r="0" b="0"/>
             <wp:docPr id="186290466" name="Picture 13"/>
@@ -6682,7 +6296,7 @@
           <w:noProof/>
         </w:rPr>
         <w:drawing>
-          <wp:inline distT="0" distB="0" distL="0" distR="0" wp14:anchorId="4D8A47FE" wp14:editId="7640F9E1">
+          <wp:inline distT="0" distB="0" distL="0" distR="0" wp14:anchorId="326B4CED" wp14:editId="651F67A0">
             <wp:extent cx="5334000" cy="2850727"/>
             <wp:effectExtent l="0" t="0" r="0" b="6985"/>
             <wp:docPr id="1472171324" name="Picture 12"/>
@@ -6732,7 +6346,7 @@
         </w:rPr>
         <w:lastRenderedPageBreak/>
         <w:drawing>
-          <wp:inline distT="0" distB="0" distL="0" distR="0" wp14:anchorId="3B9F7E2E" wp14:editId="04A98431">
+          <wp:inline distT="0" distB="0" distL="0" distR="0" wp14:anchorId="274507E4" wp14:editId="30451410">
             <wp:extent cx="5334000" cy="2850727"/>
             <wp:effectExtent l="0" t="0" r="0" b="6985"/>
             <wp:docPr id="775680071" name="Picture 11"/>
@@ -6781,7 +6395,7 @@
           <w:noProof/>
         </w:rPr>
         <w:drawing>
-          <wp:inline distT="0" distB="0" distL="0" distR="0" wp14:anchorId="73CA01E4" wp14:editId="7A46AEB6">
+          <wp:inline distT="0" distB="0" distL="0" distR="0" wp14:anchorId="799DCB63" wp14:editId="7697953C">
             <wp:extent cx="5334000" cy="2873841"/>
             <wp:effectExtent l="0" t="0" r="0" b="3175"/>
             <wp:docPr id="1137513282" name="Picture 10"/>
@@ -6831,7 +6445,7 @@
         </w:rPr>
         <w:lastRenderedPageBreak/>
         <w:drawing>
-          <wp:inline distT="0" distB="0" distL="0" distR="0" wp14:anchorId="701D6845" wp14:editId="2D0D8226">
+          <wp:inline distT="0" distB="0" distL="0" distR="0" wp14:anchorId="03A6A7C1" wp14:editId="6DF8A324">
             <wp:extent cx="5334000" cy="2856061"/>
             <wp:effectExtent l="0" t="0" r="0" b="1905"/>
             <wp:docPr id="392809353" name="Picture 9"/>
@@ -6880,7 +6494,7 @@
           <w:noProof/>
         </w:rPr>
         <w:drawing>
-          <wp:inline distT="0" distB="0" distL="0" distR="0" wp14:anchorId="14C9B7A5" wp14:editId="4715DEB4">
+          <wp:inline distT="0" distB="0" distL="0" distR="0" wp14:anchorId="252609DE" wp14:editId="2F731BA7">
             <wp:extent cx="5334000" cy="2853690"/>
             <wp:effectExtent l="0" t="0" r="0" b="3810"/>
             <wp:docPr id="231558410" name="Picture 8"/>
@@ -6930,7 +6544,7 @@
         </w:rPr>
         <w:lastRenderedPageBreak/>
         <w:drawing>
-          <wp:inline distT="0" distB="0" distL="0" distR="0" wp14:anchorId="6F961963" wp14:editId="2C6C0558">
+          <wp:inline distT="0" distB="0" distL="0" distR="0" wp14:anchorId="482FF718" wp14:editId="6350D7C9">
             <wp:extent cx="5334000" cy="2866136"/>
             <wp:effectExtent l="0" t="0" r="0" b="0"/>
             <wp:docPr id="2037957742" name="Picture 7"/>
@@ -6979,7 +6593,7 @@
           <w:noProof/>
         </w:rPr>
         <w:drawing>
-          <wp:inline distT="0" distB="0" distL="0" distR="0" wp14:anchorId="14E91590" wp14:editId="756485C0">
+          <wp:inline distT="0" distB="0" distL="0" distR="0" wp14:anchorId="3FC6C73C" wp14:editId="7E8F8792">
             <wp:extent cx="5334000" cy="2866136"/>
             <wp:effectExtent l="0" t="0" r="0" b="0"/>
             <wp:docPr id="1797213203" name="Picture 6"/>
@@ -7029,7 +6643,7 @@
         </w:rPr>
         <w:lastRenderedPageBreak/>
         <w:drawing>
-          <wp:inline distT="0" distB="0" distL="0" distR="0" wp14:anchorId="0C064CE7" wp14:editId="4D55F353">
+          <wp:inline distT="0" distB="0" distL="0" distR="0" wp14:anchorId="7DB95059" wp14:editId="2B6937D4">
             <wp:extent cx="5334000" cy="2856061"/>
             <wp:effectExtent l="0" t="0" r="0" b="1905"/>
             <wp:docPr id="1158350721" name="Picture 5"/>
@@ -7078,7 +6692,7 @@
           <w:noProof/>
         </w:rPr>
         <w:drawing>
-          <wp:inline distT="0" distB="0" distL="0" distR="0" wp14:anchorId="4515E4C2" wp14:editId="3339D966">
+          <wp:inline distT="0" distB="0" distL="0" distR="0" wp14:anchorId="1270EE3F" wp14:editId="7CC84E1A">
             <wp:extent cx="5334000" cy="2856653"/>
             <wp:effectExtent l="0" t="0" r="0" b="1270"/>
             <wp:docPr id="1504313374" name="Picture 4"/>
@@ -7128,7 +6742,7 @@
         </w:rPr>
         <w:lastRenderedPageBreak/>
         <w:drawing>
-          <wp:inline distT="0" distB="0" distL="0" distR="0" wp14:anchorId="285AAC3D" wp14:editId="0D3B33AB">
+          <wp:inline distT="0" distB="0" distL="0" distR="0" wp14:anchorId="267763A0" wp14:editId="0F098F3A">
             <wp:extent cx="5334000" cy="2860209"/>
             <wp:effectExtent l="0" t="0" r="0" b="0"/>
             <wp:docPr id="244583896" name="Picture 3"/>
@@ -7177,7 +6791,7 @@
           <w:noProof/>
         </w:rPr>
         <w:drawing>
-          <wp:inline distT="0" distB="0" distL="0" distR="0" wp14:anchorId="35C84DAB" wp14:editId="6B96A4BF">
+          <wp:inline distT="0" distB="0" distL="0" distR="0" wp14:anchorId="205CBE13" wp14:editId="04C830EC">
             <wp:extent cx="5334000" cy="2868507"/>
             <wp:effectExtent l="0" t="0" r="0" b="8255"/>
             <wp:docPr id="1429167751" name="Picture 2"/>
@@ -7227,7 +6841,7 @@
         </w:rPr>
         <w:lastRenderedPageBreak/>
         <w:drawing>
-          <wp:inline distT="0" distB="0" distL="0" distR="0" wp14:anchorId="22191274" wp14:editId="05D8DCAE">
+          <wp:inline distT="0" distB="0" distL="0" distR="0" wp14:anchorId="623E7DCC" wp14:editId="17892E76">
             <wp:extent cx="5334000" cy="2864358"/>
             <wp:effectExtent l="0" t="0" r="0" b="0"/>
             <wp:docPr id="47709248" name="Picture 1"/>
@@ -7272,7 +6886,7 @@
     <w:p/>
     <w:p>
       <w:r>
-        <w:t>Figure A20: Login screen</w:t>
+        <w:t>Figure 34: Login screen</w:t>
       </w:r>
     </w:p>
     <w:p>
@@ -7281,7 +6895,7 @@
           <w:noProof/>
         </w:rPr>
         <w:drawing>
-          <wp:inline distT="0" distB="0" distL="0" distR="0" wp14:anchorId="4134EF0C" wp14:editId="4337BC24">
+          <wp:inline distT="0" distB="0" distL="0" distR="0" wp14:anchorId="74A81AA5" wp14:editId="70131C2E">
             <wp:extent cx="3556000" cy="3725334"/>
             <wp:effectExtent l="0" t="0" r="6350" b="8890"/>
             <wp:docPr id="1829947081" name="Picture 1"/>
@@ -7325,7 +6939,7 @@
     </w:p>
     <w:p>
       <w:r>
-        <w:t>Figure A21: Login screen</w:t>
+        <w:t>Figure 35: Login screen</w:t>
       </w:r>
     </w:p>
     <w:p>
@@ -7335,7 +6949,7 @@
         </w:rPr>
         <w:lastRenderedPageBreak/>
         <w:drawing>
-          <wp:inline distT="0" distB="0" distL="0" distR="0" wp14:anchorId="76A7A420" wp14:editId="46FFE0F2">
+          <wp:inline distT="0" distB="0" distL="0" distR="0" wp14:anchorId="282D14D0" wp14:editId="64842C07">
             <wp:extent cx="4826000" cy="5101116"/>
             <wp:effectExtent l="0" t="0" r="0" b="4445"/>
             <wp:docPr id="917371263" name="Picture 1"/>
@@ -7380,7 +6994,7 @@
     <w:p/>
     <w:p>
       <w:r>
-        <w:t>Figure A22: Home dashboard - logged-in header with Change Password / Logout and the User Management sidebar entry</w:t>
+        <w:t>Figure 36: Home dashboard - logged-in header with Change Password / Logout and the User Management sidebar entry</w:t>
       </w:r>
     </w:p>
     <w:p>
@@ -7390,7 +7004,7 @@
         </w:rPr>
         <w:lastRenderedPageBreak/>
         <w:drawing>
-          <wp:inline distT="0" distB="0" distL="0" distR="0" wp14:anchorId="7E0B940B" wp14:editId="2029FCED">
+          <wp:inline distT="0" distB="0" distL="0" distR="0" wp14:anchorId="3D99F8C9" wp14:editId="7455B838">
             <wp:extent cx="4826000" cy="2604968"/>
             <wp:effectExtent l="0" t="0" r="0" b="5080"/>
             <wp:docPr id="291215042" name="Picture 2"/>
@@ -7435,7 +7049,7 @@
     <w:p/>
     <w:p>
       <w:r>
-        <w:t>Figure A23: User Management - account list with Activate/Deactivate and Reset Password actions</w:t>
+        <w:t>Figure 37: User Management - account list with Activate/Deactivate and Reset Password actions</w:t>
       </w:r>
     </w:p>
     <w:p>
@@ -7444,7 +7058,7 @@
           <w:noProof/>
         </w:rPr>
         <w:drawing>
-          <wp:inline distT="0" distB="0" distL="0" distR="0" wp14:anchorId="7432B6EE" wp14:editId="2D5E9294">
+          <wp:inline distT="0" distB="0" distL="0" distR="0" wp14:anchorId="6D255320" wp14:editId="4BF2E424">
             <wp:extent cx="4826000" cy="2596924"/>
             <wp:effectExtent l="0" t="0" r="0" b="0"/>
             <wp:docPr id="279722001" name="Picture 3"/>
@@ -7488,6 +7102,311 @@
     </w:p>
     <w:p/>
     <w:p/>
+    <w:p>
+      <w:pPr>
+        <w:rPr>
+          <w:color w:val="000000"/>
+        </w:rPr>
+      </w:pPr>
+      <w:r>
+        <w:rPr>
+          <w:i/>
+          <w:color w:val="808080"/>
+        </w:rPr>
+        <w:t>Figure 38: Register New Doctor dialog</w:t>
+      </w:r>
+      <w:r>
+        <w:rPr>
+          <w:i/>
+          <w:color w:val="808080"/>
+        </w:rPr>
+        <w:t xml:space="preserve"> (FormDialog reused across modules)</w:t>
+      </w:r>
+    </w:p>
+    <w:p>
+      <w:pPr>
+        <w:rPr>
+          <w:color w:val="000000"/>
+        </w:rPr>
+      </w:pPr>
+    </w:p>
+    <w:p>
+      <w:pPr>
+        <w:pStyle w:val="Heading1"/>
+      </w:pPr>
+      <w:bookmarkStart w:id="36" w:name="_Toc234347484"/>
+      <w:r>
+        <w:lastRenderedPageBreak/>
+        <w:t>11. GITHUB REPOSITORY LINK</w:t>
+      </w:r>
+      <w:bookmarkEnd w:id="36"/>
+    </w:p>
+    <w:p>
+      <w:pPr>
+        <w:jc w:val="both"/>
+      </w:pPr>
+      <w:r>
+        <w:t xml:space="preserve">Repository: </w:t>
+      </w:r>
+      <w:r>
+        <w:t>https://github.com/bdodoo-ops/Hostital</w:t>
+      </w:r>
+    </w:p>
+    <w:p>
+      <w:pPr>
+        <w:jc w:val="both"/>
+      </w:pPr>
+      <w:r>
+        <w:t>The HospitalGUI source is organised under HospitalGUI/src, with parallel bin/ and out/ compiled-output directories and an IntelliJ IDEA project configuration (.idea/), reflecting standard incremental desktop-application development within an IDE.</w:t>
+      </w:r>
+    </w:p>
+    <w:p>
+      <w:pPr>
+        <w:pStyle w:val="Heading1"/>
+      </w:pPr>
+      <w:bookmarkStart w:id="37" w:name="_Toc234347485"/>
+      <w:r>
+        <w:lastRenderedPageBreak/>
+        <w:t>12. CHALLENGES ENCOUNTERED</w:t>
+      </w:r>
+      <w:bookmarkEnd w:id="37"/>
+    </w:p>
+    <w:p>
+      <w:pPr>
+        <w:pStyle w:val="ListParagraph"/>
+        <w:numPr>
+          <w:ilvl w:val="0"/>
+          <w:numId w:val="13"/>
+        </w:numPr>
+      </w:pPr>
+      <w:r>
+        <w:t>Designing a single generic Manager&lt;T&gt; flexible enough to serve more than twenty structurally different entity types (patients, medicines, bills, lab tests, vaccination records, and more) while still preserving compile-time type safety and a simple, predictable CRUD contract.</w:t>
+      </w:r>
+    </w:p>
+    <w:p>
+      <w:pPr>
+        <w:pStyle w:val="ListParagraph"/>
+        <w:numPr>
+          <w:ilvl w:val="0"/>
+          <w:numId w:val="13"/>
+        </w:numPr>
+      </w:pPr>
+      <w:r>
+        <w:t>Keeping one shared BasePanel abstraction usable across ten modules that are not all alike - some are purely tabular record-keepers (Pharmacy stock, Blood stock), some are workflow-driven (Queue's priority-based 'serve next'), and some coordinate several related entities at once (Billing's services/bills/payments/pending charges) - which required the abstract hook methods in BasePanel to stay general enough for all of them without leaking module-specific logic into the shared base class.</w:t>
+      </w:r>
+    </w:p>
+    <w:p>
+      <w:pPr>
+        <w:pStyle w:val="ListParagraph"/>
+        <w:numPr>
+          <w:ilvl w:val="0"/>
+          <w:numId w:val="13"/>
+        </w:numPr>
+      </w:pPr>
+      <w:r>
+        <w:t>Coordinating cross-module billing correctly: ensuring Pharmacy sales, Lab tests, Vaccinations and Queue services all raise pending charges consistently through BillingManager, and that floating-point rounding on partial payments reliably flips a Bill's status to 'Paid' rather than leaving it perpetually 'Partial' because of tiny floating-point residues.</w:t>
+      </w:r>
+    </w:p>
+    <w:p>
+      <w:pPr>
+        <w:pStyle w:val="ListParagraph"/>
+        <w:numPr>
+          <w:ilvl w:val="0"/>
+          <w:numId w:val="13"/>
+        </w:numPr>
+      </w:pPr>
+      <w:r>
+        <w:t>Choosing a persistence strategy without a database: flat, pipe-delimited text files are simple and dependency-free, but every add/update/remove rewrites the entire file for that entity type, and Manager.loadFromFile() must silently skip any malformed or corrupted line to avoid crashing the application on start-up.</w:t>
+      </w:r>
+    </w:p>
+    <w:p>
+      <w:pPr>
+        <w:pStyle w:val="ListParagraph"/>
+        <w:numPr>
+          <w:ilvl w:val="0"/>
+          <w:numId w:val="13"/>
+        </w:numPr>
+      </w:pPr>
+      <w:r>
+        <w:t>Building a single-window, multi-module desktop UI with plain Swing/AWT (no external UI framework) - including a custom alternating-row table renderer, a live search-as-you-type filter, a home dashboard whose clickable cards must keep the sidebar's active-button highlight synchronised, and a reusable dialog builder general enough to cover text, numeric, date, dropdown, multi-line and read-only fields.</w:t>
+      </w:r>
+    </w:p>
+    <w:p>
+      <w:pPr>
+        <w:pStyle w:val="ListParagraph"/>
+        <w:numPr>
+          <w:ilvl w:val="0"/>
+          <w:numId w:val="13"/>
+        </w:numPr>
+      </w:pPr>
+      <w:r>
+        <w:t>Retrofitting a login gate onto an application whose ten modules already existed: MainWindow's constructor had to change to require an authenticated User, its sidebar/content construction had to become role-aware (building the User Management entry only for administrators) without disturbing the existing CardLayout navigation, and a self-lockout scenario (an administrator deactivating or demoting the only active admin account) had to be explicitly guarded against in UserManager.</w:t>
+      </w:r>
+    </w:p>
+    <w:p>
+      <w:pPr>
+        <w:pStyle w:val="Heading1"/>
+      </w:pPr>
+      <w:bookmarkStart w:id="38" w:name="_Toc234347486"/>
+      <w:r>
+        <w:lastRenderedPageBreak/>
+        <w:t>13. CONCLUSION</w:t>
+      </w:r>
+      <w:bookmarkEnd w:id="38"/>
+    </w:p>
+    <w:p>
+      <w:pPr>
+        <w:jc w:val="both"/>
+      </w:pPr>
+      <w:r>
+        <w:t>HospitalGUI demonstrates that a small, carefully designed set of abstract base types - Entity, the generic Manager, BasePanel, and the Displayable interface - can be reused across ten structurally different hospital modules to produce a single, internally consistent desktop application. Beyond its practical purpose of digitising queueing, records, pharmacy, appointments, blood donation, vaccination, ambulance dispatch, laboratory, billing and maternal health for a small hospital or clinic, the project serves as a clear, working demonstration of encapsulation, abstraction, inheritance, composition, polymorphism and generics within a non-trivial Java Swing application.</w:t>
+      </w:r>
+      <w:r>
+        <w:t xml:space="preserve"> A subsequent iteration extended the same base-type reuse strategy to security concerns, adding a login gate, hashed credentials, and an admin-controlled account lifecycle (create, edit, deactivate, reset password, self-service password change) without introducing a database or network dependency.</w:t>
+      </w:r>
+    </w:p>
+    <w:p>
+      <w:pPr>
+        <w:pStyle w:val="Heading1"/>
+      </w:pPr>
+      <w:bookmarkStart w:id="39" w:name="_Toc234347487"/>
+      <w:r>
+        <w:lastRenderedPageBreak/>
+        <w:t>14. RECOMMENDATIONS</w:t>
+      </w:r>
+      <w:bookmarkEnd w:id="39"/>
+    </w:p>
+    <w:p>
+      <w:pPr>
+        <w:pStyle w:val="ListParagraph"/>
+        <w:numPr>
+          <w:ilvl w:val="0"/>
+          <w:numId w:val="14"/>
+        </w:numPr>
+      </w:pPr>
+      <w:r>
+        <w:t>Replace flat-file persistence with an embedded or networked database (for example SQLite or MySQL via JDBC) to gain referential integrity, safer partial updates, and support for concurrent access as the system scales beyond a single user.</w:t>
+      </w:r>
+    </w:p>
+    <w:p>
+      <w:pPr>
+        <w:pStyle w:val="ListParagraph"/>
+        <w:numPr>
+          <w:ilvl w:val="0"/>
+          <w:numId w:val="14"/>
+        </w:numPr>
+      </w:pPr>
+      <w:r>
+        <w:t>Extend the new authentication layer with a password complexity policy, session/idle timeout, and finer-grained per-module permissions (the current model is a binary Admin/Staff distinction, so a Pharmacy-only or Billing-only account is not yet possible).</w:t>
+      </w:r>
+    </w:p>
+    <w:p>
+      <w:pPr>
+        <w:pStyle w:val="ListParagraph"/>
+        <w:numPr>
+          <w:ilvl w:val="0"/>
+          <w:numId w:val="14"/>
+        </w:numPr>
+      </w:pPr>
+      <w:r>
+        <w:t>Add an automated unit test suite (for example JUnit) covering Manager&lt;T&gt;'s CRUD behaviour and each manager's business rules - billing rounding, stock checks, and queue priority ordering - to reduce reliance on manual, exploratory UI testing.</w:t>
+      </w:r>
+    </w:p>
+    <w:p>
+      <w:pPr>
+        <w:pStyle w:val="ListParagraph"/>
+        <w:numPr>
+          <w:ilvl w:val="0"/>
+          <w:numId w:val="14"/>
+        </w:numPr>
+      </w:pPr>
+      <w:r>
+        <w:t>Add reporting and export capability (CSV or PDF) for bills, stock levels and medical records, since data currently exists only inside local flat text files with no built-in export path.</w:t>
+      </w:r>
+    </w:p>
+    <w:p>
+      <w:pPr>
+        <w:pStyle w:val="ListParagraph"/>
+        <w:numPr>
+          <w:ilvl w:val="0"/>
+          <w:numId w:val="14"/>
+        </w:numPr>
+      </w:pPr>
+      <w:r>
+        <w:t>Consider replacing direct manager-to-manager calls (such as Pharmacy pushing pending charges straight into Billing) with an explicit event or observer mechanism, to reduce coupling as more modules are added.</w:t>
+      </w:r>
+    </w:p>
+    <w:p>
+      <w:pPr>
+        <w:pStyle w:val="ListParagraph"/>
+        <w:numPr>
+          <w:ilvl w:val="0"/>
+          <w:numId w:val="14"/>
+        </w:numPr>
+      </w:pPr>
+      <w:r>
+        <w:t>Add pagination or lazy loading within Manager&lt;T&gt; if record volumes grow substantially, since the entire file for an entity type is currently loaded into memory and rewritten on every save.</w:t>
+      </w:r>
+    </w:p>
+    <w:p>
+      <w:pPr>
+        <w:pStyle w:val="Heading1"/>
+      </w:pPr>
+      <w:bookmarkStart w:id="40" w:name="_Toc234347488"/>
+      <w:r>
+        <w:lastRenderedPageBreak/>
+        <w:t>15. REFERENCES</w:t>
+      </w:r>
+      <w:bookmarkEnd w:id="40"/>
+    </w:p>
+    <w:p>
+      <w:pPr>
+        <w:jc w:val="both"/>
+      </w:pPr>
+      <w:r>
+        <w:t>Oracle Corporation (2026). The Java Tutorials - Creating a GUI with JFC/Swing. https://docs.oracle.com/javase/tutorial/uiswing/</w:t>
+      </w:r>
+    </w:p>
+    <w:p>
+      <w:pPr>
+        <w:jc w:val="both"/>
+      </w:pPr>
+      <w:r>
+        <w:t>Oracle Corporation (2026). Java Platform, Standard Edition Documentation - Generics and the Collections Framework. https://docs.oracle.com/en/java/javase/</w:t>
+      </w:r>
+    </w:p>
+    <w:p>
+      <w:pPr>
+        <w:jc w:val="both"/>
+      </w:pPr>
+      <w:r>
+        <w:t>Gamma, E., Helm, R., Johnson, R., and Vlissides, J. (1994). Design Patterns: Elements of Reusable Object-Oriented Software. Addison-Wesley. (Template Method and Singleton patterns.)</w:t>
+      </w:r>
+    </w:p>
+    <w:p>
+      <w:pPr>
+        <w:jc w:val="both"/>
+      </w:pPr>
+      <w:r>
+        <w:t>Horstmann, C. (2019). Core Java, Volume I - Fundamentals (11th ed.). Prentice Hall.</w:t>
+      </w:r>
+    </w:p>
+    <w:p>
+      <w:pPr>
+        <w:jc w:val="both"/>
+      </w:pPr>
+      <w:r>
+        <w:t>Oracle Corporation (2026). javax.swing.table and javax.swing.JTable API Documentation. https://docs.oracle.com/javase/</w:t>
+      </w:r>
+    </w:p>
+    <w:p>
+      <w:pPr>
+        <w:jc w:val="both"/>
+      </w:pPr>
+      <w:r>
+        <w:t>National Institute of Standards and Technology (2015). FIPS PUB 180-4: Secure Hash Standard (SHS). U.S. Department of Commerce.</w:t>
+      </w:r>
+    </w:p>
     <w:sectPr>
       <w:pgSz w:w="12240" w:h="15840"/>
       <w:pgMar w:top="1440" w:right="1440" w:bottom="1440" w:left="1800" w:header="720" w:footer="720" w:gutter="0"/>

</xml_diff>